<commit_message>
Fig. 1: add the skew + relabeling (L3) row; wider margins
Row (d) shows the same conv5 window of 05.png under L3 (perms_2.json's
order of conv4, folded, then skewed: bank (class + s) mod 4); the script
checks the class map against perms_2.json and the per-bank counts and
cycles against predict_w4.window_cycles on the column-permuted window,
as for the other rows. The window is the one the stated rule picks (not
re-chosen): there L3 ties the skew (m = 42), so the caption also gives
conv5's mean fullest bank over all 16,384 windows under each layout,
47.6 / 42.1 / 40.4 / 39.7 (L0 / Frozen / L2 / L3). Shorter row titles
(the fourth collided with the bar title), slightly wider side margins.
The L3 paragraph cites Fig. 1d. Still 4 pages.

Co-Authored-By: Claude Opus 5.5 <noreply@anthropic.com>
Claude-Session: https://claude.ai/code/session_01KmQd2ww7ZkypMsRjhWuU5X
</commit_message>
<xml_diff>
--- a/bankperm/PAPER_EN.docx
+++ b/bankperm/PAPER_EN.docx
@@ -305,7 +305,7 @@
         <w:t>Skew + relabeling (L3).</w:t>
       </w:r>
       <w:r>
-        <w:t xml:space="preserve"> Under the skew, the channel in position p is in bank (s + p) mod 4 at 3×3 position s, so a relabeling still decides which channels share a bank at each s; L3 refits it under this rule and then skews.</w:t>
+        <w:t xml:space="preserve"> Under the skew, the channel in position p is in bank (s + p) mod 4 at 3×3 position s, so a relabeling still decides which channels share a bank at each s; L3 refits it under this rule and then skews (Fig. 1d).</w:t>
       </w:r>
     </w:p>
     <w:p>
@@ -344,7 +344,7 @@
       <w:r>
         <w:drawing>
           <wp:inline xmlns:a="http://schemas.openxmlformats.org/drawingml/2006/main" xmlns:pic="http://schemas.openxmlformats.org/drawingml/2006/picture">
-            <wp:extent cx="2880000" cy="2413220"/>
+            <wp:extent cx="2880000" cy="3026441"/>
             <wp:docPr id="1" name="Picture 1"/>
             <wp:cNvGraphicFramePr>
               <a:graphicFrameLocks noChangeAspect="1"/>
@@ -365,7 +365,7 @@
                   <pic:spPr>
                     <a:xfrm>
                       <a:off x="0" y="0"/>
-                      <a:ext cx="2880000" cy="2413220"/>
+                      <a:ext cx="2880000" cy="3026441"/>
                     </a:xfrm>
                     <a:prstGeom prst="rect"/>
                   </pic:spPr>
@@ -385,7 +385,7 @@
         </w:numPr>
       </w:pPr>
       <w:r>
-        <w:t>Fig. 1. A conv5 input window of the board network on Set12 05.png (the first compute-bound one at W = 4 with the median m, 48). Filled: nonzero, colored by bank (bank 1 dotted). (a) L0, bank p mod 4; (b) Frozen, an L1 (16 of 32 channels change bank); (c) L2, bank (p + s) mod 4. Bars: nonzeros per bank; the fullest, m, costs 2m cycles; dashed: m = 36.5, where 2m equals the load of 73 cycles.</w:t>
+        <w:t>Fig. 1. A conv5 input window of the board network on Set12 05.png (the first compute-bound one at W = 4 with the median m, 48). Filled: nonzero, colored by bank (bank 1 dotted). (a) L0, bank p mod 4; (b) Frozen, an L1 (16 of 32 channels change bank); (c) L2, bank (p + s) mod 4; (d) L3, bank (class + s) mod 4. Bars: nonzeros per bank; the fullest, m, costs 2m cycles; dashed: m = 36.5, where 2m equals the load of 73 cycles. Here L3 ties L2; over all of conv5's windows the mean m is 47.6, 42.1, 40.4 and 39.7.</w:t>
       </w:r>
     </w:p>
     <w:p>

</xml_diff>

<commit_message>
WIP: IWEICT paper cut for Word's four pages, L3 > L2 evidence strengthened (not reviewed)
- build_docx: figure paragraphs in single spacing (Word multiplies a picture's
  line by the Normal style's 1.15; about 80 pt over the three figures, the likely
  cause of Word's fifth page); the ceiling brackets Times New Roman lacks are
  Cambria Math runs in paragraphs of exactly 11 pt.
- PAPER_EN: L3 mechanism (each bank still sums whole classes under the skew),
  H6 with all nine intervals, 711/711 image pairs and 69/69 fitted layers, the
  calibration image against the test median, and the share of the imbalance the
  skew leaves that L3 removes (26%); cuts elsewhere; network short names in Sec. IV;
  DOIs dropped from the references. Abstract unchanged.

Co-Authored-By: Claude Opus 5.5 <noreply@anthropic.com>
Claude-Session: https://claude.ai/code/session_01KmQd2ww7ZkypMsRjhWuU5X
</commit_message>
<xml_diff>
--- a/bankperm/PAPER_EN.docx
+++ b/bankperm/PAPER_EN.docx
@@ -129,6 +129,7 @@
         <w:pStyle w:val="Abstract"/>
       </w:pPr>
       <w:r>
+        <w:rPr/>
         <w:t>Abstract—A zero-skipping convolution core whose input banks run in lockstep waits, in every window, for the bank with the most nonzero activations, so the assignment of window taps to banks sets its cycle count. On our integer CNN core for a Zynq XC7Z020, a condition on the layer shapes alone tells where no tap-to-bank layout can change the cycles. We compare three layouts that keep the bitstream and the integer output unchanged: a channel relabeling fitted offline and folded into the adjacent layers, a data-free skew that spreads each channel's taps over the banks, and the two combined. At four values per cycle, two relabelings of a 32-channel denoiser cut the core cycles measured on one image by 7.02% and 7.60%, as a model pushed before the export predicted to the cycle. In counts over 79 test images the skew saves 9.20% and the combination 9.93%, against 7.46% and 8.10% for the relabelings; under pre-registered protocols this order held on all nine networks whose channel count is a multiple of four, and no layout changed the count where the shape condition says it cannot.</w:t>
       </w:r>
     </w:p>
@@ -137,6 +138,7 @@
         <w:pStyle w:val="keywords"/>
       </w:pPr>
       <w:r>
+        <w:rPr/>
         <w:t>Keywords—zero skipping, activation sparsity, load balancing, bank layout, channel permutation, FPGA, CNN accelerator, cycle model</w:t>
       </w:r>
     </w:p>
@@ -145,6 +147,7 @@
         <w:pStyle w:val="1"/>
       </w:pPr>
       <w:r>
+        <w:rPr/>
         <w:t>Introduction</w:t>
       </w:r>
     </w:p>
@@ -153,7 +156,8 @@
         <w:pStyle w:val="a3"/>
       </w:pPr>
       <w:r>
-        <w:t>A core that skips zero activations saves multiplications, but lanes that advance together make each window cost as much as the busiest one, a stall Cnvlutin measures as its own category [1]. Known remedies for activation imbalance change the network or add hardware: S2TA bounds the nonzeros per block by discarding activations [2], and Sense rebalances channels at run time, noting that input maps "cannot be trained offline to balance IFM workload" [3]. Offline reorderings target weights: SparTen sorts filters by density and reorders the next layer's weights to match [4], and Pool and Yu fold into the preceding layer a channel permutation that lets N:M pruning keep more weight magnitude [5]. VARA permutes inputs offline from activation statistics to cluster co-zero inputs, reading them through an index unit [6], and skewed storage gives conflict-free parallel access to the rows and columns of a matrix [7]. Permutation, folding, profiling and skewing are thus not new; our search (Crossref, arXiv, web; October 2026) found no work that spreads co-active channels over lockstep zero-skipping banks by an exact, folded relabeling.</w:t>
+        <w:rPr/>
+        <w:t>A core that skips zero activations saves multiplications, but lanes that advance together make each window cost as much as the busiest one, a stall Cnvlutin measures as its own category [1]. Known remedies change the network or add hardware: S2TA bounds the nonzeros per block [2], and Sense rebalances channels at run time, noting that input maps "cannot be trained offline to balance IFM workload" [3]. Offline reorderings target weights: SparTen sorts filters by density [4], and Pool and Yu fold a channel permutation into the preceding layer for N:M pruning [5]; VARA permutes inputs offline to cluster co-zero inputs behind an index unit [6], and skewed storage gives conflict-free parallel access to a matrix's rows and columns [7]. Permutation, folding, profiling and skewing are thus not new; our search (Crossref, arXiv, web; October 2026) found no work that spreads co-active channels over lockstep zero-skipping banks by an exact, folded relabeling.</w:t>
       </w:r>
     </w:p>
     <w:p>
@@ -161,7 +165,8 @@
         <w:pStyle w:val="a3"/>
       </w:pPr>
       <w:r>
-        <w:t>In our core, four tap banks run in lockstep, and the slot in which the host puts a tap decides its bank. We contribute (i) a shape-only condition necessary for any layout to change a layer's cycles, and its window-port regimes (Section II); (ii) three layouts that keep the bitstream and the integer output unchanged, with checks: a folded channel relabeling, a data-free skew and both combined (Section III); (iii) board cycles of two relabelings, predicted to the cycle (V-A); (iv) two pre-registered ten-network studies with bootstrap intervals (V-B, V-C); (v) fit time and a host-time bound (V-D).</w:t>
+        <w:rPr/>
+        <w:t>In our core, four tap banks run in lockstep, and the slot in which the host puts a tap decides its bank. We contribute (i) a shape-only condition necessary for any layout to change a layer's cycles (Section II); (ii) three layouts that keep the bitstream and the integer output unchanged: a folded channel relabeling, a data-free skew and both combined (Section III); (iii) board cycles of two relabelings, predicted to the cycle (V-A); (iv) two pre-registered ten-network studies (V-B, V-C).</w:t>
       </w:r>
     </w:p>
     <w:p>
@@ -169,6 +174,7 @@
         <w:pStyle w:val="1"/>
       </w:pPr>
       <w:r>
+        <w:rPr/>
         <w:t>Core, Cost Model and Shape Condition</w:t>
       </w:r>
     </w:p>
@@ -183,6 +189,7 @@
         <w:t>Core.</w:t>
       </w:r>
       <w:r>
+        <w:rPr/>
         <w:t xml:space="preserve"> The host builds each layer's windows (im2col), sends them with the layer's weights and requantizes between layers; the core computes every convolution with INT8 weights, 7-bit unsigned activations and INT32 accumulation. Its 64 multipliers form P = 16 output lanes times T = 4 tap banks; its window port takes W values per cycle (W = 2 only in RTL simulation). In sparse mode, used throughout, each bank processes only its nonzero taps; slot j of a window belongs to bank j mod 4.</w:t>
       </w:r>
     </w:p>
@@ -197,30 +204,96 @@
         <w:t>Cost of a window.</w:t>
       </w:r>
       <w:r>
+        <w:rPr/>
         <w:t xml:space="preserve"> For a window with K taps and COUT outputs, and m the largest number of nonzero taps in one bank, the core spends C cycles:</w:t>
       </w:r>
     </w:p>
     <w:p>
       <w:pPr>
         <w:pStyle w:val="a3"/>
+        <w:spacing w:lineRule="exact" w:line="220"/>
         <w:ind w:firstLine="0"/>
         <w:jc w:val="center"/>
       </w:pPr>
       <w:r>
-        <w:t>C = max( ⌈K/W⌉ + 1, ⌈COUT/P⌉ · max(1, m), COUT ),   (1)</w:t>
+        <w:rPr/>
+        <w:t xml:space="preserve">C = max( </w:t>
+      </w:r>
+      <w:r>
+        <w:rPr>
+          <w:rFonts w:ascii="Cambria Math" w:hAnsi="Cambria Math"/>
+        </w:rPr>
+        <w:t>⌈</w:t>
+      </w:r>
+      <w:r>
+        <w:rPr/>
+        <w:t>K/W</w:t>
+      </w:r>
+      <w:r>
+        <w:rPr>
+          <w:rFonts w:ascii="Cambria Math" w:hAnsi="Cambria Math"/>
+        </w:rPr>
+        <w:t>⌉</w:t>
+      </w:r>
+      <w:r>
+        <w:rPr/>
+        <w:t xml:space="preserve"> + 1, </w:t>
+      </w:r>
+      <w:r>
+        <w:rPr>
+          <w:rFonts w:ascii="Cambria Math" w:hAnsi="Cambria Math"/>
+        </w:rPr>
+        <w:t>⌈</w:t>
+      </w:r>
+      <w:r>
+        <w:rPr/>
+        <w:t>COUT/P</w:t>
+      </w:r>
+      <w:r>
+        <w:rPr>
+          <w:rFonts w:ascii="Cambria Math" w:hAnsi="Cambria Math"/>
+        </w:rPr>
+        <w:t>⌉</w:t>
+      </w:r>
+      <w:r>
+        <w:rPr/>
+        <w:t xml:space="preserve"> · max(1, m), COUT ),   (1)</w:t>
       </w:r>
     </w:p>
     <w:p>
       <w:pPr>
         <w:pStyle w:val="a3"/>
-      </w:pPr>
-      <w:r>
-        <w:t>for loading the next window, computing ⌈COUT/P⌉ output groups and emitting COUT results. Each layer adds a fill and drain of min(load, compute of the last window) + 3 + g cycles, g being the outputs in the last group of P, a rule read off board runs of four networks on one image; the first layer has a measured constant (17 cycles for the board network at W = 4). We call (1) summed over the windows the count, and the count plus the fill and drain the exact prediction.</w:t>
+        <w:spacing w:lineRule="exact" w:line="220"/>
+      </w:pPr>
+      <w:r>
+        <w:rPr/>
+        <w:t xml:space="preserve">for loading the next window, computing </w:t>
+      </w:r>
+      <w:r>
+        <w:rPr>
+          <w:rFonts w:ascii="Cambria Math" w:hAnsi="Cambria Math"/>
+        </w:rPr>
+        <w:t>⌈</w:t>
+      </w:r>
+      <w:r>
+        <w:rPr/>
+        <w:t>COUT/P</w:t>
+      </w:r>
+      <w:r>
+        <w:rPr>
+          <w:rFonts w:ascii="Cambria Math" w:hAnsi="Cambria Math"/>
+        </w:rPr>
+        <w:t>⌉</w:t>
+      </w:r>
+      <w:r>
+        <w:rPr/>
+        <w:t xml:space="preserve"> output groups and emitting COUT results. Each layer adds a fill and drain of min(load, compute of the last window) + 3 + g cycles, g being the outputs in the last group of P, a rule read off board runs of four networks on one image; the first layer has a measured constant (17 cycles for the board network at W = 4). We call (1) summed over the windows the count, and the count plus the fill and drain the exact prediction.</w:t>
       </w:r>
     </w:p>
     <w:p>
       <w:pPr>
         <w:pStyle w:val="a3"/>
+        <w:spacing w:lineRule="exact" w:line="220"/>
       </w:pPr>
       <w:r>
         <w:rPr>
@@ -229,25 +302,126 @@
         <w:t>When a layout can pay.</w:t>
       </w:r>
       <w:r>
-        <w:t xml:space="preserve"> A bank holds at most ⌈K/T⌉ taps. No window is then compute-bound for any input, and no layout can change the count, if</w:t>
+        <w:rPr/>
+        <w:t xml:space="preserve"> A bank holds at most </w:t>
+      </w:r>
+      <w:r>
+        <w:rPr>
+          <w:rFonts w:ascii="Cambria Math" w:hAnsi="Cambria Math"/>
+        </w:rPr>
+        <w:t>⌈</w:t>
+      </w:r>
+      <w:r>
+        <w:rPr/>
+        <w:t>K/T</w:t>
+      </w:r>
+      <w:r>
+        <w:rPr>
+          <w:rFonts w:ascii="Cambria Math" w:hAnsi="Cambria Math"/>
+        </w:rPr>
+        <w:t>⌉</w:t>
+      </w:r>
+      <w:r>
+        <w:rPr/>
+        <w:t xml:space="preserve"> taps. No window is then compute-bound for any input, and no layout can change the count, if</w:t>
       </w:r>
     </w:p>
     <w:p>
       <w:pPr>
         <w:pStyle w:val="a3"/>
+        <w:spacing w:lineRule="exact" w:line="220"/>
         <w:ind w:firstLine="0"/>
         <w:jc w:val="center"/>
       </w:pPr>
       <w:r>
-        <w:t>⌈COUT/P⌉ · ⌈K/T⌉ ≤ max( ⌈K/W⌉ + 1, COUT ).   (2)</w:t>
+        <w:rPr>
+          <w:rFonts w:ascii="Cambria Math" w:hAnsi="Cambria Math"/>
+        </w:rPr>
+        <w:t>⌈</w:t>
+      </w:r>
+      <w:r>
+        <w:rPr/>
+        <w:t>COUT/P</w:t>
+      </w:r>
+      <w:r>
+        <w:rPr>
+          <w:rFonts w:ascii="Cambria Math" w:hAnsi="Cambria Math"/>
+        </w:rPr>
+        <w:t>⌉</w:t>
+      </w:r>
+      <w:r>
+        <w:rPr/>
+        <w:t xml:space="preserve"> · </w:t>
+      </w:r>
+      <w:r>
+        <w:rPr>
+          <w:rFonts w:ascii="Cambria Math" w:hAnsi="Cambria Math"/>
+        </w:rPr>
+        <w:t>⌈</w:t>
+      </w:r>
+      <w:r>
+        <w:rPr/>
+        <w:t>K/T</w:t>
+      </w:r>
+      <w:r>
+        <w:rPr>
+          <w:rFonts w:ascii="Cambria Math" w:hAnsi="Cambria Math"/>
+        </w:rPr>
+        <w:t>⌉</w:t>
+      </w:r>
+      <w:r>
+        <w:rPr/>
+        <w:t xml:space="preserve"> ≤ max( </w:t>
+      </w:r>
+      <w:r>
+        <w:rPr>
+          <w:rFonts w:ascii="Cambria Math" w:hAnsi="Cambria Math"/>
+        </w:rPr>
+        <w:t>⌈</w:t>
+      </w:r>
+      <w:r>
+        <w:rPr/>
+        <w:t>K/W</w:t>
+      </w:r>
+      <w:r>
+        <w:rPr>
+          <w:rFonts w:ascii="Cambria Math" w:hAnsi="Cambria Math"/>
+        </w:rPr>
+        <w:t>⌉</w:t>
+      </w:r>
+      <w:r>
+        <w:rPr/>
+        <w:t xml:space="preserve"> + 1, COUT ).   (2)</w:t>
       </w:r>
     </w:p>
     <w:p>
       <w:pPr>
         <w:pStyle w:val="a3"/>
-      </w:pPr>
-      <w:r>
-        <w:t>Failing (2) is thus necessary for a gain; without the rounding, (2) reads COUT ≤ P·T/W, the ridge point of a roofline [8] whose bandwidth roof is the load. So 32-output hidden layers (K = 288: 144 against 145 at W = 2 and 73 at W = 4) can pay only at W = 4, layers with 45 or 64 outputs also at W = 2, and none at W = 1 or in the last layer (COUT ≤ 4). As a reference, perfect balance, m = ⌈n/T⌉ for n nonzero taps, bounds every assignment of a window's taps to lockstep banks.</w:t>
+        <w:spacing w:lineRule="exact" w:line="220"/>
+      </w:pPr>
+      <w:r>
+        <w:rPr/>
+        <w:t xml:space="preserve">Failing (2) is thus necessary for a gain; without the rounding, (2) reads COUT ≤ P·T/W, the ridge point of a roofline [8] whose bandwidth roof is the load. So 32-output hidden layers (K = 288: 144 against 145 at W = 2 and 73 at W = 4) can pay only at W = 4, layers with 45 or 64 outputs also at W = 2, and none at W = 1 or in the last layer (COUT ≤ 4). Perfect balance, m = </w:t>
+      </w:r>
+      <w:r>
+        <w:rPr>
+          <w:rFonts w:ascii="Cambria Math" w:hAnsi="Cambria Math"/>
+        </w:rPr>
+        <w:t>⌈</w:t>
+      </w:r>
+      <w:r>
+        <w:rPr/>
+        <w:t>n/T</w:t>
+      </w:r>
+      <w:r>
+        <w:rPr>
+          <w:rFonts w:ascii="Cambria Math" w:hAnsi="Cambria Math"/>
+        </w:rPr>
+        <w:t>⌉</w:t>
+      </w:r>
+      <w:r>
+        <w:rPr/>
+        <w:t xml:space="preserve"> for n nonzero taps, bounds every tap-to-bank assignment.</w:t>
       </w:r>
     </w:p>
     <w:p>
@@ -255,6 +429,7 @@
         <w:pStyle w:val="1"/>
       </w:pPr>
       <w:r>
+        <w:rPr/>
         <w:t>Three Function-Preserving Layouts</w:t>
       </w:r>
     </w:p>
@@ -263,6 +438,7 @@
         <w:pStyle w:val="a3"/>
       </w:pPr>
       <w:r>
+        <w:rPr/>
         <w:t>In (ky, kx, channel) order, tap s·N + p (s the 3×3 position, p the channel, N the input channels) is in bank p mod 4 when 4 divides N: in this conventional order, L0 or the Original, each bank holds N/4 whole channels (Fig. 1a).</w:t>
       </w:r>
     </w:p>
@@ -277,7 +453,8 @@
         <w:t>Relabeling (L1).</w:t>
       </w:r>
       <w:r>
-        <w:t xml:space="preserve"> Let π map a position p of a hidden map to its original channel. The producer computes its output channels in the order π, with weight rows, biases and requantization scales reordered, and the consumer's weight column for tap s·N + p comes from channel π(p). As ReLU and requantization act per channel and the consumer adds the same INT32 products, the integer output is identical for every input, while π decides which channels share a bank (Fig. 1b). We permute the outputs of conv1 to conv(L−2) of an L-layer network; the last layer, which can never pay, keeps its input. In the maxout and averaging networks, which keep the maximum or mean of maps j and j + N of 2N computed maps, both maps move with π.</w:t>
+        <w:rPr/>
+        <w:t xml:space="preserve"> Let π map a position p of a hidden map to its original channel. The producer computes its output channels in the order π, with weight rows, biases and requantization scales reordered, and the consumer's weight column for tap s·N + p comes from channel π(p). As ReLU and requantization act per channel and the consumer adds the same INT32 products, the integer output is identical for every input, while π decides which channels share a bank (Fig. 1b). We permute the outputs of conv1 to conv(L−2) of an L-layer network; the last layer, which can never pay, keeps its input. In the maxout and averaging networks (maximum or mean of maps j and j + N), both maps move with π.</w:t>
       </w:r>
     </w:p>
     <w:p>
@@ -291,7 +468,8 @@
         <w:t>Skew (L2).</w:t>
       </w:r>
       <w:r>
-        <w:t xml:space="preserve"> Skewed storage [7] applied to the taps: the host puts channel p of position s in slot s·N + (p + s) mod N, bank (p + s) mod 4, which spreads each channel's nine taps 3/2/2/2 over the banks (Fig. 1c). It permutes each window's taps and the consumer's weight columns alike and needs no data and no RTL change; no partial sum, in any order, exceeds |bias| + K·127·128 &lt; 2³¹, so the INT32 result is unchanged. For N = 45, tap s·45 + p is already in bank (s + p) mod 4: there L2 = L0.</w:t>
+        <w:rPr/>
+        <w:t xml:space="preserve"> Skewed storage [7] applied to the taps: the host puts channel p of position s in slot s·N + (p + s) mod N, bank (p + s) mod 4, which spreads each channel's nine taps 3/2/2/2 over the banks (Fig. 1c). It permutes each window's taps and the consumer's weight columns alike and needs no data and no RTL change; no partial sum, in any order, exceeds |bias| + K·127·128 &lt; 2³¹, so the INT32 result is unchanged.</w:t>
       </w:r>
     </w:p>
     <w:p>
@@ -305,7 +483,8 @@
         <w:t>Skew + relabeling (L3).</w:t>
       </w:r>
       <w:r>
-        <w:t xml:space="preserve"> Under the skew, the channel in position p is in bank (s + p) mod 4 at 3×3 position s, so a relabeling still decides which channels share a bank at each s; L3 refits it under this rule and then skews (Fig. 1d).</w:t>
+        <w:rPr/>
+        <w:t xml:space="preserve"> Under the skew, bank b holds at position s the channels of class (b − s) mod 4 (class: p mod 4): class b at positions 0, 4 and 8, each other class at two. The skew thus dilutes a class's excess of nonzeros without removing it, and which channels form a class is still free: L3 refits the relabeling under this rule, then skews (Fig. 1d).</w:t>
       </w:r>
     </w:p>
     <w:p>
@@ -319,7 +498,8 @@
         <w:t>Fitting.</w:t>
       </w:r>
       <w:r>
-        <w:t xml:space="preserve"> Each layer is fitted alone, as relabeled windows are the original's with permuted columns. The recipe draws 2048 windows per fitted layer from Set12 01.png (Cal-1; σ = 25, one noise draw), minimizes their mean of (1) at W = 4, and searches from the identity with 400 proposals, each swapping two channels of different classes (position mod 4), kept only if the objective falls. Under the conventional rule it gave Frozen, the first board layout, and under the skewed rule L3. A second relabeling of the board network, Multi-start, adds Set12 02–03, two noise draws per image (Cal-3) and four random starts (2005 objective evaluations per layer against 401).</w:t>
+        <w:rPr/>
+        <w:t xml:space="preserve"> Each layer is fitted alone, as relabeled windows are the original's with permuted columns. The recipe draws 2048 windows per fitted layer from Set12 01.png (Cal-1; σ = 25, one noise draw), minimizes their mean of (1) at W = 4, and searches from the identity with 400 proposals, each swapping two channels of different classes (position mod 4), kept only if the objective falls. Under the conventional rule it gave Frozen, the first board layout, and under the skewed rule L3. A second relabeling of the board network, Multi-start, adds Set12 02–03, two noise draws per image (Cal-3) and four random starts.</w:t>
       </w:r>
     </w:p>
     <w:p>
@@ -333,11 +513,13 @@
         <w:t>Function preserved.</w:t>
       </w:r>
       <w:r>
-        <w:t xml:space="preserve"> In host emulation every folded L1 relabeling reproduced the original's output on Set12 05.png and BSD68 test001.png (Frozen and Multi-start on all 80 images); on every window of every layer of 05.png, on every network, L2 and L3 reproduced the INT32 accumulators (L3 up to its column order) and the folded L3 the output; and the board driver's own skew path gave identical accumulators and PNGs on both images.</w:t>
-      </w:r>
-    </w:p>
-    <w:p>
-      <w:pPr>
+        <w:rPr/>
+        <w:t xml:space="preserve"> In host emulation every folded L1 reproduced the original's output on Set12 05.png and BSD68 test001.png (Frozen and Multi-start: all 80 images); on 05.png, L2 and L3 reproduced every network's INT32 accumulators in every window (L3 up to its column order) and the folded L3 the output; the board driver's skew path gave identical accumulators and PNGs on both images.</w:t>
+      </w:r>
+    </w:p>
+    <w:p>
+      <w:pPr>
+        <w:spacing w:line="240" w:lineRule="auto"/>
         <w:ind w:firstLine="0"/>
         <w:jc w:val="center"/>
       </w:pPr>
@@ -385,6 +567,7 @@
         </w:numPr>
       </w:pPr>
       <w:r>
+        <w:rPr/>
         <w:t>Fig. 1. A conv5 input window of the board network on Set12 05.png (the first compute-bound one at W = 4 with the median m, 48). Filled: nonzero, colored by bank (bank 1 dotted). (a) L0, bank p mod 4; (b) Frozen, an L1 (16 of 32 channels change bank); (c) L2, bank (p + s) mod 4; (d) L3, bank (class + s) mod 4. Bars: nonzeros per bank; the fullest, m, costs 2m cycles; dashed: m = 36.5, where 2m equals the load of 73 cycles. Here L3 ties L2; over all of conv5's windows the mean m is 47.6, 42.1, 40.4 and 39.7.</w:t>
       </w:r>
     </w:p>
@@ -393,6 +576,7 @@
         <w:pStyle w:val="1"/>
       </w:pPr>
       <w:r>
+        <w:rPr/>
         <w:t>Experimental Setup</w:t>
       </w:r>
     </w:p>
@@ -407,7 +591,8 @@
         <w:t>Networks and images.</w:t>
       </w:r>
       <w:r>
-        <w:t xml:space="preserve"> Ten trained integer DnCNN-style networks [9] of six architectures, for Gaussian noise of σ = 25 on 7-bit inputs: A, 7 layers of 32 channels; B, 10 layers of 64 channels behind a 2×2 space-to-depth input; B-32, the same with 32 channels, with ReLU (training seeds s1–s3), maxout over pairs of 64 computed outputs (s1–s3) or their mean (s2); and a 45-channel ReLU variant. All but A had quantization-aware training. The board network, B-32 ReLU s1, reaches 29.54 dB on Set12 05.png; 37–55% of its hidden layers' window values are nonzero. Test images: Set12 [9] and BSD68 [10], 80 images, one noise draw each; savings are pooled over the 79 other than Set12 01.png, with paired bootstrap 95% intervals over images.</w:t>
+        <w:rPr/>
+        <w:t xml:space="preserve"> Ten trained integer DnCNN-style networks [9] for Gaussian noise of σ = 25 on 7-bit inputs: A, 7 layers of 32 channels; B, 10 layers of 64 channels behind a 2×2 space-to-depth input; B-32, the same with 32 channels, with ReLU (R1–R3, training seeds s1–s3), maxout over pairs of 64 computed outputs (M1–M3) or their mean (Av2, seed s2); and 45, a 45-channel ReLU variant. All but A had quantization-aware training. The board network, B-32 ReLU s1 (R1), reaches 29.54 dB on Set12 05.png; 37–55% of its hidden layers' window values are nonzero. Test images: Set12 [9] and BSD68 [10], 80 images, one noise draw each; savings are pooled over the 79 other than Set12 01.png, with paired bootstrap 95% intervals over images.</w:t>
       </w:r>
     </w:p>
     <w:p>
@@ -421,7 +606,8 @@
         <w:t>Board.</w:t>
       </w:r>
       <w:r>
-        <w:t xml:space="preserve"> The W = 4 bitstream for the XC7Z020 closes timing at 100 MHz (worst negative slack +0.130 ns), uses 11,151 LUTs (21%), 71 of 140 BRAM36-equivalent tiles and no DSP slice, and ran at the board preset's 50 MHz. One bitstream ran all layouts; per layer the driver checks the output against the integer model and reads the cycle counter CYCLES and the DMA-wait counter IN_STALL. On 05.png the Original ran once as a canary, then each layout three times in alternation. These board cycles are transcribed from run notes, each checked by a script against its cited line, until the raw reports are committed (only an earlier run of the Original is). All other cycle numbers are counts over the windows of the host emulation, which reproduces every network's reference PSNR on all 80 images.</w:t>
+        <w:rPr/>
+        <w:t xml:space="preserve"> The W = 4 bitstream for the XC7Z020 closes timing at 100 MHz (slack +0.130 ns), uses 11,151 LUTs (21%), 71 of 140 BRAM36-equivalent tiles and no DSP slice, and ran at the board preset's 50 MHz. One bitstream ran all layouts; per layer the driver checks the output against the integer model and reads the cycle counter CYCLES and the DMA-wait counter IN_STALL. On 05.png the Original ran once as a canary, then each layout three times in alternation. Until the raw reports are committed (only an earlier run of the Original is), these board cycles are transcribed from run notes, each checked by a script against its line. All other cycle numbers are counts in the host emulation, which reproduces every network's reference PSNR on all 80 images.</w:t>
       </w:r>
     </w:p>
     <w:p>
@@ -435,6 +621,7 @@
         <w:t>What was fixed when</w:t>
       </w:r>
       <w:r>
+        <w:rPr/>
         <w:t xml:space="preserve"> (GitHub push times, UTC). The fill-and-drain rule (6dc0e60, 10-17 13:15) preceded both exports, and Frozen's per-layer count savings on 05.png (9cf9c79, 10-17 18:38) preceded the board runs. PROTOCOL (c2299e2, 10-18 18:32) fixed the recipe, the evaluation, condition (2) per layer and hypotheses H0–H3 before any fit on the other nine networks; PROTOCOL_2 (951c8f1, 10-19 06:07) fixed L2, L3, the bootstrap and H4–H6 before the L3 fit and the study's counts (earlier ones: Sec. VI).</w:t>
       </w:r>
     </w:p>
@@ -443,6 +630,7 @@
         <w:pStyle w:val="1"/>
       </w:pPr>
       <w:r>
+        <w:rPr/>
         <w:t>Results</w:t>
       </w:r>
     </w:p>
@@ -451,6 +639,7 @@
         <w:pStyle w:val="2"/>
       </w:pPr>
       <w:r>
+        <w:rPr/>
         <w:t>Board Measurement</w:t>
       </w:r>
     </w:p>
@@ -459,7 +648,8 @@
         <w:pStyle w:val="a3"/>
       </w:pPr>
       <w:r>
-        <w:t>On Set12 05.png, Multi-start lowered the board cycles by 7.60% and Frozen by 7.02% (Table I). The repeats gave the same numbers, except 12 more cycles in Frozen's third run, all in conv10, where IN_STALL was also 12; none of the 90 layer runs of the repeats had an output mismatch. In all 63 comparisons (every layer of Original and Multi-start, sums and totals of canary, repeats and the earlier run), CYCLES − IN_STALL equaled the exact prediction. The fill-and-drain rule was read off runs that include the Original's layers, the repeats are deterministic, and conv1 and conv10 see the same windows in every layout; so nine comparisons are out of sample, all on one image: Multi-start's conv2–conv9 and Frozen's conv2–9 sum. This bitstream's IN_STALL misses DMA starvation at window boundaries (fixed in later RTL); the fill-and-drain rule could absorb a stall common to all layouts, so the match excludes only stalls that differ between them. Board runs of L0, Frozen, Multi-start and L2 on Set12 05–08, with every layer's cycles predicted before them (7312a84), are under way, and an addendum (d6521ec) adds L3; no result of them is claimed here.</w:t>
+        <w:rPr/>
+        <w:t>On Set12 05.png, Multi-start lowered the board cycles by 7.60% and Frozen by 7.02% (Table I). The repeats gave the same numbers, except 12 more cycles in Frozen's third run, all in conv10, where IN_STALL was also 12; none of their 90 layer runs had an output mismatch. In all 63 comparisons (every layer of Original and Multi-start, sums and totals of canary, repeats and the earlier run), CYCLES − IN_STALL equaled the exact prediction. As the fill-and-drain rule was read off runs including the Original's layers, the repeats are deterministic and conv1 and conv10 see the same windows in every layout, nine comparisons are out of sample, all on one image: Multi-start's conv2–conv9 and Frozen's conv2–9 sum. This bitstream's IN_STALL misses DMA starvation at window boundaries; the rule could absorb a stall common to all layouts, so the match excludes only stalls that differ between them. Board runs of L0, Frozen, Multi-start and L2 on Set12 05–08, every layer predicted before them (7312a84), and of L3 (addendum d6521ec) are under way; no result of them is claimed here.</w:t>
       </w:r>
     </w:p>
     <w:p>
@@ -471,6 +661,7 @@
         </w:numPr>
       </w:pPr>
       <w:r>
+        <w:rPr/>
         <w:t>Table I. Board cycles of B-32 ReLU s1 on Set12 05.png at W = 4 (repeat 1, transcribed), each equal to its exact prediction, and savings from them.</w:t>
       </w:r>
     </w:p>
@@ -502,6 +693,7 @@
               <w:spacing w:before="20" w:after="20"/>
             </w:pPr>
             <w:r>
+              <w:rPr/>
               <w:t>Layout</w:t>
             </w:r>
           </w:p>
@@ -517,6 +709,7 @@
               <w:jc w:val="center"/>
             </w:pPr>
             <w:r>
+              <w:rPr/>
               <w:t>conv2–9</w:t>
             </w:r>
           </w:p>
@@ -532,6 +725,7 @@
               <w:jc w:val="center"/>
             </w:pPr>
             <w:r>
+              <w:rPr/>
               <w:t>Total</w:t>
             </w:r>
           </w:p>
@@ -547,6 +741,7 @@
               <w:jc w:val="center"/>
             </w:pPr>
             <w:r>
+              <w:rPr/>
               <w:t>Saving (%), conv2–9/total</w:t>
             </w:r>
           </w:p>
@@ -563,6 +758,7 @@
               <w:spacing w:before="20" w:after="20"/>
             </w:pPr>
             <w:r>
+              <w:rPr/>
               <w:t>Original</w:t>
             </w:r>
           </w:p>
@@ -578,6 +774,7 @@
               <w:jc w:val="center"/>
             </w:pPr>
             <w:r>
+              <w:rPr/>
               <w:t>11,421,202</w:t>
             </w:r>
           </w:p>
@@ -593,6 +790,7 @@
               <w:jc w:val="center"/>
             </w:pPr>
             <w:r>
+              <w:rPr/>
               <w:t>13,289,030</w:t>
             </w:r>
           </w:p>
@@ -608,6 +806,7 @@
               <w:jc w:val="center"/>
             </w:pPr>
             <w:r>
+              <w:rPr/>
               <w:t>—</w:t>
             </w:r>
           </w:p>
@@ -624,6 +823,7 @@
               <w:spacing w:before="20" w:after="20"/>
             </w:pPr>
             <w:r>
+              <w:rPr/>
               <w:t>Frozen</w:t>
             </w:r>
           </w:p>
@@ -639,6 +839,7 @@
               <w:jc w:val="center"/>
             </w:pPr>
             <w:r>
+              <w:rPr/>
               <w:t>10,487,986</w:t>
             </w:r>
           </w:p>
@@ -654,6 +855,7 @@
               <w:jc w:val="center"/>
             </w:pPr>
             <w:r>
+              <w:rPr/>
               <w:t>12,355,814</w:t>
             </w:r>
           </w:p>
@@ -669,6 +871,7 @@
               <w:jc w:val="center"/>
             </w:pPr>
             <w:r>
+              <w:rPr/>
               <w:t>8.17/7.02</w:t>
             </w:r>
           </w:p>
@@ -685,6 +888,7 @@
               <w:spacing w:before="20" w:after="20"/>
             </w:pPr>
             <w:r>
+              <w:rPr/>
               <w:t>Multi-start</w:t>
             </w:r>
           </w:p>
@@ -700,6 +904,7 @@
               <w:jc w:val="center"/>
             </w:pPr>
             <w:r>
+              <w:rPr/>
               <w:t>10,410,591</w:t>
             </w:r>
           </w:p>
@@ -715,6 +920,7 @@
               <w:jc w:val="center"/>
             </w:pPr>
             <w:r>
+              <w:rPr/>
               <w:t>12,278,419</w:t>
             </w:r>
           </w:p>
@@ -730,6 +936,7 @@
               <w:jc w:val="center"/>
             </w:pPr>
             <w:r>
+              <w:rPr/>
               <w:t>8.85/7.60</w:t>
             </w:r>
           </w:p>
@@ -741,6 +948,7 @@
         <w:pStyle w:val="2"/>
       </w:pPr>
       <w:r>
+        <w:rPr/>
         <w:t>Ten Networks under Two Protocols</w:t>
       </w:r>
     </w:p>
@@ -749,7 +957,8 @@
         <w:pStyle w:val="a3"/>
       </w:pPr>
       <w:r>
-        <w:t>PROTOCOL fixed two checks and two sign predictions, which all held. H0: our code reproduced Frozen in all eight layers, and its export byte for byte. H1: wherever (2) holds, at W = 1 on all networks and at W = 2 on A and B-32 ReLU s1–s3, the relabeled count equaled the original on all 80 images. H2: the pooled W = 4 saving of L1 was positive on all ten networks, 1.09–10.80% (Fig. 2; the sign was known for B, maxout s1 and the board network). H3: the pooled W = 2 saving was positive on all six networks where (2) allows it, 3.36–7.37% on five and 0.022% on the 45-channel network.</w:t>
+        <w:rPr/>
+        <w:t>PROTOCOL's two checks and two sign predictions all held. H0: our code reproduced Frozen in all eight layers, and its export byte for byte. H1: wherever (2) holds, at W = 1 on all networks and at W = 2 on A and R1–R3, the relabeled count equaled the original on all 80 images. H2: the pooled W = 4 saving of L1 was positive on all ten networks, 1.09–10.80% (Fig. 2; the sign was known for B, M1 and R1). H3: the pooled W = 2 saving was positive on all six networks where (2) allows it, 3.36–7.37% on five and 0.022% on 45.</w:t>
       </w:r>
     </w:p>
     <w:p>
@@ -757,11 +966,13 @@
         <w:pStyle w:val="a3"/>
       </w:pPr>
       <w:r>
-        <w:t>PROTOCOL_2 fixed three more, which also held. H4: wherever (2) holds, L2 and L3 counted exactly as L0 on all 80 images, in every layer. H5: at W = 4, L2 saved more than L1 on all nine networks with N mod 4 = 0, by 0.90–2.36 points (known for the board network). H6: L3 saved more than L2 on all nine, by 0.48–1.18 points, and on the board network by 0.73 points (95% interval [0.70, 0.75]): under the skew a relabeling still pays, but far less than alone (7.46%). Not hypotheses: L3 saved more than L2 on each of the 79 images of all nine; at W = 2 the order L3 &gt; L2 &gt; L1 held on the five networks with N mod 4 = 0 where (2) allows a gain, L3 by 0.46–0.85 points over L2; no image counted more cycles under any layout at any W.</w:t>
-      </w:r>
-    </w:p>
-    <w:p>
-      <w:pPr>
+        <w:rPr/>
+        <w:t>PROTOCOL_2's three also held. H4: wherever (2) holds, L2 and L3 counted exactly as L0 on all 80 images, in every layer. H5: at W = 4, L2 saved more than L1 on all nine networks with N mod 4 = 0, by 0.90–2.36 points (known for R1). H6: L3 saved more than L2 on all nine, by 0.48–1.18 points, on R1 by 0.73 (95% interval [0.70, 0.75]). L3 was fitted on 01.png alone, so this gain is out of sample, and it is consistent: on each of the nine networks the interval of L3 − L2 excludes 0; L3 counted fewer cycles than L2 on all 711 image–network pairs and, pooled, in all 69 fitted layers; on R1, 01.png itself gained 0.71 points, the test images a median of 0.72. At W = 2, L3 &gt; L2 &gt; L1 held on the five networks with N mod 4 = 0 where (2) allows a gain, L3 by 0.46–0.85 points; no image counted more cycles under any layout at any W.</w:t>
+      </w:r>
+    </w:p>
+    <w:p>
+      <w:pPr>
+        <w:spacing w:line="240" w:lineRule="auto"/>
         <w:ind w:firstLine="0"/>
         <w:jc w:val="center"/>
       </w:pPr>
@@ -809,7 +1020,8 @@
         </w:numPr>
       </w:pPr>
       <w:r>
-        <w:t>Fig. 2. Pooled saving over the 79 images (count, conv1–convL) at W = 4 (top) and W = 2 (bottom) of L1 (relabeling), L2 (skew) and L3 (skew + relabeling); 95% intervals (at most ±0.39 points) are narrower than the markers. ×: (2) holds in every layer; all layouts count as L0 on all 80 images. On 45 (N mod 4 = 1), L2 = L0 and L3 = L1. A: 7 × 32; B: 10 × 64; R1–R3, M1–M3: B-32 ReLU and maxout, seeds s1–s3 (R1: board network); Av2: averaging, s2; 45: 10 × 45 ReLU.</w:t>
+        <w:rPr/>
+        <w:t>Fig. 2. Pooled saving over the 79 images (count, conv1–convL) at W = 4 (top) and W = 2 (bottom) of L1 (relabeling), L2 (skew) and L3 (skew + relabeling); 95% intervals (at most ±0.39 points) are narrower than the markers. ×: (2) holds in every layer; all layouts count as L0 on all 80 images. On 45 (N mod 4 = 1), L2 = L0 and L3 = L1. Networks: Sec. IV (R1: board network).</w:t>
       </w:r>
     </w:p>
     <w:p>
@@ -817,6 +1029,7 @@
         <w:pStyle w:val="2"/>
       </w:pPr>
       <w:r>
+        <w:rPr/>
         <w:t>The Board Network on 79 Images</w:t>
       </w:r>
     </w:p>
@@ -825,11 +1038,13 @@
         <w:pStyle w:val="a3"/>
       </w:pPr>
       <w:r>
-        <w:t>At W = 4, L2 saved more than both board relabelings on each of the 79 images (Fig. 3); L3 reached 82.6% of the perfect-balance saving (Table II). On 05.png the counts give 9.39% (L3) and 8.64% (L2), against 7.02% and 7.60% for Frozen and Multi-start and 11.49% for perfect balance. Pooled, L2 also beat L1 fitted on each test image and a Sense-like sort by each channel's nonzero count in it; a density deal after SparTen [4] saved least (a comparison of procedures, not of co-activation against density). Multi-start's lead over Frozen comes from Frozen's seed (the worst of five), data and budget, not restarts: greedy search with equal data and budget beat it on four of five seeds.</w:t>
-      </w:r>
-    </w:p>
-    <w:p>
-      <w:pPr>
+        <w:rPr/>
+        <w:t>At W = 4, L2 saved more than both board relabelings, and L3 more than L2, on each of the 79 images (Fig. 3). L3 removed 26% of the imbalance that L2 leaves, reaching 82.6% of the perfect-balance saving against 76.6% (Table II), with the same host reorder as L2. On 05.png the counts give 9.39% (L3) and 8.64% (L2), against 7.02% and 7.60% for Frozen and Multi-start and 11.49% for perfect balance. Pooled, L2 also beat L1 fitted on each test image (8.45%) and a Sense-like sort by each channel's nonzero count in it; a density deal after SparTen [4] saved least (a comparison of procedures, not of co-activation against density).</w:t>
+      </w:r>
+    </w:p>
+    <w:p>
+      <w:pPr>
+        <w:spacing w:line="240" w:lineRule="auto"/>
         <w:ind w:firstLine="0"/>
         <w:jc w:val="center"/>
       </w:pPr>
@@ -877,6 +1092,7 @@
         </w:numPr>
       </w:pPr>
       <w:r>
+        <w:rPr/>
         <w:t>Fig. 3. Per-image W = 4 saving (count) of the board network on the 79 images other than Set12 01.png (calibration of Frozen and L3; Multi-start also used 02–03), sorted by the bound; legend: pooled saving; dotted: the board image.</w:t>
       </w:r>
     </w:p>
@@ -889,6 +1105,7 @@
         </w:numPr>
       </w:pPr>
       <w:r>
+        <w:rPr/>
         <w:t>Table II. B-32 ReLU s1 at W = 4 (count, 79 images): pooled saving against L0 [95% interval] and share (%) of the perfect-balance saving. p.i.: uses the test image (no interval); †: Cal-3 includes two of the 79; density, Sense-like: best of three variants on these images.</w:t>
       </w:r>
     </w:p>
@@ -920,6 +1137,7 @@
               <w:spacing w:before="20" w:after="20"/>
             </w:pPr>
             <w:r>
+              <w:rPr/>
               <w:t>Layout</w:t>
             </w:r>
           </w:p>
@@ -935,6 +1153,7 @@
               <w:jc w:val="center"/>
             </w:pPr>
             <w:r>
+              <w:rPr/>
               <w:t>Data</w:t>
             </w:r>
           </w:p>
@@ -950,6 +1169,7 @@
               <w:jc w:val="center"/>
             </w:pPr>
             <w:r>
+              <w:rPr/>
               <w:t>Pooled (%)</w:t>
             </w:r>
           </w:p>
@@ -965,6 +1185,7 @@
               <w:jc w:val="center"/>
             </w:pPr>
             <w:r>
+              <w:rPr/>
               <w:t>Share</w:t>
             </w:r>
           </w:p>
@@ -981,6 +1202,7 @@
               <w:spacing w:before="20" w:after="20"/>
             </w:pPr>
             <w:r>
+              <w:rPr/>
               <w:t>Density balance [4]</w:t>
             </w:r>
           </w:p>
@@ -996,6 +1218,7 @@
               <w:jc w:val="center"/>
             </w:pPr>
             <w:r>
+              <w:rPr/>
               <w:t>Cal-1</w:t>
             </w:r>
           </w:p>
@@ -1011,6 +1234,7 @@
               <w:jc w:val="center"/>
             </w:pPr>
             <w:r>
+              <w:rPr/>
               <w:t>3.69 [3.50, 3.88]</w:t>
             </w:r>
           </w:p>
@@ -1026,6 +1250,7 @@
               <w:jc w:val="center"/>
             </w:pPr>
             <w:r>
+              <w:rPr/>
               <w:t>30.7</w:t>
             </w:r>
           </w:p>
@@ -1042,6 +1267,7 @@
               <w:spacing w:before="20" w:after="20"/>
             </w:pPr>
             <w:r>
+              <w:rPr/>
               <w:t>Sense-like sort [3]</w:t>
             </w:r>
           </w:p>
@@ -1057,6 +1283,7 @@
               <w:jc w:val="center"/>
             </w:pPr>
             <w:r>
+              <w:rPr/>
               <w:t>p.i.</w:t>
             </w:r>
           </w:p>
@@ -1072,6 +1299,7 @@
               <w:jc w:val="center"/>
             </w:pPr>
             <w:r>
+              <w:rPr/>
               <w:t>4.89</w:t>
             </w:r>
           </w:p>
@@ -1087,6 +1315,7 @@
               <w:jc w:val="center"/>
             </w:pPr>
             <w:r>
+              <w:rPr/>
               <w:t>40.7</w:t>
             </w:r>
           </w:p>
@@ -1103,6 +1332,7 @@
               <w:spacing w:before="20" w:after="20"/>
             </w:pPr>
             <w:r>
+              <w:rPr/>
               <w:t>L1 Frozen</w:t>
             </w:r>
           </w:p>
@@ -1118,6 +1348,7 @@
               <w:jc w:val="center"/>
             </w:pPr>
             <w:r>
+              <w:rPr/>
               <w:t>Cal-1</w:t>
             </w:r>
           </w:p>
@@ -1133,6 +1364,7 @@
               <w:jc w:val="center"/>
             </w:pPr>
             <w:r>
+              <w:rPr/>
               <w:t>7.46 [7.16, 7.78]</w:t>
             </w:r>
           </w:p>
@@ -1148,6 +1380,7 @@
               <w:jc w:val="center"/>
             </w:pPr>
             <w:r>
+              <w:rPr/>
               <w:t>62.1</w:t>
             </w:r>
           </w:p>
@@ -1164,6 +1397,7 @@
               <w:spacing w:before="20" w:after="20"/>
             </w:pPr>
             <w:r>
+              <w:rPr/>
               <w:t>L1 Multi-start</w:t>
             </w:r>
           </w:p>
@@ -1179,6 +1413,7 @@
               <w:jc w:val="center"/>
             </w:pPr>
             <w:r>
+              <w:rPr/>
               <w:t>Cal-3†</w:t>
             </w:r>
           </w:p>
@@ -1194,6 +1429,7 @@
               <w:jc w:val="center"/>
             </w:pPr>
             <w:r>
+              <w:rPr/>
               <w:t>8.10 [7.80, 8.39]</w:t>
             </w:r>
           </w:p>
@@ -1209,6 +1445,7 @@
               <w:jc w:val="center"/>
             </w:pPr>
             <w:r>
+              <w:rPr/>
               <w:t>67.4</w:t>
             </w:r>
           </w:p>
@@ -1225,7 +1462,8 @@
               <w:spacing w:before="20" w:after="20"/>
             </w:pPr>
             <w:r>
-              <w:t>L1 fitted per image</w:t>
+              <w:rPr/>
+              <w:t>L2 skew</w:t>
             </w:r>
           </w:p>
         </w:tc>
@@ -1240,7 +1478,8 @@
               <w:jc w:val="center"/>
             </w:pPr>
             <w:r>
-              <w:t>p.i.</w:t>
+              <w:rPr/>
+              <w:t>none</w:t>
             </w:r>
           </w:p>
         </w:tc>
@@ -1255,7 +1494,8 @@
               <w:jc w:val="center"/>
             </w:pPr>
             <w:r>
-              <w:t>8.45</w:t>
+              <w:rPr/>
+              <w:t>9.20 [8.82, 9.58]</w:t>
             </w:r>
           </w:p>
         </w:tc>
@@ -1270,7 +1510,8 @@
               <w:jc w:val="center"/>
             </w:pPr>
             <w:r>
-              <w:t>70.3</w:t>
+              <w:rPr/>
+              <w:t>76.6</w:t>
             </w:r>
           </w:p>
         </w:tc>
@@ -1286,7 +1527,8 @@
               <w:spacing w:before="20" w:after="20"/>
             </w:pPr>
             <w:r>
-              <w:t>L2 skew</w:t>
+              <w:rPr/>
+              <w:t>L3 skew + relabeling</w:t>
             </w:r>
           </w:p>
         </w:tc>
@@ -1301,7 +1543,8 @@
               <w:jc w:val="center"/>
             </w:pPr>
             <w:r>
-              <w:t>none</w:t>
+              <w:rPr/>
+              <w:t>Cal-1</w:t>
             </w:r>
           </w:p>
         </w:tc>
@@ -1316,7 +1559,8 @@
               <w:jc w:val="center"/>
             </w:pPr>
             <w:r>
-              <w:t>9.20 [8.82, 9.58]</w:t>
+              <w:rPr/>
+              <w:t>9.93 [9.54, 10.32]</w:t>
             </w:r>
           </w:p>
         </w:tc>
@@ -1331,7 +1575,8 @@
               <w:jc w:val="center"/>
             </w:pPr>
             <w:r>
-              <w:t>76.6</w:t>
+              <w:rPr/>
+              <w:t>82.6</w:t>
             </w:r>
           </w:p>
         </w:tc>
@@ -1347,7 +1592,8 @@
               <w:spacing w:before="20" w:after="20"/>
             </w:pPr>
             <w:r>
-              <w:t>L3 skew + relabeling</w:t>
+              <w:rPr/>
+              <w:t>Perfect balance</w:t>
             </w:r>
           </w:p>
         </w:tc>
@@ -1362,7 +1608,8 @@
               <w:jc w:val="center"/>
             </w:pPr>
             <w:r>
-              <w:t>Cal-1</w:t>
+              <w:rPr/>
+              <w:t>—</w:t>
             </w:r>
           </w:p>
         </w:tc>
@@ -1377,7 +1624,8 @@
               <w:jc w:val="center"/>
             </w:pPr>
             <w:r>
-              <w:t>9.93 [9.54, 10.32]</w:t>
+              <w:rPr/>
+              <w:t>12.02 [11.59, 12.44]</w:t>
             </w:r>
           </w:p>
         </w:tc>
@@ -1392,67 +1640,7 @@
               <w:jc w:val="center"/>
             </w:pPr>
             <w:r>
-              <w:t>82.6</w:t>
-            </w:r>
-          </w:p>
-        </w:tc>
-      </w:tr>
-      <w:tr>
-        <w:tc>
-          <w:tcPr>
-            <w:tcW w:type="dxa" w:w="1681"/>
-          </w:tcPr>
-          <w:p>
-            <w:pPr>
-              <w:pStyle w:val="tablecopy"/>
-              <w:spacing w:before="20" w:after="20"/>
-            </w:pPr>
-            <w:r>
-              <w:t>Perfect balance</w:t>
-            </w:r>
-          </w:p>
-        </w:tc>
-        <w:tc>
-          <w:tcPr>
-            <w:tcW w:type="dxa" w:w="700"/>
-          </w:tcPr>
-          <w:p>
-            <w:pPr>
-              <w:pStyle w:val="tablecopy"/>
-              <w:spacing w:before="20" w:after="20"/>
-              <w:jc w:val="center"/>
-            </w:pPr>
-            <w:r>
-              <w:t>—</w:t>
-            </w:r>
-          </w:p>
-        </w:tc>
-        <w:tc>
-          <w:tcPr>
-            <w:tcW w:type="dxa" w:w="1681"/>
-          </w:tcPr>
-          <w:p>
-            <w:pPr>
-              <w:pStyle w:val="tablecopy"/>
-              <w:spacing w:before="20" w:after="20"/>
-              <w:jc w:val="center"/>
-            </w:pPr>
-            <w:r>
-              <w:t>12.02 [11.59, 12.44]</w:t>
-            </w:r>
-          </w:p>
-        </w:tc>
-        <w:tc>
-          <w:tcPr>
-            <w:tcW w:type="dxa" w:w="700"/>
-          </w:tcPr>
-          <w:p>
-            <w:pPr>
-              <w:pStyle w:val="tablecopy"/>
-              <w:spacing w:before="20" w:after="20"/>
-              <w:jc w:val="center"/>
-            </w:pPr>
-            <w:r>
+              <w:rPr/>
               <w:t>100</w:t>
             </w:r>
           </w:p>
@@ -1464,6 +1652,7 @@
         <w:pStyle w:val="2"/>
       </w:pPr>
       <w:r>
+        <w:rPr/>
         <w:t>Cost</w:t>
       </w:r>
     </w:p>
@@ -1472,7 +1661,8 @@
         <w:pStyle w:val="a3"/>
       </w:pPr>
       <w:r>
-        <w:t>Fitting a network took under 30 s (L1 or L3); L2 needs none. Single-threaded on an x86 server, the host's work for 05.png (input, im2col, requantization) took 31 ms (32 ms on the Multi-start export) against the core's 266 ms at 50 MHz: back to back, Multi-start's 7.60% core saving is 6.3–6.8% end to end, and all of it if the host overlaps the next image; L2's reordering after im2col adds 4.2 ms. This bound omits the transfer of windows and results and the JTAG harness that ran the board (315 s per image, 0.08% of it in the core), and the Zynq's ARM cores would be slower than the server; energy was not measured.</w:t>
+        <w:rPr/>
+        <w:t>Fitting a network took under 30 s (L1 or L3); L2 needs none. Single-threaded on an x86 server, the host's work for 05.png (input, im2col, requantization) took 31 ms (32 ms on the Multi-start export) against the core's 266 ms at 50 MHz: back to back, Multi-start's 7.60% core saving is 6.3–6.8% end to end, and all of it if the host overlaps the next image; the skew's reordering after im2col adds 4.2 ms. This omits the transfer of windows and results and the JTAG harness that ran the board (315 s per image); the Zynq's ARM cores would be slower than the server; energy was not measured.</w:t>
       </w:r>
     </w:p>
     <w:p>
@@ -1480,6 +1670,7 @@
         <w:pStyle w:val="1"/>
       </w:pPr>
       <w:r>
+        <w:rPr/>
         <w:t>Limitations</w:t>
       </w:r>
     </w:p>
@@ -1489,6 +1680,7 @@
         <w:ind w:firstLine="0" w:left="198"/>
       </w:pPr>
       <w:r>
+        <w:rPr/>
         <w:t xml:space="preserve">• </w:t>
       </w:r>
       <w:r>
@@ -1498,6 +1690,7 @@
         <w:t>Board evidence.</w:t>
       </w:r>
       <w:r>
+        <w:rPr/>
         <w:t xml:space="preserve"> The board measured just two relabelings, on one network and one image; L2 and L3 are counts.</w:t>
       </w:r>
     </w:p>
@@ -1507,6 +1700,7 @@
         <w:ind w:firstLine="0" w:left="198"/>
       </w:pPr>
       <w:r>
+        <w:rPr/>
         <w:t xml:space="preserve">• </w:t>
       </w:r>
       <w:r>
@@ -1516,7 +1710,8 @@
         <w:t>Scope and selection.</w:t>
       </w:r>
       <w:r>
-        <w:t xml:space="preserve"> Only DnCNN-family denoisers at σ = 25, one noise draw per image (the intervals resample images only); BSD68 was part of the networks' development; banks decoupled by FIFOs and other P, T or kernel sizes were not evaluated. Multi-start was chosen for the board after its BSD68 counts had been seen. Before PROTOCOL_2, L2 had been counted on the board network (and on 05.png of four others), and uncommitted counts of L2 on eight images of B and maxout s1 and of L3 on seven of the board network had been seen (PROTOCOL_2 lists them).</w:t>
+        <w:rPr/>
+        <w:t xml:space="preserve"> Only DnCNN-family denoisers at σ = 25, one noise draw per image (the intervals resample images only); BSD68 was part of the networks' development; FIFO-decoupled banks and other P, T or kernel sizes were not evaluated. Multi-start was chosen for the board after its BSD68 counts had been seen. Before PROTOCOL_2, L2 had been counted on R1 (and on 05.png of four others), and uncommitted counts of L2 on eight images of B and M1 and of L3 on seven of R1 had been seen (PROTOCOL_2 lists them).</w:t>
       </w:r>
     </w:p>
     <w:p>
@@ -1524,6 +1719,7 @@
         <w:pStyle w:val="1"/>
       </w:pPr>
       <w:r>
+        <w:rPr/>
         <w:t>Conclusion</w:t>
       </w:r>
     </w:p>
@@ -1532,7 +1728,8 @@
         <w:pStyle w:val="a3"/>
       </w:pPr>
       <w:r>
-        <w:t>The layer shapes tell where the tap-to-bank layout of a lockstep zero-skipping core can matter. Where it can, in counts over 79 images, the data-free skew removed more bank imbalance than a fitted relabeling, and a relabeling fitted under the skew removed more still, on all nine networks with N mod 4 = 0. Scripts, layouts, per-image counts and the source of every number are at https://github.com/qewr1234/FPGA (bankperm/).</w:t>
+        <w:rPr/>
+        <w:t>The layer shapes tell where the tap-to-bank layout of a lockstep zero-skipping core can matter. Where it can, in counts over 79 images, the data-free skew removed more bank imbalance than a fitted relabeling, and a relabeling fitted under the skew removed more still, on all nine networks with N mod 4 = 0, on every test image and in every fitted layer. The two are complementary: the skew spreads each channel over the banks, the relabeling chooses which channels travel together. Scripts, layouts, per-image counts and the source of every number are at https://github.com/qewr1234/FPGA (bankperm/).</w:t>
       </w:r>
     </w:p>
     <w:p>
@@ -1540,6 +1737,7 @@
         <w:pStyle w:val="5"/>
       </w:pPr>
       <w:r>
+        <w:rPr/>
         <w:t>Acknowledgment</w:t>
       </w:r>
     </w:p>
@@ -1548,6 +1746,7 @@
         <w:pStyle w:val="a3"/>
       </w:pPr>
       <w:r>
+        <w:rPr/>
         <w:t>This study was conducted with the support of the Ministry of Science and ICT and the Institute for Information &amp; Communications Technology Planning &amp; Evaluation (IITP) under the 'SW-oriented University Program.'</w:t>
       </w:r>
     </w:p>
@@ -1556,6 +1755,7 @@
         <w:pStyle w:val="5"/>
       </w:pPr>
       <w:r>
+        <w:rPr/>
         <w:t>References</w:t>
       </w:r>
     </w:p>
@@ -1564,6 +1764,7 @@
         <w:pStyle w:val="references"/>
       </w:pPr>
       <w:r>
+        <w:rPr/>
         <w:t xml:space="preserve">J. Albericio, P. Judd, T. Hetherington, T. Aamodt, N. Enright Jerger, and A. Moshovos, "Cnvlutin: Ineffectual-neuron-free deep neural network computing," in </w:t>
       </w:r>
       <w:r>
@@ -1573,7 +1774,8 @@
         <w:t>Proc. ACM/IEEE 43rd Annu. Int. Symp. Comput. Archit. (ISCA)</w:t>
       </w:r>
       <w:r>
-        <w:t>, 2016, pp. 1–13, doi: 10.1109/ISCA.2016.11.</w:t>
+        <w:rPr/>
+        <w:t>, 2016, pp. 1–13.</w:t>
       </w:r>
     </w:p>
     <w:p>
@@ -1581,6 +1783,7 @@
         <w:pStyle w:val="references"/>
       </w:pPr>
       <w:r>
+        <w:rPr/>
         <w:t xml:space="preserve">Z.-G. Liu, P. N. Whatmough, Y. Zhu, and M. Mattina, "S2TA: Exploiting structured sparsity for energy-efficient mobile CNN acceleration," in </w:t>
       </w:r>
       <w:r>
@@ -1590,7 +1793,8 @@
         <w:t>Proc. IEEE Int. Symp. High-Perform. Comput. Archit. (HPCA)</w:t>
       </w:r>
       <w:r>
-        <w:t>, 2022, pp. 573–586, doi: 10.1109/HPCA53966.2022.00049.</w:t>
+        <w:rPr/>
+        <w:t>, 2022, pp. 573–586.</w:t>
       </w:r>
     </w:p>
     <w:p>
@@ -1598,6 +1802,7 @@
         <w:pStyle w:val="references"/>
       </w:pPr>
       <w:r>
+        <w:rPr/>
         <w:t xml:space="preserve">W. Sun, D. Liu, Z. Zou, W. Sun, S. Chen, and Y. Kang, "Sense: Model-hardware codesign for accelerating sparse CNNs on systolic arrays," </w:t>
       </w:r>
       <w:r>
@@ -1607,7 +1812,8 @@
         <w:t>IEEE Trans. Very Large Scale Integr. (VLSI) Syst.</w:t>
       </w:r>
       <w:r>
-        <w:t>, vol. 31, no. 4, pp. 470–483, 2023, doi: 10.1109/TVLSI.2023.3241933.</w:t>
+        <w:rPr/>
+        <w:t>, vol. 31, no. 4, pp. 470–483, 2023.</w:t>
       </w:r>
     </w:p>
     <w:p>
@@ -1615,6 +1821,7 @@
         <w:pStyle w:val="references"/>
       </w:pPr>
       <w:r>
+        <w:rPr/>
         <w:t xml:space="preserve">A. Gondimalla, N. Chesnut, M. Thottethodi, and T. N. Vijaykumar, "SparTen: A sparse tensor accelerator for convolutional neural networks," in </w:t>
       </w:r>
       <w:r>
@@ -1624,7 +1831,8 @@
         <w:t>Proc. 52nd Annu. IEEE/ACM Int. Symp. Microarchit. (MICRO)</w:t>
       </w:r>
       <w:r>
-        <w:t>, 2019, pp. 151–165, doi: 10.1145/3352460.3358291.</w:t>
+        <w:rPr/>
+        <w:t>, 2019, pp. 151–165.</w:t>
       </w:r>
     </w:p>
     <w:p>
@@ -1632,6 +1840,7 @@
         <w:pStyle w:val="references"/>
       </w:pPr>
       <w:r>
+        <w:rPr/>
         <w:t xml:space="preserve">J. Pool and C. Yu, "Channel permutations for N:M sparsity," in </w:t>
       </w:r>
       <w:r>
@@ -1641,6 +1850,7 @@
         <w:t>Proc. Adv. Neural Inf. Process. Syst. (NeurIPS)</w:t>
       </w:r>
       <w:r>
+        <w:rPr/>
         <w:t>, vol. 34, 2021, pp. 13316–13327.</w:t>
       </w:r>
     </w:p>
@@ -1649,6 +1859,7 @@
         <w:pStyle w:val="references"/>
       </w:pPr>
       <w:r>
+        <w:rPr/>
         <w:t>P. Dang, Y. He, and H. Li, "VARA: A voltage-aware ReRAM-based accelerator for energy-efficient computing," arXiv:2609.00421, 2026.</w:t>
       </w:r>
     </w:p>
@@ -1657,6 +1868,7 @@
         <w:pStyle w:val="references"/>
       </w:pPr>
       <w:r>
+        <w:rPr/>
         <w:t xml:space="preserve">P. Budnik and D. J. Kuck, "The organization and use of parallel memories," </w:t>
       </w:r>
       <w:r>
@@ -1666,7 +1878,8 @@
         <w:t>IEEE Trans. Comput.</w:t>
       </w:r>
       <w:r>
-        <w:t>, vol. C-20, no. 12, pp. 1566–1569, 1971, doi: 10.1109/T-C.1971.223171.</w:t>
+        <w:rPr/>
+        <w:t>, vol. C-20, no. 12, pp. 1566–1569, 1971.</w:t>
       </w:r>
     </w:p>
     <w:p>
@@ -1674,6 +1887,7 @@
         <w:pStyle w:val="references"/>
       </w:pPr>
       <w:r>
+        <w:rPr/>
         <w:t xml:space="preserve">S. Williams, A. Waterman, and D. Patterson, "Roofline: An insightful visual performance model for multicore architectures," </w:t>
       </w:r>
       <w:r>
@@ -1683,7 +1897,8 @@
         <w:t>Commun. ACM</w:t>
       </w:r>
       <w:r>
-        <w:t>, vol. 52, no. 4, pp. 65–76, 2009, doi: 10.1145/1498765.1498785.</w:t>
+        <w:rPr/>
+        <w:t>, vol. 52, no. 4, pp. 65–76, 2009.</w:t>
       </w:r>
     </w:p>
     <w:p>
@@ -1691,6 +1906,7 @@
         <w:pStyle w:val="references"/>
       </w:pPr>
       <w:r>
+        <w:rPr/>
         <w:t xml:space="preserve">K. Zhang, W. Zuo, Y. Chen, D. Meng, and L. Zhang, "Beyond a Gaussian denoiser: Residual learning of deep CNN for image denoising," </w:t>
       </w:r>
       <w:r>
@@ -1700,7 +1916,8 @@
         <w:t>IEEE Trans. Image Process.</w:t>
       </w:r>
       <w:r>
-        <w:t>, vol. 26, no. 7, pp. 3142–3155, 2017, doi: 10.1109/TIP.2017.2662206.</w:t>
+        <w:rPr/>
+        <w:t>, vol. 26, no. 7, pp. 3142–3155, 2017.</w:t>
       </w:r>
     </w:p>
     <w:p>
@@ -1708,6 +1925,7 @@
         <w:pStyle w:val="references"/>
       </w:pPr>
       <w:r>
+        <w:rPr/>
         <w:t xml:space="preserve">S. Roth and M. J. Black, "Fields of experts," </w:t>
       </w:r>
       <w:r>
@@ -1717,7 +1935,8 @@
         <w:t>Int. J. Comput. Vis.</w:t>
       </w:r>
       <w:r>
-        <w:t>, vol. 82, no. 2, pp. 205–229, 2009, doi: 10.1007/s11263-008-0197-6.</w:t>
+        <w:rPr/>
+        <w:t>, vol. 82, no. 2, pp. 205–229, 2009.</w:t>
       </w:r>
     </w:p>
     <w:p>

</xml_diff>

<commit_message>
WIP: IWEICT paper without bookkeeping, with a system figure (review running)
At the author's request: commit hashes, the 'What was fixed when'
paragraph, H0, the search sources, the earlier runs' details and other
process notes are out of the paper (README keeps them); the pre-registration
is one sentence. New Fig. 1 (figures/fig_system.py): the host builds the
windows and decides each tap's bank by its slot, the four banks skip zeros
in lockstep and wait for the fullest; the relabeling is folded into the
weights, the skew is the slot order, one bitstream. Figures renumbered 2-4.
build_docx keeps a caption with its picture.

Co-Authored-By: Claude Opus 5.5 <noreply@anthropic.com>
Claude-Session: https://claude.ai/code/session_01KmQd2ww7ZkypMsRjhWuU5X
</commit_message>
<xml_diff>
--- a/bankperm/PAPER_EN.docx
+++ b/bankperm/PAPER_EN.docx
@@ -161,7 +161,7 @@
         <w:pStyle w:val="a3"/>
       </w:pPr>
       <w:r>
-        <w:t>A core that skips zero activations saves multiplications, but lanes that advance together make each window cost as much as the busiest one, a stall Cnvlutin measures as its own category [1]. Known remedies change the network or add hardware: S2TA bounds the nonzeros per block [2], and Sense rebalances channels at run time, noting that input maps "cannot be trained offline to balance IFM workload" [3]. Offline reorderings mostly target weights: SparTen sorts filters by density [4], and Pool and Yu fold a channel permutation into the preceding layer for N:M pruning [5]; VARA permutes inputs offline from activation statistics to cluster co-zero inputs behind an index unit [6], and skewed storage gives conflict-free parallel access to a matrix's rows and columns [7]. Permutation, folding, profiling and skewing are thus not new; our search (Crossref, arXiv, web; October 2026) found no work that spreads co-active channels over lockstep zero-skipping banks by an exact, folded relabeling.</w:t>
+        <w:t>A core that skips zero activations saves multiplications, but lanes that advance together make each window cost as much as the busiest one, a stall Cnvlutin measures as its own category [1]. Known remedies change the network or add hardware: S2TA bounds the nonzeros per block [2], and Sense rebalances channels at run time, noting that input maps "cannot be trained offline to balance IFM workload" [3]. Offline reorderings mostly target weights: SparTen sorts filters by density [4], and Pool and Yu fold a channel permutation into the preceding layer for N:M pruning [5]; VARA permutes inputs offline from activation statistics to cluster co-zero inputs behind an index unit [6], and skewed storage gives conflict-free parallel access to a matrix's rows and columns [7]. Permutation, folding, profiling and skewing are thus not new; we found no work that spreads co-active channels over lockstep zero-skipping banks by an exact, folded relabeling.</w:t>
       </w:r>
     </w:p>
     <w:p>
@@ -169,7 +169,79 @@
         <w:pStyle w:val="a3"/>
       </w:pPr>
       <w:r>
-        <w:t>In our core, whose four tap banks run in lockstep, the host's choice of slot decides a tap's bank. We contribute (i) a shape-only condition necessary for any layout to change a layer's cycle count (Section II); (ii) three layouts that keep the bitstream and the integer output unchanged: a folded channel relabeling, a data-free skew and both combined (Section III); (iii) pre-registered board runs of all three on four images, with every layer's cycles predicted, exactly in 176 of 180 (V-A); (iv) two pre-registered ten-network studies (V-B) and the board network on 79 images (V-C).</w:t>
+        <w:t>In our core, whose four tap banks run in lockstep, the host's choice of slot decides a tap's bank (Fig. 1). We contribute (i) a shape-only condition necessary for any layout to change a layer's cycle count (Section II); (ii) three layouts that keep the bitstream and the integer output unchanged: a folded channel relabeling, a data-free skew and both combined (Section III); (iii) pre-registered board runs of all three on four images, with every layer's cycles predicted, exactly in 176 of 180 (V-A); (iv) two pre-registered ten-network studies (V-B) and the board network on 79 images (V-C).</w:t>
+      </w:r>
+    </w:p>
+    <w:p>
+      <w:pPr>
+        <w:keepNext/>
+        <w:spacing w:line="240" w:lineRule="auto"/>
+        <w:ind w:firstLine="0"/>
+        <w:jc w:val="center"/>
+      </w:pPr>
+      <w:r>
+        <w:drawing>
+          <wp:inline xmlns:a="http://schemas.openxmlformats.org/drawingml/2006/main" xmlns:pic="http://schemas.openxmlformats.org/drawingml/2006/picture">
+            <wp:extent cx="2880000" cy="1440000"/>
+            <wp:docPr id="1" name="Picture 1"/>
+            <wp:cNvGraphicFramePr>
+              <a:graphicFrameLocks noChangeAspect="1"/>
+            </wp:cNvGraphicFramePr>
+            <a:graphic>
+              <a:graphicData uri="http://schemas.openxmlformats.org/drawingml/2006/picture">
+                <pic:pic>
+                  <pic:nvPicPr>
+                    <pic:cNvPr id="0" name="fig_system.png"/>
+                    <pic:cNvPicPr/>
+                  </pic:nvPicPr>
+                  <pic:blipFill>
+                    <a:blip r:embed="rId8"/>
+                    <a:stretch>
+                      <a:fillRect/>
+                    </a:stretch>
+                  </pic:blipFill>
+                  <pic:spPr>
+                    <a:xfrm>
+                      <a:off x="0" y="0"/>
+                      <a:ext cx="2880000" cy="1440000"/>
+                    </a:xfrm>
+                    <a:prstGeom prst="rect"/>
+                  </pic:spPr>
+                </pic:pic>
+              </a:graphicData>
+            </a:graphic>
+          </wp:inline>
+        </w:drawing>
+      </w:r>
+    </w:p>
+    <w:p>
+      <w:pPr>
+        <w:pStyle w:val="figurecaption"/>
+        <w:numPr>
+          <w:ilvl w:val="0"/>
+          <w:numId w:val="0"/>
+        </w:numPr>
+      </w:pPr>
+      <w:r>
+        <w:t xml:space="preserve">Fig. 1. The system and where the layouts act. The host builds each layer's windows, and the slot it gives a tap decides the tap's bank; the core's four banks skip zeros but advance in lockstep, so a window costs the fullest bank's m (1); for 32 outputs, </w:t>
+      </w:r>
+      <w:r>
+        <w:rPr>
+          <w:rFonts w:ascii="Cambria Math" w:hAnsi="Cambria Math"/>
+        </w:rPr>
+        <w:t>⌈</w:t>
+      </w:r>
+      <w:r>
+        <w:t>COUT/P</w:t>
+      </w:r>
+      <w:r>
+        <w:rPr>
+          <w:rFonts w:ascii="Cambria Math" w:hAnsi="Cambria Math"/>
+        </w:rPr>
+        <w:t>⌉</w:t>
+      </w:r>
+      <w:r>
+        <w:t xml:space="preserve"> = 2. The relabeling is folded into the weights offline and the skew is the host's slot order, so the bitstream is the same for every layout. The window shown is a drawn example.</w:t>
       </w:r>
     </w:p>
     <w:p>
@@ -417,7 +489,7 @@
         <w:pStyle w:val="a3"/>
       </w:pPr>
       <w:r>
-        <w:t>In (ky, kx, channel) order, tap s·N + p (s the 3×3 position, p the channel, N the input channels) is in bank p mod 4 when 4 divides N: in this conventional order, L0 or the Original, each bank holds N/4 whole channels (Fig. 1a).</w:t>
+        <w:t>In (ky, kx, channel) order, tap s·N + p (s the 3×3 position, p the channel, N the input channels) is in bank p mod 4 when 4 divides N: in this conventional order, L0 or the Original, each bank holds N/4 whole channels (Fig. 2a).</w:t>
       </w:r>
     </w:p>
     <w:p>
@@ -431,7 +503,7 @@
         <w:t>Relabeling (L1).</w:t>
       </w:r>
       <w:r>
-        <w:t xml:space="preserve"> Let π map a position p of a hidden map to its original channel. The producer computes its output channels in the order π, with weight rows, biases and requantization scales reordered, and the consumer's weight column for tap s·N + p comes from channel π(p). As ReLU and requantization act per channel and the consumer adds the same INT32 products, the integer output is identical for every input, while π decides which channels share a bank (Fig. 1b). We permute the outputs of conv1 to conv(L−2) of an L-layer network; the last layer, which can never pay, keeps its input. In the maxout and averaging networks (maximum or mean of maps j and j + N), both maps move with π.</w:t>
+        <w:t xml:space="preserve"> Let π map a position p of a hidden map to its original channel. The producer computes its output channels in the order π, with weight rows, biases and requantization scales reordered, and the consumer's weight column for tap s·N + p comes from channel π(p). As ReLU and requantization act per channel and the consumer adds the same INT32 products, the integer output is identical for every input, while π decides which channels share a bank (Fig. 2b). We permute the outputs of conv1 to conv(L−2) of an L-layer network; the last layer, which can never pay, keeps its input. In the maxout and averaging networks (maximum or mean of maps j and j + N), both maps move with π.</w:t>
       </w:r>
     </w:p>
     <w:p>
@@ -445,7 +517,7 @@
         <w:t>Skew (L2).</w:t>
       </w:r>
       <w:r>
-        <w:t xml:space="preserve"> Skewed storage [7] applied to the taps: the host puts channel p of position s in slot s·N + (p + s) mod N when 4 divides N, bank (p + s) mod 4, which spreads each channel's nine taps 3/2/2/2 over the banks (Fig. 1c). It permutes each window's taps and the consumer's weight columns alike and needs no data and no RTL change; no partial sum, in any order, exceeds |bias| + K·127·128 &lt; 2³¹, so the INT32 result is unchanged.</w:t>
+        <w:t xml:space="preserve"> Skewed storage [7] applied to the taps: the host puts channel p of position s in slot s·N + (p + s) mod N when 4 divides N, bank (p + s) mod 4, which spreads each channel's nine taps 3/2/2/2 over the banks (Fig. 2c). It permutes each window's taps and the consumer's weight columns alike and needs no data and no RTL change; no partial sum, in any order, exceeds |bias| + K·127·128 &lt; 2³¹, so the INT32 result is unchanged.</w:t>
       </w:r>
     </w:p>
     <w:p>
@@ -459,7 +531,7 @@
         <w:t>Skew + relabeling (L3).</w:t>
       </w:r>
       <w:r>
-        <w:t xml:space="preserve"> Under the skew, bank b holds at position s the channels of class (b − s) mod 4 (class: p mod 4): class b at positions 0, 4 and 8, each other class at two. The skew thus dilutes a class's excess of nonzeros without removing it, and which channels form a class is still free: L3 refits the relabeling under this rule, starting from L2, then skews (Fig. 1d).</w:t>
+        <w:t xml:space="preserve"> Under the skew, bank b holds at position s the channels of class (b − s) mod 4 (class: p mod 4): class b at positions 0, 4 and 8, each other class at two. The skew thus dilutes a class's excess of nonzeros without removing it, and which channels form a class is still free: L3 refits the relabeling under this rule, starting from L2, then skews (Fig. 2d).</w:t>
       </w:r>
     </w:p>
     <w:p>
@@ -487,11 +559,12 @@
         <w:t>Function preserved.</w:t>
       </w:r>
       <w:r>
-        <w:t xml:space="preserve"> In host emulation every folded L1 reproduced the original's output on Set12 05.png and BSD68 test001.png (Frozen and Multi-start: all 80 images); on 05.png, L2 and L3 reproduced every network's INT32 accumulators in every window (L3 up to its column order) and the folded L3 the output; the board driver's skew path gave identical accumulators and PNGs on both images.</w:t>
-      </w:r>
-    </w:p>
-    <w:p>
-      <w:pPr>
+        <w:t xml:space="preserve"> In host emulation every layout reproduced the original's output (Frozen and Multi-start on all 80 images), and L2 and L3 every network's INT32 accumulators in every window of a test image; on the board every layer's output matched the integer model.</w:t>
+      </w:r>
+    </w:p>
+    <w:p>
+      <w:pPr>
+        <w:keepNext/>
         <w:spacing w:line="240" w:lineRule="auto"/>
         <w:ind w:firstLine="0"/>
         <w:jc w:val="center"/>
@@ -500,7 +573,7 @@
         <w:drawing>
           <wp:inline xmlns:a="http://schemas.openxmlformats.org/drawingml/2006/main" xmlns:pic="http://schemas.openxmlformats.org/drawingml/2006/picture">
             <wp:extent cx="2880000" cy="3026441"/>
-            <wp:docPr id="1" name="Picture 1"/>
+            <wp:docPr id="2" name="Picture 2"/>
             <wp:cNvGraphicFramePr>
               <a:graphicFrameLocks noChangeAspect="1"/>
             </wp:cNvGraphicFramePr>
@@ -512,7 +585,7 @@
                     <pic:cNvPicPr/>
                   </pic:nvPicPr>
                   <pic:blipFill>
-                    <a:blip r:embed="rId8"/>
+                    <a:blip r:embed="rId9"/>
                     <a:stretch>
                       <a:fillRect/>
                     </a:stretch>
@@ -540,7 +613,7 @@
         </w:numPr>
       </w:pPr>
       <w:r>
-        <w:t>Fig. 1. A conv5 input window of the board network on Set12 05.png (the first compute-bound one at W = 4 with the median m, 48). Filled: nonzero, colored by bank (bank 1 dotted). (a) L0, bank p mod 4; (b) Frozen, an L1; (c) L2, bank (p + s) mod 4; (d) L3, bank (class + s) mod 4. Bars: nonzeros per bank; the fullest, m, costs 2m cycles; dashed: m = 36.5, where 2m equals the load of 73 cycles. Here L3 ties L2; over all of conv5's windows the mean m is 47.6, 42.1, 40.4 and 39.7.</w:t>
+        <w:t>Fig. 2. A conv5 input window of the board network on Set12 05.png (the first compute-bound one at W = 4 with the median m, 48). Filled: nonzero, colored by bank (bank 1 dotted). (a) L0, bank p mod 4; (b) Frozen, an L1; (c) L2, bank (p + s) mod 4; (d) L3, bank (class + s) mod 4. Bars: nonzeros per bank; the fullest, m, costs 2m cycles; dashed: m = 36.5, where 2m equals the load of 73 cycles. Here L3 ties L2; over all of conv5's windows the mean m is 47.6, 42.1, 40.4 and 39.7.</w:t>
       </w:r>
     </w:p>
     <w:p>
@@ -562,7 +635,7 @@
         <w:t>Networks and images.</w:t>
       </w:r>
       <w:r>
-        <w:t xml:space="preserve"> Ten trained integer DnCNN-style networks [8] for Gaussian noise of σ = 25 on 7-bit inputs: A, 7 layers of 32 channels; B, 10 layers of 64 channels behind a 2×2 space-to-depth input; B-32, the same with 32 channels, with ReLU (R1–R3, training seeds s1–s3), maxout over pairs of 64 computed outputs (M1–M3, seeds s1–s3) or their mean (Av2, seed s2); and 45, the same with 45 channels and ReLU. All but A had quantization-aware training. The board network, B-32 ReLU s1 (R1), reaches 29.54 dB on Set12 05.png; 37–55% of its hidden layers' window values are nonzero. Test images: Set12 [8] and BSD68 [9], 80 images, one noise draw each; savings are pooled over the 79 other than Set12 01.png, with paired bootstrap 95% intervals over images.</w:t>
+        <w:t xml:space="preserve"> Ten trained integer DnCNN-style networks [8] for Gaussian noise of σ = 25 on 7-bit inputs: A, 7 layers of 32 channels; B, 10 layers of 64 channels behind a 2×2 space-to-depth input; B-32, the same with 32 channels, with ReLU (R1–R3, training seeds s1–s3), maxout over pairs of 64 computed outputs (M1–M3, seeds s1–s3) or their mean (Av2, seed s2); and 45, the same with 45 channels and ReLU. All but A had quantization-aware training. The board network, B-32 ReLU s1 (R1), reaches 29.54 dB on Set12 05.png; 37–55% of its hidden layers' window values are nonzero. Test images: Set12 [8] and BSD68 [9], 80 images, one noise draw each; savings are pooled over the 79 other than Set12 01.png, with paired bootstrap 95% intervals over images. Two protocols fixed the recipes, evaluations and hypotheses before the fits and counts they concern.</w:t>
       </w:r>
     </w:p>
     <w:p>
@@ -576,21 +649,7 @@
         <w:t>Board.</w:t>
       </w:r>
       <w:r>
-        <w:t xml:space="preserve"> The W = 4 bitstream for the XC7Z020 closes timing at 100 MHz (worst slack +0.130 ns), uses 11,151 LUTs (21%), 71 of 140 BRAM36-equivalent tiles and no DSP slice, and ran at the board preset's 50 MHz. One bitstream ran all layouts; per layer the driver checks the output against the integer model and reads the cycle counter CYCLES and the DMA-wait counter IN_STALL. In the pre-registered runs, L0, Frozen, Multi-start, L2 and L3 ran once each on Set12 05–08. Earlier, L0, Frozen and Multi-start had run up to three times each, in alternation, on Set12 04–12 (05 after an L0 canary; dates not recorded); apart from 05.png, whose totals the prediction code had to reproduce, these runs were not used by any prediction. All other cycle numbers are counts in the host emulation, which reproduces every network's reference PSNR on all 80 images.</w:t>
-      </w:r>
-    </w:p>
-    <w:p>
-      <w:pPr>
-        <w:pStyle w:val="a3"/>
-      </w:pPr>
-      <w:r>
-        <w:rPr>
-          <w:b/>
-        </w:rPr>
-        <w:t>What was fixed when</w:t>
-      </w:r>
-      <w:r>
-        <w:t xml:space="preserve"> (commits; push times in bankperm/README.md). The fill-and-drain rule (6dc0e60) preceded both exports. PROTOCOL (c2299e2) fixed the recipe, the evaluation, condition (2) per layer and hypotheses H0–H3 before any fit on the other nine networks; PROTOCOL_2 (951c8f1) fixed L2, L3, the bootstrap and H4–H6 before the L3 fit and the study's counts (earlier ones: Sec. VI); the cycles of every layer of its board runs, and of the L3 runs its addendum (d6521ec) added after its counts, were committed before them (7312a84, 0887924), conv1's from its measured constant.</w:t>
+        <w:t xml:space="preserve"> The W = 4 bitstream for the XC7Z020 closes timing at 100 MHz (worst slack +0.130 ns), uses 11,151 LUTs (21%), 71 of 140 BRAM36-equivalent tiles and no DSP slice, and ran at the board preset's 50 MHz. One bitstream ran all layouts; per layer the driver checks the output against the integer model and reads the cycle counter CYCLES and the DMA-wait counter IN_STALL. Every layout ran once on Set12 05–08, with every layer's cycles predicted beforehand; L0, Frozen and Multi-start had also run earlier, and of those runs only the 05.png totals were used, to check the prediction code. All other cycle numbers are counts in the host emulation, which reproduces every network's reference PSNR on all 80 images.</w:t>
       </w:r>
     </w:p>
     <w:p>
@@ -1146,7 +1205,7 @@
         <w:spacing w:before="120"/>
       </w:pPr>
       <w:r>
-        <w:t>On all four images the board gave L3 &lt; L2 &lt; Multi-start &lt; Frozen &lt; L0 in cycles, as predicted (Table I); pooled over the four images, L2 saved 8.13% and L3 8.80%. No run had an output mismatch, and in 176 of the 180 predicted layers (conv2–conv10) CYCLES − IN_STALL, the pre-registered test, equaled the prediction. The other four, all in conv8, were one cycle over with IN_STALL = 0; after the runs we found them to be exactly the conv2–conv9 layers whose last window computes 30 cycles (all others: 32–56), a case absent from the 05.png runs the fill-and-drain rule was read off, and left the rule unchanged. All layers on 06–08 are out of sample, as are L2's and L3's conv2–conv9 on 05 (147 of these 151 exact); L2 and L3 had never run on the board before. The L0, Frozen and Multi-start runs repeat the earlier ones (Sec. IV) in CYCLES − IN_STALL to the cycle. This bitstream's IN_STALL misses DMA starvation at window boundaries; the rule could absorb a stall common to all layouts, so the match excludes only stalls that differ between them.</w:t>
+        <w:t>On all four images the board gave L3 &lt; L2 &lt; Multi-start &lt; Frozen &lt; L0 in cycles, as predicted (Table I); pooled over the four images, L2 saved 8.13% and L3 8.80%. In 176 of the 180 predicted layers (conv2–conv10) CYCLES − IN_STALL equaled the prediction. The other four, all in conv8, were one cycle over; after the runs we found them to be exactly the layers whose last window computes 30 cycles, a case absent from the runs the fill-and-drain rule was read off. L2 and L3 had never run on the board before, and 71 of their 72 layers were exact. This bitstream's IN_STALL misses DMA starvation at window boundaries; the rule could absorb a stall common to all layouts, so the match excludes only stalls that differ between them.</w:t>
       </w:r>
     </w:p>
     <w:p>
@@ -1162,7 +1221,7 @@
         <w:pStyle w:val="a3"/>
       </w:pPr>
       <w:r>
-        <w:t>PROTOCOL's two checks and two sign predictions all held. H0: our code reproduced Frozen and its export byte for byte. H1: wherever (2) holds, at W = 1 on all networks and at W = 2 on A and R1–R3, the relabeled count equaled the original on all 80 images. H2, H3: the pooled saving of L1 was positive on all ten networks at W = 4, 1.09–10.80% (Fig. 2; the sign was known for B, M1 and R1), and on all six where (2) allows it at W = 2, 3.36–7.37% on five and 0.022% on 45.</w:t>
+        <w:t>The first protocol's hypotheses all held. H1: wherever (2) holds, at W = 1 on all networks and at W = 2 on A and R1–R3, the relabeled count equaled the original on all 80 images. H2, H3: the pooled saving of L1 was positive on all ten networks at W = 4, 1.09–10.80% (Fig. 3; the sign was known for B, M1 and R1), and on all six where (2) allows it at W = 2, 3.36–7.37% on five and 0.022% on 45.</w:t>
       </w:r>
     </w:p>
     <w:p>
@@ -1170,11 +1229,12 @@
         <w:pStyle w:val="a3"/>
       </w:pPr>
       <w:r>
-        <w:t>PROTOCOL_2's three hypotheses also held. H4: wherever (2) holds, L2 and L3 counted exactly as L0 on all 80 images, in every layer. H5: at W = 4, L2 saved more than L1 on all nine networks with N mod 4 = 0, by 0.90–2.36 points (known for R1). H6: L3 saved more than L2 on all nine, by 0.48–1.18 points, on R1 by 0.73 (95% interval [0.70, 0.75]; seven images had shown it, Sec. VI). Not pre-registered: L3 was fitted on 01.png alone, so the gain is out of sample, and it is consistent: on each of the nine networks the interval of L3 − L2 excludes 0; L3 counted fewer cycles than L2 on all 711 image–network pairs and, pooled, in all 69 fitted layers; at W = 2, L3 &gt; L2 &gt; L1 held on the five networks with N mod 4 = 0 where (2) allows a gain, L3 by 0.46–0.85 points over L2. No image counted more cycles under any layout at any W.</w:t>
-      </w:r>
-    </w:p>
-    <w:p>
-      <w:pPr>
+        <w:t>The second protocol's three also held. H4: wherever (2) holds, L2 and L3 counted exactly as L0 on all 80 images, in every layer. H5: at W = 4, L2 saved more than L1 on all nine networks with N mod 4 = 0, by 0.90–2.36 points (known for R1). H6: L3 saved more than L2 on all nine, by 0.48–1.18 points, on R1 by 0.73 (95% interval [0.70, 0.75]). Not pre-registered: L3 was fitted on 01.png alone, so the gain is out of sample, and it is consistent: on each of the nine networks the interval of L3 − L2 excludes 0; L3 counted fewer cycles than L2 on all 711 image–network pairs and, pooled, in all 69 fitted layers; at W = 2, L3 &gt; L2 &gt; L1 held on the five networks with N mod 4 = 0 where (2) allows a gain, L3 by 0.46–0.85 points over L2. No image counted more cycles under any layout at any W.</w:t>
+      </w:r>
+    </w:p>
+    <w:p>
+      <w:pPr>
+        <w:keepNext/>
         <w:spacing w:line="240" w:lineRule="auto"/>
         <w:ind w:firstLine="0"/>
         <w:jc w:val="center"/>
@@ -1183,7 +1243,7 @@
         <w:drawing>
           <wp:inline xmlns:a="http://schemas.openxmlformats.org/drawingml/2006/main" xmlns:pic="http://schemas.openxmlformats.org/drawingml/2006/picture">
             <wp:extent cx="2880000" cy="1800000"/>
-            <wp:docPr id="2" name="Picture 2"/>
+            <wp:docPr id="3" name="Picture 3"/>
             <wp:cNvGraphicFramePr>
               <a:graphicFrameLocks noChangeAspect="1"/>
             </wp:cNvGraphicFramePr>
@@ -1195,7 +1255,7 @@
                     <pic:cNvPicPr/>
                   </pic:nvPicPr>
                   <pic:blipFill>
-                    <a:blip r:embed="rId9"/>
+                    <a:blip r:embed="rId10"/>
                     <a:stretch>
                       <a:fillRect/>
                     </a:stretch>
@@ -1223,7 +1283,7 @@
         </w:numPr>
       </w:pPr>
       <w:r>
-        <w:t>Fig. 2. Pooled saving over the 79 images (count, conv1–convL) at W = 4 (top) and W = 2 (bottom) of L1 (relabeling), L2 (skew) and L3 (skew + relabeling); 95% intervals (at most ±0.39 points) are narrower than the markers. ×: (2) holds in every layer; all layouts count as L0 on all 80 images. On 45 (N mod 4 = 1), L0 already has bank (s + p) mod 4, so L2 = L0 and L3 = L1. Networks: Sec. IV (R1: board network).</w:t>
+        <w:t>Fig. 3. Pooled saving over the 79 images (count, conv1–convL) at W = 4 (top) and W = 2 (bottom) of L1 (relabeling), L2 (skew) and L3 (skew + relabeling); 95% intervals (at most ±0.39 points) are narrower than the markers. ×: (2) holds in every layer; all layouts count as L0 on all 80 images. On 45 (N mod 4 = 1), L0 already has bank (s + p) mod 4, so L2 = L0 and L3 = L1. Networks: Sec. IV (R1: board network).</w:t>
       </w:r>
     </w:p>
     <w:p>
@@ -1239,11 +1299,12 @@
         <w:pStyle w:val="a3"/>
       </w:pPr>
       <w:r>
-        <w:t>At W = 4, L2 saved more than both board relabelings, and L3 more than L2, on each of the 79 images (Fig. 3). L3 removed 26% of the imbalance that L2 leaves, reaching 82.6% of the perfect-balance saving against 76.6% (Table II), with the same host reorder as L2. Pooled, L2 also beat L1 fitted on each test image (8.45%) and a Sense-like sort by each channel's nonzero count in it; a density deal after SparTen [4] saved least (a comparison of procedures, not of co-activation against density).</w:t>
-      </w:r>
-    </w:p>
-    <w:p>
-      <w:pPr>
+        <w:t>At W = 4, L2 saved more than both board relabelings, and L3 more than L2, on each of the 79 images (Fig. 4). L3 removed 26% of the imbalance that L2 leaves, reaching 82.6% of the perfect-balance saving against 76.6% (Table II), with the same host reorder as L2. Pooled, L2 also beat L1 fitted on each test image (8.45%) and a Sense-like sort by each channel's nonzero count in it; a density deal after SparTen [4] saved least (a comparison of procedures, not of co-activation against density).</w:t>
+      </w:r>
+    </w:p>
+    <w:p>
+      <w:pPr>
+        <w:keepNext/>
         <w:spacing w:line="240" w:lineRule="auto"/>
         <w:ind w:firstLine="0"/>
         <w:jc w:val="center"/>
@@ -1252,7 +1313,7 @@
         <w:drawing>
           <wp:inline xmlns:a="http://schemas.openxmlformats.org/drawingml/2006/main" xmlns:pic="http://schemas.openxmlformats.org/drawingml/2006/picture">
             <wp:extent cx="2880000" cy="1836610"/>
-            <wp:docPr id="3" name="Picture 3"/>
+            <wp:docPr id="4" name="Picture 4"/>
             <wp:cNvGraphicFramePr>
               <a:graphicFrameLocks noChangeAspect="1"/>
             </wp:cNvGraphicFramePr>
@@ -1264,7 +1325,7 @@
                     <pic:cNvPicPr/>
                   </pic:nvPicPr>
                   <pic:blipFill>
-                    <a:blip r:embed="rId10"/>
+                    <a:blip r:embed="rId11"/>
                     <a:stretch>
                       <a:fillRect/>
                     </a:stretch>
@@ -1292,7 +1353,7 @@
         </w:numPr>
       </w:pPr>
       <w:r>
-        <w:t>Fig. 3. Per-image W = 4 saving (count) of the board network on the 79 images other than Set12 01.png (calibration of Frozen and L3; Multi-start also used 02–03), sorted by the bound; legend: pooled saving; dotted: Set12 05.png.</w:t>
+        <w:t>Fig. 4. Per-image W = 4 saving (count) of the board network on the 79 images other than Set12 01.png (calibration of Frozen and L3; Multi-start also used 02–03), sorted by the bound; legend: pooled saving; dotted: Set12 05.png.</w:t>
       </w:r>
     </w:p>
     <w:p>
@@ -1906,7 +1967,7 @@
         <w:t>Board evidence.</w:t>
       </w:r>
       <w:r>
-        <w:t xml:space="preserve"> One network, four images, one run each; by board time the earlier runs on 06–08 (Sec. IV) preceded the pre-registered ones, and the prediction files wrongly list them as never run.</w:t>
+        <w:t xml:space="preserve"> One network, four images, one run each; L0, Frozen and Multi-start had run on these images before.</w:t>
       </w:r>
     </w:p>
     <w:p>
@@ -1924,7 +1985,7 @@
         <w:t>Scope and selection.</w:t>
       </w:r>
       <w:r>
-        <w:t xml:space="preserve"> Only DnCNN-family denoisers at σ = 25, one noise draw per image and one fit per layout (the intervals resample images only); BSD68 was part of the networks' development; FIFO-decoupled banks and other P, T or kernel sizes were not evaluated. Multi-start was chosen for the board after its BSD68 counts had been seen. Before PROTOCOL_2, L2 had been counted on R1 (and on 05.png of four others), and uncommitted counts of L2 on eight images of B and M1 and of L3 on seven of R1 had been seen (PROTOCOL_2 lists them).</w:t>
+        <w:t xml:space="preserve"> Only DnCNN-family denoisers at σ = 25, one noise draw per image and one fit per layout (the intervals resample images only); BSD68 was part of the networks' development; FIFO-decoupled banks and other P, T or kernel sizes were not evaluated. Multi-start was chosen for the board after its BSD68 counts had been seen, and some L2 and L3 counts had been seen before the second protocol was fixed.</w:t>
       </w:r>
     </w:p>
     <w:p>
@@ -1940,7 +2001,7 @@
         <w:pStyle w:val="a3"/>
       </w:pPr>
       <w:r>
-        <w:t>The layer shapes tell where the tap-to-bank layout of a lockstep zero-skipping core can matter. Where it can, in counts over 79 images, the data-free skew removed more bank imbalance than a fitted relabeling on all nine networks with N mod 4 = 0, and a relabeling fitted under the skew removed more than the skew on every test image and, pooled, in every fitted layer. On the board the same order held on all four images, and the cycles of 71 of the 72 layers of the never-run L2 and L3 were predicted exactly. Skew and relabeling only partly add (under the skew the relabeling gains 0.48–1.18 points, alone 3.50–10.80%): the skew spreads each channel over the banks, the relabeling still chooses which channels share one. Scripts, layouts, per-image counts and every number's source: https://github.com/qewr1234/FPGA (bankperm/).</w:t>
+        <w:t>The layer shapes tell where the tap-to-bank layout of a lockstep zero-skipping core can matter. Where it can, in counts over 79 images, the data-free skew removed more bank imbalance than a fitted relabeling on all nine networks with N mod 4 = 0, and a relabeling fitted under the skew removed more than the skew on every test image and, pooled, in every fitted layer. On the board the same order held on all four images, and the cycles of 71 of the 72 layers of the never-run L2 and L3 were predicted exactly. Skew and relabeling only partly add (under the skew the relabeling gains 0.48–1.18 points, alone 3.50–10.80%): the skew spreads each channel over the banks, the relabeling still chooses which channels share one. Code and data: https://github.com/qewr1234/FPGA.</w:t>
       </w:r>
     </w:p>
     <w:p>

</xml_diff>

<commit_message>
build_docx: drop the keep-with-next and cantSplit settings
The author's Word closed on opening the build that first had keep-with-next
on picture paragraphs (on top of keep-with-next table rows and cantSplit).
The cause is not confirmed, but these are the only new constructs; the
placement of Table I and the figures already keeps them whole in the
LibreOffice layout, which is unchanged without them.

Co-Authored-By: Claude Opus 5.5 <noreply@anthropic.com>
Claude-Session: https://claude.ai/code/session_01KmQd2ww7ZkypMsRjhWuU5X
</commit_message>
<xml_diff>
--- a/bankperm/PAPER_EN.docx
+++ b/bankperm/PAPER_EN.docx
@@ -174,7 +174,6 @@
     </w:p>
     <w:p>
       <w:pPr>
-        <w:keepNext/>
         <w:spacing w:line="240" w:lineRule="auto"/>
         <w:ind w:firstLine="0"/>
         <w:jc w:val="center"/>
@@ -564,7 +563,6 @@
     </w:p>
     <w:p>
       <w:pPr>
-        <w:keepNext/>
         <w:spacing w:line="240" w:lineRule="auto"/>
         <w:ind w:firstLine="0"/>
         <w:jc w:val="center"/>
@@ -671,7 +669,6 @@
     <w:p>
       <w:pPr>
         <w:pStyle w:val="tablehead"/>
-        <w:keepNext/>
         <w:numPr>
           <w:ilvl w:val="0"/>
           <w:numId w:val="0"/>
@@ -700,9 +697,6 @@
         <w:gridCol w:w="772"/>
       </w:tblGrid>
       <w:tr>
-        <w:trPr>
-          <w:cantSplit/>
-        </w:trPr>
         <w:tc>
           <w:tcPr>
             <w:tcW w:type="dxa" w:w="1673"/>
@@ -710,7 +704,6 @@
           <w:p>
             <w:pPr>
               <w:pStyle w:val="tablecolhead"/>
-              <w:keepNext/>
               <w:spacing w:before="20" w:after="20"/>
             </w:pPr>
             <w:r>
@@ -725,7 +718,6 @@
           <w:p>
             <w:pPr>
               <w:pStyle w:val="tablecolhead"/>
-              <w:keepNext/>
               <w:spacing w:before="20" w:after="20"/>
               <w:jc w:val="center"/>
             </w:pPr>
@@ -741,7 +733,6 @@
           <w:p>
             <w:pPr>
               <w:pStyle w:val="tablecolhead"/>
-              <w:keepNext/>
               <w:spacing w:before="20" w:after="20"/>
               <w:jc w:val="center"/>
             </w:pPr>
@@ -757,7 +748,6 @@
           <w:p>
             <w:pPr>
               <w:pStyle w:val="tablecolhead"/>
-              <w:keepNext/>
               <w:spacing w:before="20" w:after="20"/>
               <w:jc w:val="center"/>
             </w:pPr>
@@ -773,7 +763,6 @@
           <w:p>
             <w:pPr>
               <w:pStyle w:val="tablecolhead"/>
-              <w:keepNext/>
               <w:spacing w:before="20" w:after="20"/>
               <w:jc w:val="center"/>
             </w:pPr>
@@ -784,9 +773,6 @@
         </w:tc>
       </w:tr>
       <w:tr>
-        <w:trPr>
-          <w:cantSplit/>
-        </w:trPr>
         <w:tc>
           <w:tcPr>
             <w:tcW w:type="dxa" w:w="1673"/>
@@ -794,7 +780,6 @@
           <w:p>
             <w:pPr>
               <w:pStyle w:val="tablecopy"/>
-              <w:keepNext/>
               <w:spacing w:before="20" w:after="20"/>
             </w:pPr>
             <w:r>
@@ -809,7 +794,6 @@
           <w:p>
             <w:pPr>
               <w:pStyle w:val="tablecopy"/>
-              <w:keepNext/>
               <w:spacing w:before="20" w:after="20"/>
               <w:jc w:val="center"/>
             </w:pPr>
@@ -825,7 +809,6 @@
           <w:p>
             <w:pPr>
               <w:pStyle w:val="tablecopy"/>
-              <w:keepNext/>
               <w:spacing w:before="20" w:after="20"/>
               <w:jc w:val="center"/>
             </w:pPr>
@@ -841,7 +824,6 @@
           <w:p>
             <w:pPr>
               <w:pStyle w:val="tablecopy"/>
-              <w:keepNext/>
               <w:spacing w:before="20" w:after="20"/>
               <w:jc w:val="center"/>
             </w:pPr>
@@ -857,7 +839,6 @@
           <w:p>
             <w:pPr>
               <w:pStyle w:val="tablecopy"/>
-              <w:keepNext/>
               <w:spacing w:before="20" w:after="20"/>
               <w:jc w:val="center"/>
             </w:pPr>
@@ -868,9 +849,6 @@
         </w:tc>
       </w:tr>
       <w:tr>
-        <w:trPr>
-          <w:cantSplit/>
-        </w:trPr>
         <w:tc>
           <w:tcPr>
             <w:tcW w:type="dxa" w:w="1673"/>
@@ -878,7 +856,6 @@
           <w:p>
             <w:pPr>
               <w:pStyle w:val="tablecopy"/>
-              <w:keepNext/>
               <w:spacing w:before="20" w:after="20"/>
             </w:pPr>
             <w:r>
@@ -893,7 +870,6 @@
           <w:p>
             <w:pPr>
               <w:pStyle w:val="tablecopy"/>
-              <w:keepNext/>
               <w:spacing w:before="20" w:after="20"/>
               <w:jc w:val="center"/>
             </w:pPr>
@@ -909,7 +885,6 @@
           <w:p>
             <w:pPr>
               <w:pStyle w:val="tablecopy"/>
-              <w:keepNext/>
               <w:spacing w:before="20" w:after="20"/>
               <w:jc w:val="center"/>
             </w:pPr>
@@ -925,7 +900,6 @@
           <w:p>
             <w:pPr>
               <w:pStyle w:val="tablecopy"/>
-              <w:keepNext/>
               <w:spacing w:before="20" w:after="20"/>
               <w:jc w:val="center"/>
             </w:pPr>
@@ -941,7 +915,6 @@
           <w:p>
             <w:pPr>
               <w:pStyle w:val="tablecopy"/>
-              <w:keepNext/>
               <w:spacing w:before="20" w:after="20"/>
               <w:jc w:val="center"/>
             </w:pPr>
@@ -952,9 +925,6 @@
         </w:tc>
       </w:tr>
       <w:tr>
-        <w:trPr>
-          <w:cantSplit/>
-        </w:trPr>
         <w:tc>
           <w:tcPr>
             <w:tcW w:type="dxa" w:w="1673"/>
@@ -962,7 +932,6 @@
           <w:p>
             <w:pPr>
               <w:pStyle w:val="tablecopy"/>
-              <w:keepNext/>
               <w:spacing w:before="20" w:after="20"/>
             </w:pPr>
             <w:r>
@@ -977,7 +946,6 @@
           <w:p>
             <w:pPr>
               <w:pStyle w:val="tablecopy"/>
-              <w:keepNext/>
               <w:spacing w:before="20" w:after="20"/>
               <w:jc w:val="center"/>
             </w:pPr>
@@ -993,7 +961,6 @@
           <w:p>
             <w:pPr>
               <w:pStyle w:val="tablecopy"/>
-              <w:keepNext/>
               <w:spacing w:before="20" w:after="20"/>
               <w:jc w:val="center"/>
             </w:pPr>
@@ -1009,7 +976,6 @@
           <w:p>
             <w:pPr>
               <w:pStyle w:val="tablecopy"/>
-              <w:keepNext/>
               <w:spacing w:before="20" w:after="20"/>
               <w:jc w:val="center"/>
             </w:pPr>
@@ -1025,7 +991,6 @@
           <w:p>
             <w:pPr>
               <w:pStyle w:val="tablecopy"/>
-              <w:keepNext/>
               <w:spacing w:before="20" w:after="20"/>
               <w:jc w:val="center"/>
             </w:pPr>
@@ -1036,9 +1001,6 @@
         </w:tc>
       </w:tr>
       <w:tr>
-        <w:trPr>
-          <w:cantSplit/>
-        </w:trPr>
         <w:tc>
           <w:tcPr>
             <w:tcW w:type="dxa" w:w="1673"/>
@@ -1046,7 +1008,6 @@
           <w:p>
             <w:pPr>
               <w:pStyle w:val="tablecopy"/>
-              <w:keepNext/>
               <w:spacing w:before="20" w:after="20"/>
             </w:pPr>
             <w:r>
@@ -1061,7 +1022,6 @@
           <w:p>
             <w:pPr>
               <w:pStyle w:val="tablecopy"/>
-              <w:keepNext/>
               <w:spacing w:before="20" w:after="20"/>
               <w:jc w:val="center"/>
             </w:pPr>
@@ -1077,7 +1037,6 @@
           <w:p>
             <w:pPr>
               <w:pStyle w:val="tablecopy"/>
-              <w:keepNext/>
               <w:spacing w:before="20" w:after="20"/>
               <w:jc w:val="center"/>
             </w:pPr>
@@ -1093,7 +1052,6 @@
           <w:p>
             <w:pPr>
               <w:pStyle w:val="tablecopy"/>
-              <w:keepNext/>
               <w:spacing w:before="20" w:after="20"/>
               <w:jc w:val="center"/>
             </w:pPr>
@@ -1109,7 +1067,6 @@
           <w:p>
             <w:pPr>
               <w:pStyle w:val="tablecopy"/>
-              <w:keepNext/>
               <w:spacing w:before="20" w:after="20"/>
               <w:jc w:val="center"/>
             </w:pPr>
@@ -1120,9 +1077,6 @@
         </w:tc>
       </w:tr>
       <w:tr>
-        <w:trPr>
-          <w:cantSplit/>
-        </w:trPr>
         <w:tc>
           <w:tcPr>
             <w:tcW w:type="dxa" w:w="1673"/>
@@ -1234,7 +1188,6 @@
     </w:p>
     <w:p>
       <w:pPr>
-        <w:keepNext/>
         <w:spacing w:line="240" w:lineRule="auto"/>
         <w:ind w:firstLine="0"/>
         <w:jc w:val="center"/>
@@ -1304,7 +1257,6 @@
     </w:p>
     <w:p>
       <w:pPr>
-        <w:keepNext/>
         <w:spacing w:line="240" w:lineRule="auto"/>
         <w:ind w:firstLine="0"/>
         <w:jc w:val="center"/>
@@ -1359,7 +1311,6 @@
     <w:p>
       <w:pPr>
         <w:pStyle w:val="tablehead"/>
-        <w:keepNext/>
         <w:numPr>
           <w:ilvl w:val="0"/>
           <w:numId w:val="0"/>
@@ -1387,9 +1338,6 @@
         <w:gridCol w:w="700"/>
       </w:tblGrid>
       <w:tr>
-        <w:trPr>
-          <w:cantSplit/>
-        </w:trPr>
         <w:tc>
           <w:tcPr>
             <w:tcW w:type="dxa" w:w="1681"/>
@@ -1397,7 +1345,6 @@
           <w:p>
             <w:pPr>
               <w:pStyle w:val="tablecolhead"/>
-              <w:keepNext/>
               <w:spacing w:before="20" w:after="20"/>
             </w:pPr>
             <w:r>
@@ -1412,7 +1359,6 @@
           <w:p>
             <w:pPr>
               <w:pStyle w:val="tablecolhead"/>
-              <w:keepNext/>
               <w:spacing w:before="20" w:after="20"/>
               <w:jc w:val="center"/>
             </w:pPr>
@@ -1428,7 +1374,6 @@
           <w:p>
             <w:pPr>
               <w:pStyle w:val="tablecolhead"/>
-              <w:keepNext/>
               <w:spacing w:before="20" w:after="20"/>
               <w:jc w:val="center"/>
             </w:pPr>
@@ -1444,7 +1389,6 @@
           <w:p>
             <w:pPr>
               <w:pStyle w:val="tablecolhead"/>
-              <w:keepNext/>
               <w:spacing w:before="20" w:after="20"/>
               <w:jc w:val="center"/>
             </w:pPr>
@@ -1455,9 +1399,6 @@
         </w:tc>
       </w:tr>
       <w:tr>
-        <w:trPr>
-          <w:cantSplit/>
-        </w:trPr>
         <w:tc>
           <w:tcPr>
             <w:tcW w:type="dxa" w:w="1681"/>
@@ -1465,7 +1406,6 @@
           <w:p>
             <w:pPr>
               <w:pStyle w:val="tablecopy"/>
-              <w:keepNext/>
               <w:spacing w:before="20" w:after="20"/>
             </w:pPr>
             <w:r>
@@ -1480,7 +1420,6 @@
           <w:p>
             <w:pPr>
               <w:pStyle w:val="tablecopy"/>
-              <w:keepNext/>
               <w:spacing w:before="20" w:after="20"/>
               <w:jc w:val="center"/>
             </w:pPr>
@@ -1496,7 +1435,6 @@
           <w:p>
             <w:pPr>
               <w:pStyle w:val="tablecopy"/>
-              <w:keepNext/>
               <w:spacing w:before="20" w:after="20"/>
               <w:jc w:val="center"/>
             </w:pPr>
@@ -1512,7 +1450,6 @@
           <w:p>
             <w:pPr>
               <w:pStyle w:val="tablecopy"/>
-              <w:keepNext/>
               <w:spacing w:before="20" w:after="20"/>
               <w:jc w:val="center"/>
             </w:pPr>
@@ -1523,9 +1460,6 @@
         </w:tc>
       </w:tr>
       <w:tr>
-        <w:trPr>
-          <w:cantSplit/>
-        </w:trPr>
         <w:tc>
           <w:tcPr>
             <w:tcW w:type="dxa" w:w="1681"/>
@@ -1533,7 +1467,6 @@
           <w:p>
             <w:pPr>
               <w:pStyle w:val="tablecopy"/>
-              <w:keepNext/>
               <w:spacing w:before="20" w:after="20"/>
             </w:pPr>
             <w:r>
@@ -1548,7 +1481,6 @@
           <w:p>
             <w:pPr>
               <w:pStyle w:val="tablecopy"/>
-              <w:keepNext/>
               <w:spacing w:before="20" w:after="20"/>
               <w:jc w:val="center"/>
             </w:pPr>
@@ -1564,7 +1496,6 @@
           <w:p>
             <w:pPr>
               <w:pStyle w:val="tablecopy"/>
-              <w:keepNext/>
               <w:spacing w:before="20" w:after="20"/>
               <w:jc w:val="center"/>
             </w:pPr>
@@ -1580,7 +1511,6 @@
           <w:p>
             <w:pPr>
               <w:pStyle w:val="tablecopy"/>
-              <w:keepNext/>
               <w:spacing w:before="20" w:after="20"/>
               <w:jc w:val="center"/>
             </w:pPr>
@@ -1591,9 +1521,6 @@
         </w:tc>
       </w:tr>
       <w:tr>
-        <w:trPr>
-          <w:cantSplit/>
-        </w:trPr>
         <w:tc>
           <w:tcPr>
             <w:tcW w:type="dxa" w:w="1681"/>
@@ -1601,7 +1528,6 @@
           <w:p>
             <w:pPr>
               <w:pStyle w:val="tablecopy"/>
-              <w:keepNext/>
               <w:spacing w:before="20" w:after="20"/>
             </w:pPr>
             <w:r>
@@ -1616,7 +1542,6 @@
           <w:p>
             <w:pPr>
               <w:pStyle w:val="tablecopy"/>
-              <w:keepNext/>
               <w:spacing w:before="20" w:after="20"/>
               <w:jc w:val="center"/>
             </w:pPr>
@@ -1632,7 +1557,6 @@
           <w:p>
             <w:pPr>
               <w:pStyle w:val="tablecopy"/>
-              <w:keepNext/>
               <w:spacing w:before="20" w:after="20"/>
               <w:jc w:val="center"/>
             </w:pPr>
@@ -1648,7 +1572,6 @@
           <w:p>
             <w:pPr>
               <w:pStyle w:val="tablecopy"/>
-              <w:keepNext/>
               <w:spacing w:before="20" w:after="20"/>
               <w:jc w:val="center"/>
             </w:pPr>
@@ -1659,9 +1582,6 @@
         </w:tc>
       </w:tr>
       <w:tr>
-        <w:trPr>
-          <w:cantSplit/>
-        </w:trPr>
         <w:tc>
           <w:tcPr>
             <w:tcW w:type="dxa" w:w="1681"/>
@@ -1669,7 +1589,6 @@
           <w:p>
             <w:pPr>
               <w:pStyle w:val="tablecopy"/>
-              <w:keepNext/>
               <w:spacing w:before="20" w:after="20"/>
             </w:pPr>
             <w:r>
@@ -1684,7 +1603,6 @@
           <w:p>
             <w:pPr>
               <w:pStyle w:val="tablecopy"/>
-              <w:keepNext/>
               <w:spacing w:before="20" w:after="20"/>
               <w:jc w:val="center"/>
             </w:pPr>
@@ -1700,7 +1618,6 @@
           <w:p>
             <w:pPr>
               <w:pStyle w:val="tablecopy"/>
-              <w:keepNext/>
               <w:spacing w:before="20" w:after="20"/>
               <w:jc w:val="center"/>
             </w:pPr>
@@ -1716,7 +1633,6 @@
           <w:p>
             <w:pPr>
               <w:pStyle w:val="tablecopy"/>
-              <w:keepNext/>
               <w:spacing w:before="20" w:after="20"/>
               <w:jc w:val="center"/>
             </w:pPr>
@@ -1727,9 +1643,6 @@
         </w:tc>
       </w:tr>
       <w:tr>
-        <w:trPr>
-          <w:cantSplit/>
-        </w:trPr>
         <w:tc>
           <w:tcPr>
             <w:tcW w:type="dxa" w:w="1681"/>
@@ -1737,7 +1650,6 @@
           <w:p>
             <w:pPr>
               <w:pStyle w:val="tablecopy"/>
-              <w:keepNext/>
               <w:spacing w:before="20" w:after="20"/>
             </w:pPr>
             <w:r>
@@ -1752,7 +1664,6 @@
           <w:p>
             <w:pPr>
               <w:pStyle w:val="tablecopy"/>
-              <w:keepNext/>
               <w:spacing w:before="20" w:after="20"/>
               <w:jc w:val="center"/>
             </w:pPr>
@@ -1768,7 +1679,6 @@
           <w:p>
             <w:pPr>
               <w:pStyle w:val="tablecopy"/>
-              <w:keepNext/>
               <w:spacing w:before="20" w:after="20"/>
               <w:jc w:val="center"/>
             </w:pPr>
@@ -1784,7 +1694,6 @@
           <w:p>
             <w:pPr>
               <w:pStyle w:val="tablecopy"/>
-              <w:keepNext/>
               <w:spacing w:before="20" w:after="20"/>
               <w:jc w:val="center"/>
             </w:pPr>
@@ -1795,9 +1704,6 @@
         </w:tc>
       </w:tr>
       <w:tr>
-        <w:trPr>
-          <w:cantSplit/>
-        </w:trPr>
         <w:tc>
           <w:tcPr>
             <w:tcW w:type="dxa" w:w="1681"/>
@@ -1805,7 +1711,6 @@
           <w:p>
             <w:pPr>
               <w:pStyle w:val="tablecopy"/>
-              <w:keepNext/>
               <w:spacing w:before="20" w:after="20"/>
             </w:pPr>
             <w:r>
@@ -1820,7 +1725,6 @@
           <w:p>
             <w:pPr>
               <w:pStyle w:val="tablecopy"/>
-              <w:keepNext/>
               <w:spacing w:before="20" w:after="20"/>
               <w:jc w:val="center"/>
             </w:pPr>
@@ -1836,7 +1740,6 @@
           <w:p>
             <w:pPr>
               <w:pStyle w:val="tablecopy"/>
-              <w:keepNext/>
               <w:spacing w:before="20" w:after="20"/>
               <w:jc w:val="center"/>
             </w:pPr>
@@ -1852,7 +1755,6 @@
           <w:p>
             <w:pPr>
               <w:pStyle w:val="tablecopy"/>
-              <w:keepNext/>
               <w:spacing w:before="20" w:after="20"/>
               <w:jc w:val="center"/>
             </w:pPr>
@@ -1863,9 +1765,6 @@
         </w:tc>
       </w:tr>
       <w:tr>
-        <w:trPr>
-          <w:cantSplit/>
-        </w:trPr>
         <w:tc>
           <w:tcPr>
             <w:tcW w:type="dxa" w:w="1681"/>

</xml_diff>

<commit_message>
IWEICT paper: rewrite after the author's review (verification running)
Abstract and introduction lead with the idea and keep three numbers; a
'Why lockstep' paragraph from the RTL; L1 and L1' replace Frozen and
Multi-start in the text, tables and Fig. 2's panel labels; the
pre-registration notes are one paragraph of Sec. VI; the per-image
figure is dropped; Table I's caption gives the image sizes; Table II's
'Fit' column no longer wraps. Fig. 2 and Table II moved so the build is
four pages with no gaps. ABSTRACT_IWEICT.md carries the new abstract.

Co-Authored-By: Claude Opus 5.5 <noreply@anthropic.com>
Claude-Session: https://claude.ai/code/session_01KmQd2ww7ZkypMsRjhWuU5X
</commit_message>
<xml_diff>
--- a/bankperm/PAPER_EN.docx
+++ b/bankperm/PAPER_EN.docx
@@ -137,7 +137,7 @@
         <w:pStyle w:val="Abstract"/>
       </w:pPr>
       <w:r>
-        <w:t>Abstract—A zero-skipping convolution core whose input banks run in lockstep waits, in every window, for the bank with the most nonzero activations, so the assignment of window taps to banks sets its cycle count. On our integer CNN core for a Zynq XC7Z020, we derive a shape-only condition necessary for any layout to change a layer's cycle count. We compare three layouts that keep the bitstream and the integer output unchanged: a channel relabeling fitted offline and folded into the adjacent layers, a data-free skew that spreads each channel's taps over the banks, and the two combined. At four values per cycle, on four test images of a 32-channel denoiser, the board measured core-cycle savings of 5.9–9.0% for two relabelings, 7.3–10.0% for the skew and 7.9–10.7% for the combination, and predictions committed before the runs matched the measured cycles of 176 of 180 layers exactly (71 of 72 for the skew and the combination, which had never run) and the other four within one cycle. In counts over 79 test images the skew saves 9.20% and the combination 9.93%, against 7.46% and 8.10% for the relabelings; under pre-registered protocols this order held on all nine networks whose channel count is a multiple of four, and no layout changed the count where the shape condition says it cannot.</w:t>
+        <w:t>Abstract—Zero-skipping CNN accelerators often split each convolution window over parallel banks that advance in lockstep, so every window waits for the bank holding the most nonzero activations. The host decides which bank each tap of a window goes to, so the imbalance can be reduced in software: an offline layout of the taps changes the cycle count but neither the bitstream nor the integer output. On an integer CNN core for a Zynq XC7Z020 we give a test, from the layer shapes alone, of where any layout can gain, and compare three layouts: a channel relabeling fitted to activation statistics and folded into the weights, a data-free skew that spreads each channel's taps over the banks, and the two combined. Over the test images of a denoising CNN the skew cuts the core cycles by 9.2%, more than the fitted relabeling, and the combination by 9.9%; this order held on every tested network whose channel count is a multiple of four. On the board, a cycle model fixed before the runs predicted the cycles of 176 of 180 layers exactly, including those of layouts never run before.</w:t>
       </w:r>
     </w:p>
     <w:p>
@@ -161,7 +161,7 @@
         <w:pStyle w:val="a3"/>
       </w:pPr>
       <w:r>
-        <w:t>A core that skips zero activations saves multiplications, but lanes that advance together make each window cost as much as the busiest one, a stall Cnvlutin measures as its own category [1]. Known remedies change the network or add hardware: S2TA bounds the nonzeros per block [2], and Sense rebalances channels at run time, noting that input maps "cannot be trained offline to balance IFM workload" [3]. Offline reorderings mostly target weights: SparTen sorts filters by density [4], and Pool and Yu fold a channel permutation into the preceding layer for N:M pruning [5]; VARA permutes inputs offline from activation statistics to cluster co-zero inputs behind an index unit [6], and skewed storage gives conflict-free parallel access to a matrix's rows and columns [7]. Permutation, folding, profiling and skewing are thus not new; we found no work that spreads co-active channels over lockstep zero-skipping banks by an exact, folded relabeling.</w:t>
+        <w:t>A core that skips zero activations saves multiplications, but lanes that advance together make each window cost as much as the busiest one, a stall Cnvlutin measures as its own category [1]. Known remedies change the network or add hardware: S2TA bounds the nonzeros per block [2], and Sense rebalances channels at run time, noting that input maps "cannot be trained offline to balance IFM workload" [3]. Offline reorderings mostly target weights: SparTen sorts filters by density [4], and Pool and Yu fold a channel permutation into the preceding layer for N:M pruning [5]. VARA, a ReRAM accelerator, permutes inputs offline from activation statistics to cluster co-zero inputs, read back through an index unit [6], and skewed storage gives conflict-free parallel access to a matrix's rows and columns [7]. We found no work that spreads co-active channels over lockstep zero-skipping banks by an exact, folded relabeling, or that compares this with a skew.</w:t>
       </w:r>
     </w:p>
     <w:p>
@@ -169,7 +169,7 @@
         <w:pStyle w:val="a3"/>
       </w:pPr>
       <w:r>
-        <w:t>In our core, whose four tap banks run in lockstep, the host's choice of slot decides a tap's bank (Fig. 1). We contribute (i) a shape-only condition necessary for any layout to change a layer's cycle count (Section II); (ii) three layouts that keep the bitstream and the integer output unchanged: a folded channel relabeling, a data-free skew and both combined (Section III); (iii) pre-registered board runs of all three on four images, with every layer's cycles predicted, exactly in 176 of 180 (V-A); (iv) two pre-registered ten-network studies (V-B) and the board network on 79 images (V-C).</w:t>
+        <w:t>In our core, the slot in which the host places a tap decides the tap's bank (Fig. 1), so the tap layout is a software choice. We contribute (i) a test, from the layer shapes alone, of where a layout can change a layer's cycle count (Section II); (ii) three layouts that keep the bitstream and the integer output unchanged: a folded channel relabeling, a data-free skew and both combined (Section III); (iii) board runs of all three on four images, every layer's cycles predicted before them (V-A); and (iv) two pre-registered studies of ten networks (V-B) and the board network on 79 images (V-C).</w:t>
       </w:r>
     </w:p>
     <w:p>
@@ -240,7 +240,7 @@
         <w:t>⌉</w:t>
       </w:r>
       <w:r>
-        <w:t>·m cycles in (1), 2m for 32 outputs. The relabeling and the skew's weight-column order are folded into the weights offline; the host applies the skew's slot order to each window. One bitstream serves every layout; the window is a toy.</w:t>
+        <w:t>·m cycles in (1), 2m for 32 outputs. The relabeling and the skew's weight-column order are folded into the weights offline; the host applies the skew's slot order to each window. One bitstream serves every layout; the window is an example.</w:t>
       </w:r>
     </w:p>
     <w:p>
@@ -273,6 +273,20 @@
         <w:rPr>
           <w:b/>
         </w:rPr>
+        <w:t>Why lockstep.</w:t>
+      </w:r>
+      <w:r>
+        <w:t xml:space="preserve"> Each output lane adds the four banks' products in one adder tree every cycle, into one accumulator, and the banks share one issue position; so the banks must advance together. Decoupling them would need a buffer and an accumulator per bank and lane and a final reduction; we keep the simpler core, change only the layout, and measure each layout against the perfect-balance bound below.</w:t>
+      </w:r>
+    </w:p>
+    <w:p>
+      <w:pPr>
+        <w:pStyle w:val="a3"/>
+      </w:pPr>
+      <w:r>
+        <w:rPr>
+          <w:b/>
+        </w:rPr>
         <w:t>Cost of a window.</w:t>
       </w:r>
       <w:r>
@@ -350,7 +364,7 @@
         <w:t>⌉</w:t>
       </w:r>
       <w:r>
-        <w:t xml:space="preserve"> output groups and emitting COUT results. Each layer adds a fill and drain of min(load, compute of the last window) + 3 + g cycles, g being the outputs in the last group of P, a rule read off board runs of four networks on one image; the first layer has a measured constant (17 cycles for the board network at W = 4). We call (1) summed over the windows the count, and the count plus the fill and drain the exact prediction.</w:t>
+        <w:t xml:space="preserve"> output groups and emitting COUT results. We call (1) summed over a layer's windows the layer's cycle count, computed in host emulation. On the board each layer also pays a short fill and drain, min(load, compute of the last window) + 3 + g cycles (g: outputs in the last group of P), a rule we read off board runs of four networks on one image; the first layer takes a measured 17 cycles instead. The count plus the fill and drain is the predicted cycles.</w:t>
       </w:r>
     </w:p>
     <w:p>
@@ -362,7 +376,7 @@
         <w:rPr>
           <w:b/>
         </w:rPr>
-        <w:t>When a layout can pay.</w:t>
+        <w:t>When a layout can gain.</w:t>
       </w:r>
       <w:r>
         <w:t xml:space="preserve"> A bank holds at most </w:t>
@@ -454,7 +468,7 @@
         <w:spacing w:lineRule="exact" w:line="220"/>
       </w:pPr>
       <w:r>
-        <w:t xml:space="preserve">Failing (2) is thus necessary for a gain; without the rounding, (2) reads COUT ≤ P·T/W. So 32-output hidden layers (K = 288: 144 against 145 at W = 2 and 73 at W = 4) can pay only at W = 4, layers with 45 or 64 outputs also at W = 2, and none at W = 1 or in the last layer (COUT ≤ 4). Perfect balance, m = </w:t>
+        <w:t xml:space="preserve">Failing (2) is thus necessary for a gain; without the rounding, (2) reads COUT ≤ P·T/W. So 32-output hidden layers (K = 288: 144 against 145 at W = 2 and 73 at W = 4) can gain only at W = 4, layers with 45 or 64 outputs also at W = 2, and none at W = 1 or in the last layer (COUT ≤ 4). Perfect balance, m = </w:t>
       </w:r>
       <w:r>
         <w:rPr>
@@ -472,7 +486,7 @@
         <w:t>⌉</w:t>
       </w:r>
       <w:r>
-        <w:t xml:space="preserve"> for n nonzero taps, bounds every tap-to-bank assignment.</w:t>
+        <w:t xml:space="preserve"> for n nonzero taps, bounds every lockstep layout.</w:t>
       </w:r>
     </w:p>
     <w:p>
@@ -488,7 +502,7 @@
         <w:pStyle w:val="a3"/>
       </w:pPr>
       <w:r>
-        <w:t>In (ky, kx, channel) order, tap s·N + p (s the 3×3 position, p the channel, N the input channels) is in bank p mod 4 when 4 divides N: in this conventional order, L0 or the Original, each bank holds N/4 whole channels (Fig. 2a).</w:t>
+        <w:t>In (ky, kx, channel) order, tap s·N + p (s the 3×3 position, p the channel, N the input channels) is in bank p mod 4 when 4 divides N: in this conventional layout, L0, each bank holds N/4 whole channels (Fig. 2a).</w:t>
       </w:r>
     </w:p>
     <w:p>
@@ -502,7 +516,7 @@
         <w:t>Relabeling (L1).</w:t>
       </w:r>
       <w:r>
-        <w:t xml:space="preserve"> Let π map a position p of a hidden map to its original channel. The producer computes its output channels in the order π, with weight rows, biases and requantization scales reordered, and the consumer's weight column for tap s·N + p comes from channel π(p). As ReLU and requantization act per channel and the consumer adds the same INT32 products, the integer output is identical for every input, while π decides which channels share a bank (Fig. 2b). We permute the outputs of conv1 to conv(L−2) of an L-layer network; the last layer, which can never pay, keeps its input. In the maxout and averaging networks (maximum or mean of maps j and j + N), both maps move with π.</w:t>
+        <w:t xml:space="preserve"> Let π map a position p of a hidden map to its original channel. The producer computes its output channels in the order π, with weight rows, biases and requantization scales reordered, and the consumer's weight column for tap s·N + p comes from channel π(p). As ReLU and requantization act per channel and the consumer adds the same INT32 products, the integer output is identical for every input, while π decides which channels share a bank (Fig. 2b). We permute the outputs of conv1 to conv(L−2) of an L-layer network; the last layer, which can never gain, keeps its input. In maxout and averaging networks both maps of a pair move with π.</w:t>
       </w:r>
     </w:p>
     <w:p>
@@ -516,7 +530,7 @@
         <w:t>Skew (L2).</w:t>
       </w:r>
       <w:r>
-        <w:t xml:space="preserve"> Skewed storage [7] applied to the taps: the host puts channel p of position s in slot s·N + (p + s) mod N when 4 divides N, bank (p + s) mod 4, which spreads each channel's nine taps 3/2/2/2 over the banks (Fig. 2c). It permutes each window's taps and the consumer's weight columns alike and needs no data and no RTL change; no partial sum, in any order, exceeds |bias| + K·127·128 &lt; 2³¹, so the INT32 result is unchanged.</w:t>
+        <w:t xml:space="preserve"> Skewed storage [7] applied to the taps: when 4 divides N, the host puts channel p of position s in slot s·N + (p + s) mod N, bank (p + s) mod 4, which spreads each channel's nine taps 3/2/2/2 over the banks (Fig. 2c). It permutes each window's taps and the consumer's weight columns alike and needs no data and no RTL change; no partial sum, in any order, exceeds |bias| + K·127·128 &lt; 2³¹, so the INT32 result is unchanged.</w:t>
       </w:r>
     </w:p>
     <w:p>
@@ -531,34 +545,6 @@
       </w:r>
       <w:r>
         <w:t xml:space="preserve"> Under the skew, bank b holds at position s the channels of class (b − s) mod 4 (class: p mod 4): class b at positions 0, 4 and 8, each other class at two. The skew thus dilutes a class's excess of nonzeros without removing it, and which channels form a class is still free: L3 refits the relabeling under this rule, starting from L2, then skews (Fig. 2d).</w:t>
-      </w:r>
-    </w:p>
-    <w:p>
-      <w:pPr>
-        <w:pStyle w:val="a3"/>
-      </w:pPr>
-      <w:r>
-        <w:rPr>
-          <w:b/>
-        </w:rPr>
-        <w:t>Fitting.</w:t>
-      </w:r>
-      <w:r>
-        <w:t xml:space="preserve"> Each layer is fitted alone, as relabeled windows are the original's with permuted columns. The recipe draws 2048 windows per fitted layer from Set12 01.png (Cal-1; σ = 25, one noise draw), minimizes their mean of (1) at W = 4, and searches from the identity with 400 proposals, each swapping two channels of different classes (p mod 4), kept only if the objective falls. Under the conventional rule it gave Frozen, the first board layout, and under the skewed rule L3. A second relabeling of the board network, Multi-start, adds Set12 02–03, two noise draws per image (Cal-3) and four random starts (2005 objective evaluations per layer against 401).</w:t>
-      </w:r>
-    </w:p>
-    <w:p>
-      <w:pPr>
-        <w:pStyle w:val="a3"/>
-      </w:pPr>
-      <w:r>
-        <w:rPr>
-          <w:b/>
-        </w:rPr>
-        <w:t>Function preserved.</w:t>
-      </w:r>
-      <w:r>
-        <w:t xml:space="preserve"> In host emulation every exported layout reproduced the original's output (Frozen and Multi-start on all 80 images), and L2 and L3 (L3 up to channel order) every network's INT32 accumulators in every window of a test image; on the board every layer's output matched the integer model.</w:t>
       </w:r>
     </w:p>
     <w:p>
@@ -611,7 +597,35 @@
         </w:numPr>
       </w:pPr>
       <w:r>
-        <w:t>Fig. 2. A conv5 input window of the board network on Set12 05.png (the first compute-bound one at W = 4 with the median m, 48). Filled: nonzero, colored by bank (bank 1 dotted). (a) L0, bank p mod 4; (b) Frozen, an L1; (c) L2, bank (p + s) mod 4; (d) L3, bank (class + s) mod 4. Bars: nonzeros per bank; the fullest, m, costs 2m cycles; dashed: m = 36.5, where 2m equals the load of 73 cycles. Here L3 ties L2; over all of conv5's windows the mean m is 47.6, 42.1, 40.4 and 39.7.</w:t>
+        <w:t>Fig. 2. A conv5 input window of the board network on Set12 05.png (the first compute-bound one at W = 4 with the median m, 48) under L0–L3 (a–d); filled: nonzero, colored by bank. Bars: nonzeros per bank; the fullest, m, costs 2m cycles, against the load of 73 (dashed). Over all of conv5's windows the mean m is 47.6, 42.1, 40.4 and 39.7.</w:t>
+      </w:r>
+    </w:p>
+    <w:p>
+      <w:pPr>
+        <w:pStyle w:val="a3"/>
+      </w:pPr>
+      <w:r>
+        <w:rPr>
+          <w:b/>
+        </w:rPr>
+        <w:t>Fitting.</w:t>
+      </w:r>
+      <w:r>
+        <w:t xml:space="preserve"> Each layer is fitted alone, as relabeled windows are the original's with permuted columns. The recipe draws 2048 windows per layer from one calibration image, Set12 01.png, minimizes their mean of (1) at W = 4, and searches from the identity with 400 proposals, each swapping two channels of different classes and kept only if the objective falls. Under the conventional bank rule this gives L1, under the skewed rule L3. For the board network we also use L1′, fitted on Set12 01–03 with two noise draws each and four random starts (2005 objective evaluations per layer instead of 401).</w:t>
+      </w:r>
+    </w:p>
+    <w:p>
+      <w:pPr>
+        <w:pStyle w:val="a3"/>
+      </w:pPr>
+      <w:r>
+        <w:rPr>
+          <w:b/>
+        </w:rPr>
+        <w:t>Function preserved.</w:t>
+      </w:r>
+      <w:r>
+        <w:t xml:space="preserve"> In host emulation every exported layout reproduced the original's output (L1 and L1′ on all 80 images), and L2 and L3 (L3 up to channel order) every network's INT32 accumulators in every window of a test image; on the board every layer's output matched the integer model.</w:t>
       </w:r>
     </w:p>
     <w:p>
@@ -633,7 +647,7 @@
         <w:t>Networks and images.</w:t>
       </w:r>
       <w:r>
-        <w:t xml:space="preserve"> Ten trained integer DnCNN-style networks [8] for Gaussian noise of σ = 25 on 7-bit inputs: A, 7 layers of 32 channels; B, 10 layers of 64 channels behind a 2×2 space-to-depth input; B-32, the same with 32 channels, with ReLU (R1–R3, training seeds s1–s3), maxout over pairs of 64 computed outputs (M1–M3, seeds s1–s3) or their mean (Av2, seed s2); and 45, the same with 45 channels and ReLU. All but A had quantization-aware training. The board network, B-32 ReLU s1 (R1), reaches 29.54 dB on Set12 05.png; 37–55% of its hidden layers' window values are nonzero. Test images: Set12 [8] and BSD68 [9], 80 images, one noise draw each; savings are pooled over the 79 other than Set12 01.png, with paired bootstrap 95% intervals over images. Two protocols fixed the recipes, evaluations and hypotheses in advance; Sec. VI lists what had been counted before them.</w:t>
+        <w:t xml:space="preserve"> Ten trained integer DnCNN-style networks [8] for Gaussian noise of σ = 25 on 7-bit inputs: A, 7 layers of 32 channels; B, 10 layers of 64 channels behind a 2×2 space-to-depth input; B-32, the same with 32 channels, with ReLU (R1–R3, training seeds s1–s3), maxout over pairs of 64 computed outputs (M1–M3, seeds s1–s3) or their mean (Av2, seed s2); and 45, the same with 45 channels and ReLU. All but A had quantization-aware training. The board network, R1, reaches 29.54 dB on Set12 05.png; 37–55% of its hidden layers' window values are nonzero. Test images: Set12 [8] and BSD68 [9], 80 images, one noise draw each; savings are pooled over the 79 other than the calibration image, with paired bootstrap 95% intervals over images. Two protocols fixed the recipes, evaluations and hypotheses in advance (Sec. VI).</w:t>
       </w:r>
     </w:p>
     <w:p>
@@ -647,7 +661,7 @@
         <w:t>Board.</w:t>
       </w:r>
       <w:r>
-        <w:t xml:space="preserve"> The W = 4 bitstream for the XC7Z020 closes timing at 100 MHz (worst slack +0.130 ns), uses 11,151 LUTs (21%), 71 of 140 BRAM36-equivalent tiles and no DSP slice, and ran at the board preset's 50 MHz. One bitstream ran all layouts; per layer the driver checks the output against the integer model and reads the cycle counter CYCLES and the DMA-wait counter IN_STALL. The five layouts of Table I ran once each on Set12 05–08, with the cycles of conv2–conv10 predicted beforehand (conv1: the constant of Sec. II); L0, Frozen and Multi-start had also run earlier, and of those runs only the 05.png ones were used: L0's for the rule and constant of Sec. II, the totals to check the prediction code. All other cycle numbers are counts in the host emulation, which reproduces every network's reference PSNR on all 80 images.</w:t>
+        <w:t xml:space="preserve"> The W = 4 bitstream for the XC7Z020 closes timing at 100 MHz, uses 11,151 LUTs (21%), 71 of 140 BRAM36-equivalent tiles and no DSP slice, and ran at the board preset's 50 MHz (cycle counts do not depend on the clock). One bitstream ran all layouts; per layer the driver checks the output against the integer model and reads the cycle counter CYCLES and the DMA-wait counter IN_STALL. The five layouts of Table I ran once each on Set12 05–08, with the cycles of conv2–conv10 predicted before the runs. All other cycle numbers are counts in the host emulation, which reproduces every network's reference PSNR on all 80 images.</w:t>
       </w:r>
     </w:p>
     <w:p>
@@ -675,7 +689,7 @@
         </w:numPr>
       </w:pPr>
       <w:r>
-        <w:t>Table I. Board saving (%) against L0 of R1 at W = 4 on Set12 05–08, one pre-registered run each (L0 row: total cycles); each run's total equals its prediction or exceeds it by one cycle (in conv8), for L0 and Multi-start on 08 and for Multi-start and L3 on 07.</w:t>
+        <w:t>Table I. Board saving (%) against L0 of R1 at W = 4 on Set12 05–08, one run each (L0 row: total cycles; 08.png is 512×512, the others 256×256). Each run's total equals its predicted cycles or exceeds them by one (in conv8), for L0 and L1′ on 08 and for L1′ and L3 on 07.</w:t>
       </w:r>
     </w:p>
     <w:tbl>
@@ -859,7 +873,7 @@
               <w:spacing w:before="20" w:after="20"/>
             </w:pPr>
             <w:r>
-              <w:t>L1 Frozen</w:t>
+              <w:t>L1 relabeling</w:t>
             </w:r>
           </w:p>
         </w:tc>
@@ -935,7 +949,7 @@
               <w:spacing w:before="20" w:after="20"/>
             </w:pPr>
             <w:r>
-              <w:t>L1 Multi-start</w:t>
+              <w:t>L1′ relabeling</w:t>
             </w:r>
           </w:p>
         </w:tc>
@@ -1159,7 +1173,7 @@
         <w:spacing w:before="120"/>
       </w:pPr>
       <w:r>
-        <w:t>On all four images the board gave L3 &lt; L2 &lt; Multi-start &lt; Frozen &lt; L0 in cycles, as predicted (Table I); pooled over the four images, L2 saved 8.13% and L3 8.80%. In 176 of the 180 predicted layers (conv2–conv10) CYCLES − IN_STALL equaled the prediction. The other four, all in conv8, were one cycle over; after the runs we found them to be exactly the layers whose last window computes 30 cycles (all other conv2–conv9 layers: 32–56), a case absent from the runs the fill-and-drain rule was read off. L2 and L3 had never run on the board before, and 71 of their 72 layers were exact. This bitstream's IN_STALL misses DMA starvation at window boundaries; the rule could absorb a stall common to all layouts, so the match excludes only stalls that differ between them.</w:t>
+        <w:t>On all four images the board gave L3 &lt; L2 &lt; L1′ &lt; L1 &lt; L0 in cycles, as predicted (Table I); pooled over the four images, L2 saved 8.13% and L3 8.80%. In 176 of the 180 predicted layers (conv2–conv10), CYCLES − IN_STALL equaled the predicted cycles. The other four, all in conv8, were one cycle over; after the runs we found them to be exactly the layers whose last window computes 30 cycles (all other conv2–conv9 layers: 32–56), a case absent from the runs the fill-and-drain rule was read off. L2 and L3 had never run on the board before, and 71 of their 72 layers were exact. This bitstream's IN_STALL does not count DMA starvation at window boundaries, so a stall common to all layouts could hide in the fill-and-drain rule; the match rules out only stalls that differ between layouts.</w:t>
       </w:r>
     </w:p>
     <w:p>
@@ -1175,7 +1189,7 @@
         <w:pStyle w:val="a3"/>
       </w:pPr>
       <w:r>
-        <w:t>The first protocol's hypotheses all held. H1: wherever (2) holds, at W = 1 on all networks and at W = 2 on A and R1–R3, the relabeled count equaled the original on all 80 images. H2, H3: the pooled saving of L1 was positive on all ten networks at W = 4, 1.09–10.80% (Fig. 3; the sign was known for B, M1 and R1), and on all six where (2) allows it at W = 2, 3.36–7.37% on five and 0.022% on 45.</w:t>
+        <w:t>The first protocol's hypotheses held. H1: wherever (2) holds, at W = 1 on all networks and at W = 2 on A and R1–R3, the relabeled count equaled the original on all 80 images. H2, H3: the pooled saving of L1 was positive on all ten networks at W = 4, 1.09–10.80% (Fig. 3), and on all six where (2) allows it at W = 2, 3.36–7.37% on five and 0.022% on 45.</w:t>
       </w:r>
     </w:p>
     <w:p>
@@ -1183,7 +1197,7 @@
         <w:pStyle w:val="a3"/>
       </w:pPr>
       <w:r>
-        <w:t>The second protocol's three also held. H4: wherever (2) holds, L2 and L3 counted exactly as L0 on all 80 images, in every layer. H5: at W = 4, L2 saved more than L1 on all nine networks with N mod 4 = 0, by 0.90–2.36 points (known for R1). H6: L3 saved more than L2 on all nine, by 0.48–1.18 points, on R1 by 0.73 (95% interval [0.70, 0.75]; seen on seven images before the protocol). Not pre-registered: L3 was fitted on 01.png alone, so the gain is out of sample, and it is consistent: on each of the nine networks the interval of L3 − L2 excludes 0; L3 counted fewer cycles than L2 on all 711 image–network pairs and, pooled, in all 69 fitted layers; at W = 2, L3 &gt; L2 &gt; L1 held on the five networks with N mod 4 = 0 where (2) allows a gain, L3 by 0.46–0.85 points over L2. No image counted more cycles under any layout at any W.</w:t>
+        <w:t>The second protocol's three also held. H4: wherever (2) holds, L2 and L3 counted exactly as L0 on all 80 images, in every layer. H5: at W = 4, L2 saved more than L1 on all nine networks with N mod 4 = 0, by 0.90–2.36 points. H6: L3 saved more than L2 on all nine, by 0.48–1.18 points, on R1 by 0.73 (95% interval [0.70, 0.75]). Beyond the hypotheses, the gain of L3, fitted on the calibration image alone, is consistent: L3 counted fewer cycles than L2 on all 711 image–network pairs and, pooled, in all 69 fitted layers, and at W = 2 L3 &gt; L2 &gt; L1 held on the five networks with N mod 4 = 0 where (2) allows a gain. No image counted more cycles under any layout at any W.</w:t>
       </w:r>
     </w:p>
     <w:p>
@@ -1252,60 +1266,23 @@
         <w:pStyle w:val="a3"/>
       </w:pPr>
       <w:r>
-        <w:t>At W = 4, L2 saved more than both board relabelings, and L3 more than L2, on each of the 79 images (Fig. 4). L3 removed 26% of the imbalance that L2 leaves, reaching 82.6% of the perfect-balance saving against 76.6% (Table II), with the same host reorder as L2. Pooled, L2 also beat L1 fitted on each test image (8.45%) and a Sense-like sort by each channel's nonzero count in it; a density deal after SparTen [4] saved least (a comparison of procedures, not of co-activation against density).</w:t>
-      </w:r>
-    </w:p>
-    <w:p>
-      <w:pPr>
-        <w:spacing w:line="240" w:lineRule="auto"/>
-        <w:ind w:firstLine="0"/>
-        <w:jc w:val="center"/>
-      </w:pPr>
-      <w:r>
-        <w:drawing>
-          <wp:inline xmlns:a="http://schemas.openxmlformats.org/drawingml/2006/main" xmlns:pic="http://schemas.openxmlformats.org/drawingml/2006/picture">
-            <wp:extent cx="2880000" cy="1836610"/>
-            <wp:docPr id="4" name="Picture 4"/>
-            <wp:cNvGraphicFramePr>
-              <a:graphicFrameLocks noChangeAspect="1"/>
-            </wp:cNvGraphicFramePr>
-            <a:graphic>
-              <a:graphicData uri="http://schemas.openxmlformats.org/drawingml/2006/picture">
-                <pic:pic>
-                  <pic:nvPicPr>
-                    <pic:cNvPr id="0" name="fig3_per_image.png"/>
-                    <pic:cNvPicPr/>
-                  </pic:nvPicPr>
-                  <pic:blipFill>
-                    <a:blip r:embed="rId11"/>
-                    <a:stretch>
-                      <a:fillRect/>
-                    </a:stretch>
-                  </pic:blipFill>
-                  <pic:spPr>
-                    <a:xfrm>
-                      <a:off x="0" y="0"/>
-                      <a:ext cx="2880000" cy="1836610"/>
-                    </a:xfrm>
-                    <a:prstGeom prst="rect"/>
-                  </pic:spPr>
-                </pic:pic>
-              </a:graphicData>
-            </a:graphic>
-          </wp:inline>
-        </w:drawing>
-      </w:r>
-    </w:p>
-    <w:p>
-      <w:pPr>
-        <w:pStyle w:val="figurecaption"/>
-        <w:numPr>
-          <w:ilvl w:val="0"/>
-          <w:numId w:val="0"/>
-        </w:numPr>
-      </w:pPr>
-      <w:r>
-        <w:t>Fig. 4. Per-image W = 4 saving (count) of the board network on the 79 images other than Set12 01.png (calibration of Frozen and L3; Multi-start also used 02–03), sorted by the bound; legend: pooled saving; dotted: Set12 05.png.</w:t>
+        <w:t>At W = 4, L2 saved more than both relabelings, and L3 more than L2, on each of the 79 images. Perfect balance bounds every lockstep layout; the data-free L2 reaches 76.6% of its saving and L3 82.6%, removing 26% of the imbalance that L2 leaves at the same host cost (Table II). Pooled, L2 also beat L1 fitted on each test image itself (8.45%) and a Sense-like sort by each channel's nonzero count; a density deal after SparTen [4] saved least (a comparison of procedures, not of co-activation against density).</w:t>
+      </w:r>
+    </w:p>
+    <w:p>
+      <w:pPr>
+        <w:pStyle w:val="2"/>
+      </w:pPr>
+      <w:r>
+        <w:t>Cost</w:t>
+      </w:r>
+    </w:p>
+    <w:p>
+      <w:pPr>
+        <w:pStyle w:val="a3"/>
+      </w:pPr>
+      <w:r>
+        <w:t>Fitting a network took under 30 s (L1 or L3); L2 needs none. Single-threaded on an x86 server, the host's work for 05.png (input, im2col, requantization) took 31 ms (32 ms with L1′) against the core's 266 ms at 50 MHz: run back to back, L1′'s 7.60% core saving is 6.3–6.8% end to end, and all of it if the host overlaps the next image; the skew's reordering after im2col adds 4.2 ms. This bound omits the transfer of windows and results and the JTAG harness that ran the board; the Zynq's ARM cores would be slower than the server; energy was not measured.</w:t>
       </w:r>
     </w:p>
     <w:p>
@@ -1317,7 +1294,7 @@
         </w:numPr>
       </w:pPr>
       <w:r>
-        <w:t>Table II. B-32 ReLU s1 at W = 4 (count, 79 images): pooled saving against L0 [95% interval] and share (%) of the perfect-balance saving. p.i.: uses the test image (no interval); †: Cal-3 includes two of the 79; density, Sense-like: best of three variants on these images.</w:t>
+        <w:t>Table II. R1 at W = 4 (count, 79 images): pooled saving against L0 [95% interval] and share (%) of the perfect-balance saving. Fit: images the layout was fitted on (test: each test image itself, no interval; †: two of them among the 79); density and Sense-like: best of three variants on these images.</w:t>
       </w:r>
     </w:p>
     <w:tbl>
@@ -1332,15 +1309,15 @@
         <w:tblLook w:firstColumn="1" w:firstRow="1" w:lastColumn="0" w:lastRow="0" w:noHBand="0" w:noVBand="1" w:val="04A0"/>
       </w:tblPr>
       <w:tblGrid>
-        <w:gridCol w:w="1681"/>
-        <w:gridCol w:w="700"/>
-        <w:gridCol w:w="1681"/>
-        <w:gridCol w:w="700"/>
+        <w:gridCol w:w="1732"/>
+        <w:gridCol w:w="577"/>
+        <w:gridCol w:w="1732"/>
+        <w:gridCol w:w="722"/>
       </w:tblGrid>
       <w:tr>
         <w:tc>
           <w:tcPr>
-            <w:tcW w:type="dxa" w:w="1681"/>
+            <w:tcW w:type="dxa" w:w="1732"/>
           </w:tcPr>
           <w:p>
             <w:pPr>
@@ -1354,7 +1331,7 @@
         </w:tc>
         <w:tc>
           <w:tcPr>
-            <w:tcW w:type="dxa" w:w="700"/>
+            <w:tcW w:type="dxa" w:w="577"/>
           </w:tcPr>
           <w:p>
             <w:pPr>
@@ -1363,13 +1340,13 @@
               <w:jc w:val="center"/>
             </w:pPr>
             <w:r>
-              <w:t>Data</w:t>
-            </w:r>
-          </w:p>
-        </w:tc>
-        <w:tc>
-          <w:tcPr>
-            <w:tcW w:type="dxa" w:w="1681"/>
+              <w:t>Fit</w:t>
+            </w:r>
+          </w:p>
+        </w:tc>
+        <w:tc>
+          <w:tcPr>
+            <w:tcW w:type="dxa" w:w="1732"/>
           </w:tcPr>
           <w:p>
             <w:pPr>
@@ -1384,7 +1361,7 @@
         </w:tc>
         <w:tc>
           <w:tcPr>
-            <w:tcW w:type="dxa" w:w="700"/>
+            <w:tcW w:type="dxa" w:w="722"/>
           </w:tcPr>
           <w:p>
             <w:pPr>
@@ -1401,7 +1378,7 @@
       <w:tr>
         <w:tc>
           <w:tcPr>
-            <w:tcW w:type="dxa" w:w="1681"/>
+            <w:tcW w:type="dxa" w:w="1732"/>
           </w:tcPr>
           <w:p>
             <w:pPr>
@@ -1415,22 +1392,22 @@
         </w:tc>
         <w:tc>
           <w:tcPr>
-            <w:tcW w:type="dxa" w:w="700"/>
-          </w:tcPr>
-          <w:p>
-            <w:pPr>
-              <w:pStyle w:val="tablecopy"/>
-              <w:spacing w:before="20" w:after="20"/>
-              <w:jc w:val="center"/>
-            </w:pPr>
-            <w:r>
-              <w:t>Cal-1</w:t>
-            </w:r>
-          </w:p>
-        </w:tc>
-        <w:tc>
-          <w:tcPr>
-            <w:tcW w:type="dxa" w:w="1681"/>
+            <w:tcW w:type="dxa" w:w="577"/>
+          </w:tcPr>
+          <w:p>
+            <w:pPr>
+              <w:pStyle w:val="tablecopy"/>
+              <w:spacing w:before="20" w:after="20"/>
+              <w:jc w:val="center"/>
+            </w:pPr>
+            <w:r>
+              <w:t>1</w:t>
+            </w:r>
+          </w:p>
+        </w:tc>
+        <w:tc>
+          <w:tcPr>
+            <w:tcW w:type="dxa" w:w="1732"/>
           </w:tcPr>
           <w:p>
             <w:pPr>
@@ -1445,7 +1422,7 @@
         </w:tc>
         <w:tc>
           <w:tcPr>
-            <w:tcW w:type="dxa" w:w="700"/>
+            <w:tcW w:type="dxa" w:w="722"/>
           </w:tcPr>
           <w:p>
             <w:pPr>
@@ -1462,7 +1439,7 @@
       <w:tr>
         <w:tc>
           <w:tcPr>
-            <w:tcW w:type="dxa" w:w="1681"/>
+            <w:tcW w:type="dxa" w:w="1732"/>
           </w:tcPr>
           <w:p>
             <w:pPr>
@@ -1476,22 +1453,22 @@
         </w:tc>
         <w:tc>
           <w:tcPr>
-            <w:tcW w:type="dxa" w:w="700"/>
-          </w:tcPr>
-          <w:p>
-            <w:pPr>
-              <w:pStyle w:val="tablecopy"/>
-              <w:spacing w:before="20" w:after="20"/>
-              <w:jc w:val="center"/>
-            </w:pPr>
-            <w:r>
-              <w:t>p.i.</w:t>
-            </w:r>
-          </w:p>
-        </w:tc>
-        <w:tc>
-          <w:tcPr>
-            <w:tcW w:type="dxa" w:w="1681"/>
+            <w:tcW w:type="dxa" w:w="577"/>
+          </w:tcPr>
+          <w:p>
+            <w:pPr>
+              <w:pStyle w:val="tablecopy"/>
+              <w:spacing w:before="20" w:after="20"/>
+              <w:jc w:val="center"/>
+            </w:pPr>
+            <w:r>
+              <w:t>test</w:t>
+            </w:r>
+          </w:p>
+        </w:tc>
+        <w:tc>
+          <w:tcPr>
+            <w:tcW w:type="dxa" w:w="1732"/>
           </w:tcPr>
           <w:p>
             <w:pPr>
@@ -1506,7 +1483,7 @@
         </w:tc>
         <w:tc>
           <w:tcPr>
-            <w:tcW w:type="dxa" w:w="700"/>
+            <w:tcW w:type="dxa" w:w="722"/>
           </w:tcPr>
           <w:p>
             <w:pPr>
@@ -1523,36 +1500,36 @@
       <w:tr>
         <w:tc>
           <w:tcPr>
-            <w:tcW w:type="dxa" w:w="1681"/>
-          </w:tcPr>
-          <w:p>
-            <w:pPr>
-              <w:pStyle w:val="tablecopy"/>
-              <w:spacing w:before="20" w:after="20"/>
-            </w:pPr>
-            <w:r>
-              <w:t>L1 Frozen</w:t>
-            </w:r>
-          </w:p>
-        </w:tc>
-        <w:tc>
-          <w:tcPr>
-            <w:tcW w:type="dxa" w:w="700"/>
-          </w:tcPr>
-          <w:p>
-            <w:pPr>
-              <w:pStyle w:val="tablecopy"/>
-              <w:spacing w:before="20" w:after="20"/>
-              <w:jc w:val="center"/>
-            </w:pPr>
-            <w:r>
-              <w:t>Cal-1</w:t>
-            </w:r>
-          </w:p>
-        </w:tc>
-        <w:tc>
-          <w:tcPr>
-            <w:tcW w:type="dxa" w:w="1681"/>
+            <w:tcW w:type="dxa" w:w="1732"/>
+          </w:tcPr>
+          <w:p>
+            <w:pPr>
+              <w:pStyle w:val="tablecopy"/>
+              <w:spacing w:before="20" w:after="20"/>
+            </w:pPr>
+            <w:r>
+              <w:t>L1 relabeling</w:t>
+            </w:r>
+          </w:p>
+        </w:tc>
+        <w:tc>
+          <w:tcPr>
+            <w:tcW w:type="dxa" w:w="577"/>
+          </w:tcPr>
+          <w:p>
+            <w:pPr>
+              <w:pStyle w:val="tablecopy"/>
+              <w:spacing w:before="20" w:after="20"/>
+              <w:jc w:val="center"/>
+            </w:pPr>
+            <w:r>
+              <w:t>1</w:t>
+            </w:r>
+          </w:p>
+        </w:tc>
+        <w:tc>
+          <w:tcPr>
+            <w:tcW w:type="dxa" w:w="1732"/>
           </w:tcPr>
           <w:p>
             <w:pPr>
@@ -1567,7 +1544,7 @@
         </w:tc>
         <w:tc>
           <w:tcPr>
-            <w:tcW w:type="dxa" w:w="700"/>
+            <w:tcW w:type="dxa" w:w="722"/>
           </w:tcPr>
           <w:p>
             <w:pPr>
@@ -1584,36 +1561,36 @@
       <w:tr>
         <w:tc>
           <w:tcPr>
-            <w:tcW w:type="dxa" w:w="1681"/>
-          </w:tcPr>
-          <w:p>
-            <w:pPr>
-              <w:pStyle w:val="tablecopy"/>
-              <w:spacing w:before="20" w:after="20"/>
-            </w:pPr>
-            <w:r>
-              <w:t>L1 Multi-start</w:t>
-            </w:r>
-          </w:p>
-        </w:tc>
-        <w:tc>
-          <w:tcPr>
-            <w:tcW w:type="dxa" w:w="700"/>
-          </w:tcPr>
-          <w:p>
-            <w:pPr>
-              <w:pStyle w:val="tablecopy"/>
-              <w:spacing w:before="20" w:after="20"/>
-              <w:jc w:val="center"/>
-            </w:pPr>
-            <w:r>
-              <w:t>Cal-3†</w:t>
-            </w:r>
-          </w:p>
-        </w:tc>
-        <w:tc>
-          <w:tcPr>
-            <w:tcW w:type="dxa" w:w="1681"/>
+            <w:tcW w:type="dxa" w:w="1732"/>
+          </w:tcPr>
+          <w:p>
+            <w:pPr>
+              <w:pStyle w:val="tablecopy"/>
+              <w:spacing w:before="20" w:after="20"/>
+            </w:pPr>
+            <w:r>
+              <w:t>L1′ relabeling</w:t>
+            </w:r>
+          </w:p>
+        </w:tc>
+        <w:tc>
+          <w:tcPr>
+            <w:tcW w:type="dxa" w:w="577"/>
+          </w:tcPr>
+          <w:p>
+            <w:pPr>
+              <w:pStyle w:val="tablecopy"/>
+              <w:spacing w:before="20" w:after="20"/>
+              <w:jc w:val="center"/>
+            </w:pPr>
+            <w:r>
+              <w:t>3†</w:t>
+            </w:r>
+          </w:p>
+        </w:tc>
+        <w:tc>
+          <w:tcPr>
+            <w:tcW w:type="dxa" w:w="1732"/>
           </w:tcPr>
           <w:p>
             <w:pPr>
@@ -1628,7 +1605,7 @@
         </w:tc>
         <w:tc>
           <w:tcPr>
-            <w:tcW w:type="dxa" w:w="700"/>
+            <w:tcW w:type="dxa" w:w="722"/>
           </w:tcPr>
           <w:p>
             <w:pPr>
@@ -1645,7 +1622,7 @@
       <w:tr>
         <w:tc>
           <w:tcPr>
-            <w:tcW w:type="dxa" w:w="1681"/>
+            <w:tcW w:type="dxa" w:w="1732"/>
           </w:tcPr>
           <w:p>
             <w:pPr>
@@ -1659,7 +1636,7 @@
         </w:tc>
         <w:tc>
           <w:tcPr>
-            <w:tcW w:type="dxa" w:w="700"/>
+            <w:tcW w:type="dxa" w:w="577"/>
           </w:tcPr>
           <w:p>
             <w:pPr>
@@ -1674,7 +1651,7 @@
         </w:tc>
         <w:tc>
           <w:tcPr>
-            <w:tcW w:type="dxa" w:w="1681"/>
+            <w:tcW w:type="dxa" w:w="1732"/>
           </w:tcPr>
           <w:p>
             <w:pPr>
@@ -1689,7 +1666,7 @@
         </w:tc>
         <w:tc>
           <w:tcPr>
-            <w:tcW w:type="dxa" w:w="700"/>
+            <w:tcW w:type="dxa" w:w="722"/>
           </w:tcPr>
           <w:p>
             <w:pPr>
@@ -1706,7 +1683,7 @@
       <w:tr>
         <w:tc>
           <w:tcPr>
-            <w:tcW w:type="dxa" w:w="1681"/>
+            <w:tcW w:type="dxa" w:w="1732"/>
           </w:tcPr>
           <w:p>
             <w:pPr>
@@ -1720,22 +1697,22 @@
         </w:tc>
         <w:tc>
           <w:tcPr>
-            <w:tcW w:type="dxa" w:w="700"/>
-          </w:tcPr>
-          <w:p>
-            <w:pPr>
-              <w:pStyle w:val="tablecopy"/>
-              <w:spacing w:before="20" w:after="20"/>
-              <w:jc w:val="center"/>
-            </w:pPr>
-            <w:r>
-              <w:t>Cal-1</w:t>
-            </w:r>
-          </w:p>
-        </w:tc>
-        <w:tc>
-          <w:tcPr>
-            <w:tcW w:type="dxa" w:w="1681"/>
+            <w:tcW w:type="dxa" w:w="577"/>
+          </w:tcPr>
+          <w:p>
+            <w:pPr>
+              <w:pStyle w:val="tablecopy"/>
+              <w:spacing w:before="20" w:after="20"/>
+              <w:jc w:val="center"/>
+            </w:pPr>
+            <w:r>
+              <w:t>1</w:t>
+            </w:r>
+          </w:p>
+        </w:tc>
+        <w:tc>
+          <w:tcPr>
+            <w:tcW w:type="dxa" w:w="1732"/>
           </w:tcPr>
           <w:p>
             <w:pPr>
@@ -1750,7 +1727,7 @@
         </w:tc>
         <w:tc>
           <w:tcPr>
-            <w:tcW w:type="dxa" w:w="700"/>
+            <w:tcW w:type="dxa" w:w="722"/>
           </w:tcPr>
           <w:p>
             <w:pPr>
@@ -1767,7 +1744,7 @@
       <w:tr>
         <w:tc>
           <w:tcPr>
-            <w:tcW w:type="dxa" w:w="1681"/>
+            <w:tcW w:type="dxa" w:w="1732"/>
           </w:tcPr>
           <w:p>
             <w:pPr>
@@ -1781,7 +1758,7 @@
         </w:tc>
         <w:tc>
           <w:tcPr>
-            <w:tcW w:type="dxa" w:w="700"/>
+            <w:tcW w:type="dxa" w:w="577"/>
           </w:tcPr>
           <w:p>
             <w:pPr>
@@ -1796,7 +1773,7 @@
         </w:tc>
         <w:tc>
           <w:tcPr>
-            <w:tcW w:type="dxa" w:w="1681"/>
+            <w:tcW w:type="dxa" w:w="1732"/>
           </w:tcPr>
           <w:p>
             <w:pPr>
@@ -1811,7 +1788,7 @@
         </w:tc>
         <w:tc>
           <w:tcPr>
-            <w:tcW w:type="dxa" w:w="700"/>
+            <w:tcW w:type="dxa" w:w="722"/>
           </w:tcPr>
           <w:p>
             <w:pPr>
@@ -1828,10 +1805,10 @@
     </w:tbl>
     <w:p>
       <w:pPr>
-        <w:pStyle w:val="2"/>
-      </w:pPr>
-      <w:r>
-        <w:t>Cost</w:t>
+        <w:pStyle w:val="1"/>
+      </w:pPr>
+      <w:r>
+        <w:t>Limitations</w:t>
       </w:r>
     </w:p>
     <w:p>
@@ -1839,52 +1816,28 @@
         <w:pStyle w:val="a3"/>
         <w:spacing w:before="120"/>
       </w:pPr>
-      <w:r>
-        <w:t>Fitting a network took under 30 s (L1 or L3); L2 needs none. Single-threaded on an x86 server, the host's work for 05.png (input, im2col, requantization) took 31 ms (32 ms on the Multi-start export) against the core's 266 ms at 50 MHz: back to back, Multi-start's 7.60% core saving is 6.3–6.8% end to end, and all of it if the host overlaps the next image; the skew's reordering after im2col adds 4.2 ms. This bound omits the transfer of windows and results and the JTAG harness that ran the board; the Zynq's ARM cores would be slower than the server; energy was not measured.</w:t>
-      </w:r>
-    </w:p>
-    <w:p>
-      <w:pPr>
-        <w:pStyle w:val="1"/>
-      </w:pPr>
-      <w:r>
-        <w:t>Limitations</w:t>
-      </w:r>
-    </w:p>
-    <w:p>
-      <w:pPr>
-        <w:pStyle w:val="a3"/>
-        <w:ind w:firstLine="0" w:left="198"/>
-      </w:pPr>
-      <w:r>
-        <w:t xml:space="preserve">• </w:t>
-      </w:r>
       <w:r>
         <w:rPr>
           <w:b/>
         </w:rPr>
-        <w:t>Board evidence.</w:t>
-      </w:r>
-      <w:r>
-        <w:t xml:space="preserve"> One network, four images, one run each; L0, Frozen and Multi-start had run on these images before.</w:t>
+        <w:t>Scope.</w:t>
+      </w:r>
+      <w:r>
+        <w:t xml:space="preserve"> One network on the board, four images, one run each; ten DnCNN-family denoisers at σ = 25 in the counts, one noise draw per image and one fit per layout (the intervals resample images only); BSD68 was part of the networks' development. Banks decoupled by buffers and other P, T or kernel sizes were not evaluated.</w:t>
       </w:r>
     </w:p>
     <w:p>
       <w:pPr>
         <w:pStyle w:val="a3"/>
-        <w:ind w:firstLine="0" w:left="198"/>
-      </w:pPr>
-      <w:r>
-        <w:t xml:space="preserve">• </w:t>
-      </w:r>
+      </w:pPr>
       <w:r>
         <w:rPr>
           <w:b/>
         </w:rPr>
-        <w:t>Scope and selection.</w:t>
-      </w:r>
-      <w:r>
-        <w:t xml:space="preserve"> Only DnCNN-family denoisers at σ = 25, one noise draw per image and one fit per layout (the intervals resample images only); BSD68 was part of the networks' development; FIFO-decoupled banks and other P, T or kernel sizes were not evaluated. Multi-start was chosen for the board after its BSD68 counts had been seen; Frozen had been counted on R1 before the first protocol, and L2 on R1 (all 80 images) and L3 on seven of its images before the second.</w:t>
+        <w:t>What was known in advance.</w:t>
+      </w:r>
+      <w:r>
+        <w:t xml:space="preserve"> L1's saving on R1 was counted before the first protocol, and the sign of L1 on B and M1 was known; before the second, L2 had been counted on R1 (all 80 images) and on one image of four other networks, and L3 on seven images of R1. L1′ was chosen for the board after its BSD68 counts had been seen, and L0, L1 and L1′ had run on the board images before.</w:t>
       </w:r>
     </w:p>
     <w:p>
@@ -1900,7 +1853,7 @@
         <w:pStyle w:val="a3"/>
       </w:pPr>
       <w:r>
-        <w:t>The layer shapes tell where the tap-to-bank layout of a lockstep zero-skipping core can matter. Where it can, in counts over 79 images, the data-free skew removed more bank imbalance than a fitted relabeling on all nine networks with N mod 4 = 0, and a relabeling fitted under the skew removed more than the skew on every test image and, pooled, in every fitted layer. On the board the same order held on all four images, and the cycles of 71 of the 72 layers of the never-run L2 and L3 were predicted exactly. Skew and relabeling only partly add (under the skew the relabeling gains 0.48–1.18 points, alone 3.50–10.80%): the skew spreads each channel over the banks, the relabeling still chooses which channels share one. Code and data: https://github.com/qewr1234/FPGA.</w:t>
+        <w:t>The layer shapes tell where the tap-to-bank layout of a lockstep zero-skipping core can matter. Where it can, a data-free skew of the taps removed more bank imbalance than a relabeling fitted to activation statistics, on all nine networks with N mod 4 = 0, and a relabeling fitted under the skew removed more still, on every image of every such network. The two only partly add: the skew spreads each channel over the banks, while the relabeling still chooses which channels share one. On the board the same order held on all four images, and a cycle model fixed before the runs predicted the never-run L2 and L3 to the cycle in 71 of their 72 layers. Code and data: https://github.com/qewr1234/FPGA.</w:t>
       </w:r>
     </w:p>
     <w:p>

</xml_diff>

<commit_message>
IWEICT paper: fixes from the verification of the rewrite
Abstract: the 9.2% and 9.9% are host-emulation counts at W = 4 over 79
images; 176 of 180 exact and the other four within one cycle; the host
decides the bank where it builds the windows. Sec. VI again says which
board layers were in sample (05.png's L0, L1, L1' runs) and lists the
skew's earlier looks at B and M1. Function preservation no longer
claims 80 images for every network's L1. A fuller core description,
the idea in the first paragraph of the introduction, the VARA sentence
corrected (v2), B-45 for the 45-channel network, 'pooled' defined.
Fig. 1 at larger type, Fig. 3 labelled with L0-L3. The builder sets
flush-right equation numbers and the document's title and authors.

Co-Authored-By: Claude Opus 5.5 <noreply@anthropic.com>
Claude-Session: https://claude.ai/code/session_01KmQd2ww7ZkypMsRjhWuU5X
</commit_message>
<xml_diff>
--- a/bankperm/PAPER_EN.docx
+++ b/bankperm/PAPER_EN.docx
@@ -75,7 +75,7 @@
         <w:pStyle w:val="Author"/>
       </w:pPr>
       <w:r>
-        <w:t xml:space="preserve">(Advisor name)</w:t>
+        <w:t xml:space="preserve">*Gyu Sang Choi</w:t>
       </w:r>
     </w:p>
     <w:p>
@@ -83,7 +83,7 @@
         <w:pStyle w:val="Affiliation"/>
       </w:pPr>
       <w:r>
-        <w:t xml:space="preserve">(Dept. name of organization)</w:t>
+        <w:t xml:space="preserve">School of Computer Science and Engineering, Yeungnam University</w:t>
       </w:r>
     </w:p>
     <w:p>
@@ -91,7 +91,7 @@
         <w:pStyle w:val="Affiliation"/>
       </w:pPr>
       <w:r>
-        <w:t xml:space="preserve">(Name of organization)</w:t>
+        <w:t xml:space="preserve">Information and Communication Engineering Major</w:t>
       </w:r>
     </w:p>
     <w:p>
@@ -99,7 +99,7 @@
         <w:pStyle w:val="Affiliation"/>
       </w:pPr>
       <w:r>
-        <w:t xml:space="preserve">(City, Country)</w:t>
+        <w:t xml:space="preserve">Gyeongsan, Republic of Korea</w:t>
       </w:r>
     </w:p>
     <w:p>
@@ -117,7 +117,7 @@
         </w:sectPr>
       </w:pPr>
       <w:r>
-        <w:t xml:space="preserve">(e-mail address)</w:t>
+        <w:t xml:space="preserve">(e-mail)</w:t>
       </w:r>
     </w:p>
     <w:p/>
@@ -137,7 +137,7 @@
         <w:pStyle w:val="Abstract"/>
       </w:pPr>
       <w:r>
-        <w:t>Abstract—Zero-skipping CNN accelerators often split each convolution window over parallel banks that advance in lockstep, so every window waits for the bank holding the most nonzero activations. The host decides which bank each tap of a window goes to, so the imbalance can be reduced in software: an offline layout of the taps changes the cycle count but neither the bitstream nor the integer output. On an integer CNN core for a Zynq XC7Z020 we give a test, from the layer shapes alone, of where any layout can gain, and compare three layouts: a channel relabeling fitted to activation statistics and folded into the weights, a data-free skew that spreads each channel's taps over the banks, and the two combined. Over the test images of a denoising CNN the skew cuts the core cycles by 9.2%, more than the fitted relabeling, and the combination by 9.9%; this order held on every tested network whose channel count is a multiple of four. On the board, a cycle model fixed before the runs predicted the cycles of 176 of 180 layers exactly, including those of layouts never run before.</w:t>
+        <w:t>Abstract—Zero-skipping CNN accelerators often split each convolution window over parallel banks that advance in lockstep, so every window waits for the bank holding the most nonzero activations. When the host builds the windows, it also decides which bank each tap goes to, so the imbalance can be reduced in software: an offline layout of the taps changes the cycle count but neither the bitstream nor the integer output. On an integer CNN core for a Zynq XC7Z020 we give a test, from the layer shapes alone, of where any layout can gain, and compare three layouts: a channel relabeling fitted to activation statistics and folded into the weights, a data-free skew that spreads each channel's taps over the banks, and the two combined. In host emulation over 79 test images of a denoising CNN, at four window values per cycle, the skew cuts the core cycles by 9.2%, more than the fitted relabeling, and the combination by 9.9%; this order held on every tested network whose channel count is a multiple of four. On the board, a cycle model fixed before the runs predicted the cycles of 176 of 180 layers exactly and the other four within one cycle.</w:t>
       </w:r>
     </w:p>
     <w:p>
@@ -161,7 +161,7 @@
         <w:pStyle w:val="a3"/>
       </w:pPr>
       <w:r>
-        <w:t>A core that skips zero activations saves multiplications, but lanes that advance together make each window cost as much as the busiest one, a stall Cnvlutin measures as its own category [1]. Known remedies change the network or add hardware: S2TA bounds the nonzeros per block [2], and Sense rebalances channels at run time, noting that input maps "cannot be trained offline to balance IFM workload" [3]. Offline reorderings mostly target weights: SparTen sorts filters by density [4], and Pool and Yu fold a channel permutation into the preceding layer for N:M pruning [5]. VARA, a ReRAM accelerator, permutes inputs offline from activation statistics to cluster co-zero inputs, read back through an index unit [6], and skewed storage gives conflict-free parallel access to a matrix's rows and columns [7]. We found no work that spreads co-active channels over lockstep zero-skipping banks by an exact, folded relabeling, or that compares this with a skew.</w:t>
+        <w:t>A core that skips zero activations saves multiplications, but banks that advance in lockstep make each window cost as much as the busiest one, a stall Cnvlutin measures as its own category [1]. In our core the slot in which the host places a tap decides the tap's bank (Fig. 1), so this stall can be reduced in software, with the bitstream and the integer output unchanged. Known remedies change the network or add hardware: S2TA bounds the nonzeros per block [2], and Sense rebalances channels at run time, noting that input maps "cannot be trained offline to balance IFM workload" [3]. Offline reorderings mostly target weights: SparTen sorts filters by density [4], and Pool and Yu fold a channel permutation into the preceding layer for N:M pruning [5]. VARA, a ReRAM accelerator, permutes inputs offline from training-set activations so that co-zero ones fill skippable crossbar blocks, read through an index unit at run time [6], and skewed storage gives conflict-free parallel access to a matrix's rows and columns [7]. We found no work that spreads co-active channels over lockstep zero-skipping banks by an exact, folded relabeling.</w:t>
       </w:r>
     </w:p>
     <w:p>
@@ -169,7 +169,7 @@
         <w:pStyle w:val="a3"/>
       </w:pPr>
       <w:r>
-        <w:t>In our core, the slot in which the host places a tap decides the tap's bank (Fig. 1), so the tap layout is a software choice. We contribute (i) a test, from the layer shapes alone, of where a layout can change a layer's cycle count (Section II); (ii) three layouts that keep the bitstream and the integer output unchanged: a folded channel relabeling, a data-free skew and both combined (Section III); (iii) board runs of all three on four images, every layer's cycles predicted before them (V-A); and (iv) two pre-registered studies of ten networks (V-B) and the board network on 79 images (V-C).</w:t>
+        <w:t>We contribute (i) a test, from the layer shapes alone, of where a layout can change a layer's cycle count (Section II); (ii) three layouts that keep the bitstream and the integer output unchanged: a folded channel relabeling, a data-free skew and both combined (Section III); (iii) board runs of all three on four images, the cycles of conv2–conv10 predicted before them and exact in 176 of 180 layers (V-A); and (iv) two pre-registered ten-network studies (V-B) and a comparison with baselines on the board network over 79 images (V-C).</w:t>
       </w:r>
     </w:p>
     <w:p>
@@ -181,7 +181,7 @@
       <w:r>
         <w:drawing>
           <wp:inline xmlns:a="http://schemas.openxmlformats.org/drawingml/2006/main" xmlns:pic="http://schemas.openxmlformats.org/drawingml/2006/picture">
-            <wp:extent cx="2880000" cy="1440000"/>
+            <wp:extent cx="2880000" cy="1656610"/>
             <wp:docPr id="1" name="Picture 1"/>
             <wp:cNvGraphicFramePr>
               <a:graphicFrameLocks noChangeAspect="1"/>
@@ -202,7 +202,7 @@
                   <pic:spPr>
                     <a:xfrm>
                       <a:off x="0" y="0"/>
-                      <a:ext cx="2880000" cy="1440000"/>
+                      <a:ext cx="2880000" cy="1656610"/>
                     </a:xfrm>
                     <a:prstGeom prst="rect"/>
                   </pic:spPr>
@@ -222,7 +222,7 @@
         </w:numPr>
       </w:pPr>
       <w:r>
-        <w:t xml:space="preserve">Fig. 1. The system. The slot the host gives a tap decides its bank; the four banks skip zeros in lockstep, so the fullest bank's m sets a window's compute, </w:t>
+        <w:t xml:space="preserve">Fig. 1. The system. The slot the host gives a tap decides its bank; the four banks skip zeros in lockstep, so the number m of nonzero taps in the fullest bank sets a window's compute, </w:t>
       </w:r>
       <w:r>
         <w:rPr>
@@ -262,7 +262,7 @@
         <w:t>Core.</w:t>
       </w:r>
       <w:r>
-        <w:t xml:space="preserve"> The host builds each layer's windows (im2col), sends them with the layer's weights and requantizes between layers; the core computes every convolution with INT8 weights, 7-bit unsigned activations and INT32 accumulation. Its 64 multipliers form P = 16 output lanes times T = 4 tap banks; its window port takes W values per cycle (W = 2 only in RTL simulation). In sparse mode, used throughout, each bank processes only its nonzero taps; slot j of a window belongs to bank j mod 4.</w:t>
+        <w:t xml:space="preserve"> The host builds each layer's windows (im2col), sends them with the layer's weights and requantizes between layers; the core computes every convolution with INT8 weights, 7-bit unsigned activations, INT32 accumulation, bias and ReLU. Its 64 multipliers form P = 16 output lanes times T = 4 tap banks; its window port takes W values per cycle (W = 2 only in RTL simulation). Slot j of a window belongs to bank j mod 4. In sparse mode, used throughout, each bank stores only its nonzero taps, each with its row, in one of two window buffers, so the next window loads while the current one computes; every cycle each bank issues one stored tap to all P lanes, whose weight memories it addresses by output group and row.</w:t>
       </w:r>
     </w:p>
     <w:p>
@@ -296,11 +296,16 @@
     <w:p>
       <w:pPr>
         <w:pStyle w:val="a3"/>
+        <w:tabs>
+          <w:tab w:pos="2520" w:val="center"/>
+          <w:tab w:pos="5030" w:val="right"/>
+        </w:tabs>
         <w:spacing w:lineRule="exact" w:line="220"/>
         <w:ind w:firstLine="0"/>
-        <w:jc w:val="center"/>
-      </w:pPr>
-      <w:r>
+        <w:jc w:val="left"/>
+      </w:pPr>
+      <w:r>
+        <w:tab/>
         <w:t xml:space="preserve">C = max( </w:t>
       </w:r>
       <w:r>
@@ -337,7 +342,9 @@
         <w:t>⌉</w:t>
       </w:r>
       <w:r>
-        <w:t xml:space="preserve"> · max(1, m), COUT ),   (1)</w:t>
+        <w:t xml:space="preserve"> · max(1, m), COUT ),</w:t>
+        <w:tab/>
+        <w:t>(1)</w:t>
       </w:r>
     </w:p>
     <w:p>
@@ -364,7 +371,25 @@
         <w:t>⌉</w:t>
       </w:r>
       <w:r>
-        <w:t xml:space="preserve"> output groups and emitting COUT results. We call (1) summed over a layer's windows the layer's cycle count, computed in host emulation. On the board each layer also pays a short fill and drain, min(load, compute of the last window) + 3 + g cycles (g: outputs in the last group of P), a rule we read off board runs of four networks on one image; the first layer takes a measured 17 cycles instead. The count plus the fill and drain is the predicted cycles.</w:t>
+        <w:t xml:space="preserve"> output groups and emitting COUT results. We call (1) summed over a layer's windows the layer's cycle count, computed in host emulation. On the board each layer also pays a short fill and drain, min(</w:t>
+      </w:r>
+      <w:r>
+        <w:rPr>
+          <w:rFonts w:ascii="Cambria Math" w:hAnsi="Cambria Math"/>
+        </w:rPr>
+        <w:t>⌈</w:t>
+      </w:r>
+      <w:r>
+        <w:t>K/W</w:t>
+      </w:r>
+      <w:r>
+        <w:rPr>
+          <w:rFonts w:ascii="Cambria Math" w:hAnsi="Cambria Math"/>
+        </w:rPr>
+        <w:t>⌉</w:t>
+      </w:r>
+      <w:r>
+        <w:t xml:space="preserve"> + 1, the last window's compute) + 3 + g cycles (g: outputs in the last group of P), a rule we read off board runs of four networks on Set12 05.png; conv1 instead takes a measured 17. A layer's count plus its fill and drain gives its predicted cycles.</w:t>
       </w:r>
     </w:p>
     <w:p>
@@ -403,10 +428,17 @@
     <w:p>
       <w:pPr>
         <w:pStyle w:val="a3"/>
+        <w:tabs>
+          <w:tab w:pos="2520" w:val="center"/>
+          <w:tab w:pos="5030" w:val="right"/>
+        </w:tabs>
         <w:spacing w:lineRule="exact" w:line="220"/>
         <w:ind w:firstLine="0"/>
-        <w:jc w:val="center"/>
-      </w:pPr>
+        <w:jc w:val="left"/>
+      </w:pPr>
+      <w:r>
+        <w:tab/>
+      </w:r>
       <w:r>
         <w:rPr>
           <w:rFonts w:ascii="Cambria Math" w:hAnsi="Cambria Math"/>
@@ -459,7 +491,9 @@
         <w:t>⌉</w:t>
       </w:r>
       <w:r>
-        <w:t xml:space="preserve"> + 1, COUT ).   (2)</w:t>
+        <w:t xml:space="preserve"> + 1, COUT ).</w:t>
+        <w:tab/>
+        <w:t>(2)</w:t>
       </w:r>
     </w:p>
     <w:p>
@@ -516,7 +550,7 @@
         <w:t>Relabeling (L1).</w:t>
       </w:r>
       <w:r>
-        <w:t xml:space="preserve"> Let π map a position p of a hidden map to its original channel. The producer computes its output channels in the order π, with weight rows, biases and requantization scales reordered, and the consumer's weight column for tap s·N + p comes from channel π(p). As ReLU and requantization act per channel and the consumer adds the same INT32 products, the integer output is identical for every input, while π decides which channels share a bank (Fig. 2b). We permute the outputs of conv1 to conv(L−2) of an L-layer network; the last layer, which can never gain, keeps its input. In maxout and averaging networks both maps of a pair move with π.</w:t>
+        <w:t xml:space="preserve"> Let π map a position p of a hidden map to its original channel. The producer computes its output channels in the order π, with weight rows, biases and requantization scales reordered, and the consumer's weight column for tap s·N + p comes from channel π(p). As ReLU and requantization act per channel and the consumer adds the same INT32 products, the integer output is identical for every input, while π decides which channels share a bank (Fig. 2b). We permute the outputs of conv1 to conv(L−2) of an L-layer network; the last layer, which can never gain, keeps its input. In the maxout and averaging networks (maximum or mean of maps j and j + N), both maps move with π.</w:t>
       </w:r>
     </w:p>
     <w:p>
@@ -530,7 +564,7 @@
         <w:t>Skew (L2).</w:t>
       </w:r>
       <w:r>
-        <w:t xml:space="preserve"> Skewed storage [7] applied to the taps: when 4 divides N, the host puts channel p of position s in slot s·N + (p + s) mod N, bank (p + s) mod 4, which spreads each channel's nine taps 3/2/2/2 over the banks (Fig. 2c). It permutes each window's taps and the consumer's weight columns alike and needs no data and no RTL change; no partial sum, in any order, exceeds |bias| + K·127·128 &lt; 2³¹, so the INT32 result is unchanged.</w:t>
+        <w:t xml:space="preserve"> Skewed storage [7] applied to the taps: when 4 divides N, the host puts channel p of position s in slot s·N + (p + s) mod N, bank (p + s) mod 4, which spreads each channel's nine taps 3/2/2/2 over the banks (Fig. 2c). It permutes the taps of each window and the consumer's weight columns alike, on the inputs of conv2 to conv(L−1) as for L1, and needs no data and no RTL change; no partial sum, in any order, exceeds |bias| + K·127·128 &lt; 2³¹, so the INT32 result is unchanged.</w:t>
       </w:r>
     </w:p>
     <w:p>
@@ -597,7 +631,7 @@
         </w:numPr>
       </w:pPr>
       <w:r>
-        <w:t>Fig. 2. A conv5 input window of the board network on Set12 05.png (the first compute-bound one at W = 4 with the median m, 48) under L0–L3 (a–d); filled: nonzero, colored by bank. Bars: nonzeros per bank; the fullest, m, costs 2m cycles, against the load of 73 (dashed). Over all of conv5's windows the mean m is 47.6, 42.1, 40.4 and 39.7.</w:t>
+        <w:t>Fig. 2. A conv5 input window of the board network on Set12 05.png (the first with m = 48, the median over the windows compute-bound at W = 4) under L0–L3 (a–d); filled: nonzero, colored by bank. Bars: nonzeros per bank; the fullest, m, costs 2m cycles; dashed: m = 36.5, where 2m equals the load of 73 cycles. Here L3 ties L2; over all of conv5's windows the mean m is 47.6, 42.1, 40.4 and 39.7.</w:t>
       </w:r>
     </w:p>
     <w:p>
@@ -611,7 +645,7 @@
         <w:t>Fitting.</w:t>
       </w:r>
       <w:r>
-        <w:t xml:space="preserve"> Each layer is fitted alone, as relabeled windows are the original's with permuted columns. The recipe draws 2048 windows per layer from one calibration image, Set12 01.png, minimizes their mean of (1) at W = 4, and searches from the identity with 400 proposals, each swapping two channels of different classes and kept only if the objective falls. Under the conventional bank rule this gives L1, under the skewed rule L3. For the board network we also use L1′, fitted on Set12 01–03 with two noise draws each and four random starts (2005 objective evaluations per layer instead of 401).</w:t>
+        <w:t xml:space="preserve"> Each layer is fitted alone, as relabeled windows are the original's with permuted columns. The recipe draws 2048 windows per layer from one calibration image, Set12 01.png, minimizes their mean of (1) at W = 4, and searches from the identity with 400 proposals, each swapping two channels of different classes and kept only if the objective falls. Under the conventional bank rule this gives L1, under the skewed rule L3. For the board network we also use L1′, fitted on Set12 01–03 with two noise draws each, from the identity and four random starts (5 × 401 = 2005 objective evaluations per layer).</w:t>
       </w:r>
     </w:p>
     <w:p>
@@ -625,7 +659,7 @@
         <w:t>Function preserved.</w:t>
       </w:r>
       <w:r>
-        <w:t xml:space="preserve"> In host emulation every exported layout reproduced the original's output (L1 and L1′ on all 80 images), and L2 and L3 (L3 up to channel order) every network's INT32 accumulators in every window of a test image; on the board every layer's output matched the integer model.</w:t>
+        <w:t xml:space="preserve"> In host emulation every exported layout reproduced the original's output (every network's L1 on two test images, R1's L1 and L1′ on all 80), and L2 and L3 (L3 up to channel order) every network's INT32 accumulators in every window of Set12 05.png; on the board every layer's output matched the integer model.</w:t>
       </w:r>
     </w:p>
     <w:p>
@@ -647,7 +681,7 @@
         <w:t>Networks and images.</w:t>
       </w:r>
       <w:r>
-        <w:t xml:space="preserve"> Ten trained integer DnCNN-style networks [8] for Gaussian noise of σ = 25 on 7-bit inputs: A, 7 layers of 32 channels; B, 10 layers of 64 channels behind a 2×2 space-to-depth input; B-32, the same with 32 channels, with ReLU (R1–R3, training seeds s1–s3), maxout over pairs of 64 computed outputs (M1–M3, seeds s1–s3) or their mean (Av2, seed s2); and 45, the same with 45 channels and ReLU. All but A had quantization-aware training. The board network, R1, reaches 29.54 dB on Set12 05.png; 37–55% of its hidden layers' window values are nonzero. Test images: Set12 [8] and BSD68 [9], 80 images, one noise draw each; savings are pooled over the 79 other than the calibration image, with paired bootstrap 95% intervals over images. Two protocols fixed the recipes, evaluations and hypotheses in advance (Sec. VI).</w:t>
+        <w:t xml:space="preserve"> Ten trained integer DnCNN-style networks [8] for Gaussian noise of σ = 25 on 7-bit inputs: A, 7 layers of 32 channels; B, 10 layers of 64 channels behind a 2×2 space-to-depth input; B-32, the same with 32 channels, with ReLU (R1–R3, training seeds s1–s3), maxout over pairs of 64 computed outputs (M1–M3, seeds s1–s3) or their mean (Av2, seed s2); and B-45, the same with 45 channels and ReLU. All but A had quantization-aware training. The board network, R1, reaches 29.54 dB on Set12 05.png; 37–55% of its hidden layers' window values are nonzero. Test images: Set12 [8] and BSD68 [9], 80 images, one noise draw each; savings are pooled, i.e. computed on cycles summed over the 79 images other than the calibration image, with paired bootstrap 95% intervals over images. Two protocols fixed the recipes, evaluations and hypotheses in advance (Sec. VI).</w:t>
       </w:r>
     </w:p>
     <w:p>
@@ -661,7 +695,7 @@
         <w:t>Board.</w:t>
       </w:r>
       <w:r>
-        <w:t xml:space="preserve"> The W = 4 bitstream for the XC7Z020 closes timing at 100 MHz, uses 11,151 LUTs (21%), 71 of 140 BRAM36-equivalent tiles and no DSP slice, and ran at the board preset's 50 MHz (cycle counts do not depend on the clock). One bitstream ran all layouts; per layer the driver checks the output against the integer model and reads the cycle counter CYCLES and the DMA-wait counter IN_STALL. The five layouts of Table I ran once each on Set12 05–08, with the cycles of conv2–conv10 predicted before the runs. All other cycle numbers are counts in the host emulation, which reproduces every network's reference PSNR on all 80 images.</w:t>
+        <w:t xml:space="preserve"> The W = 4 bitstream for the XC7Z020 closes timing at 100 MHz, uses 11,151 LUTs (21%), 71 of 140 BRAM36-equivalent tiles and no DSP slice, and ran at the board preset's 50 MHz (counts do not depend on the clock; whether the DMA keeps up at 100 MHz was not measured). One bitstream ran all layouts; per layer the driver checks the output against the integer model and reads the cycle counter CYCLES and the DMA-wait counter IN_STALL. The five layouts of Table I ran once each on Set12 05–08, with the cycles of conv2–conv10 predicted before the runs (conv1's are the measured constant). All other cycle numbers are counts in the host emulation, which reproduces every network's reference PSNR on all 80 images.</w:t>
       </w:r>
     </w:p>
     <w:p>
@@ -689,7 +723,7 @@
         </w:numPr>
       </w:pPr>
       <w:r>
-        <w:t>Table I. Board saving (%) against L0 of R1 at W = 4 on Set12 05–08, one run each (L0 row: total cycles; 08.png is 512×512, the others 256×256). Each run's total equals its predicted cycles or exceeds them by one (in conv8), for L0 and L1′ on 08 and for L1′ and L3 on 07.</w:t>
+        <w:t>Table I. Board saving (%) against L0 of R1 at W = 4 on Set12 05–08, one run each (L0 row: total cycles; 08.png is 512×512, the others 256×256). Each run's total equals its predicted cycles, except L0 and L1′ on 08 and L1′ and L3 on 07: one cycle over, in conv8.</w:t>
       </w:r>
     </w:p>
     <w:tbl>
@@ -1173,7 +1207,7 @@
         <w:spacing w:before="120"/>
       </w:pPr>
       <w:r>
-        <w:t>On all four images the board gave L3 &lt; L2 &lt; L1′ &lt; L1 &lt; L0 in cycles, as predicted (Table I); pooled over the four images, L2 saved 8.13% and L3 8.80%. In 176 of the 180 predicted layers (conv2–conv10), CYCLES − IN_STALL equaled the predicted cycles. The other four, all in conv8, were one cycle over; after the runs we found them to be exactly the layers whose last window computes 30 cycles (all other conv2–conv9 layers: 32–56), a case absent from the runs the fill-and-drain rule was read off. L2 and L3 had never run on the board before, and 71 of their 72 layers were exact. This bitstream's IN_STALL does not count DMA starvation at window boundaries, so a stall common to all layouts could hide in the fill-and-drain rule; the match rules out only stalls that differ between layouts.</w:t>
+        <w:t>On all four images the board gave L3 &lt; L2 &lt; L1′ &lt; L1 &lt; L0 in cycles, as predicted (Table I); pooled over the four images, L2 saved 8.13% and L3 8.80%. In 176 of the 180 predicted layers (conv2–conv10), CYCLES − IN_STALL equaled the predicted cycles. The other four, all in conv8, were one cycle over; after the runs we found them to be exactly the layers whose last window takes 30 compute cycles (all other conv2–conv9 layers: 32–56), a case absent from the runs the fill-and-drain rule was read off. L2 and L3 had never run on the board before, and 71 of their 72 layers were exact. This bitstream's IN_STALL does not count DMA starvation at window boundaries, so a stall common to all layouts could hide in the fill-and-drain rule; the match rules out only stalls that differ between layouts.</w:t>
       </w:r>
     </w:p>
     <w:p>
@@ -1189,7 +1223,7 @@
         <w:pStyle w:val="a3"/>
       </w:pPr>
       <w:r>
-        <w:t>The first protocol's hypotheses held. H1: wherever (2) holds, at W = 1 on all networks and at W = 2 on A and R1–R3, the relabeled count equaled the original on all 80 images. H2, H3: the pooled saving of L1 was positive on all ten networks at W = 4, 1.09–10.80% (Fig. 3), and on all six where (2) allows it at W = 2, 3.36–7.37% on five and 0.022% on 45.</w:t>
+        <w:t>The first protocol's hypotheses held. H1: wherever (2) holds, at W = 1 on all networks and at W = 2 on A and R1–R3, the relabeled count equaled L0's on all 80 images. H2, H3: the pooled saving of L1 was positive on all ten networks at W = 4, 1.09–10.80% (Fig. 3), and on all six where (2) allows it at W = 2, 3.36–7.37% on five and 0.022% on B-45.</w:t>
       </w:r>
     </w:p>
     <w:p>
@@ -1197,7 +1231,7 @@
         <w:pStyle w:val="a3"/>
       </w:pPr>
       <w:r>
-        <w:t>The second protocol's three also held. H4: wherever (2) holds, L2 and L3 counted exactly as L0 on all 80 images, in every layer. H5: at W = 4, L2 saved more than L1 on all nine networks with N mod 4 = 0, by 0.90–2.36 points. H6: L3 saved more than L2 on all nine, by 0.48–1.18 points, on R1 by 0.73 (95% interval [0.70, 0.75]). Beyond the hypotheses, the gain of L3, fitted on the calibration image alone, is consistent: L3 counted fewer cycles than L2 on all 711 image–network pairs and, pooled, in all 69 fitted layers, and at W = 2 L3 &gt; L2 &gt; L1 held on the five networks with N mod 4 = 0 where (2) allows a gain. No image counted more cycles under any layout at any W.</w:t>
+        <w:t>The second protocol's three also held. H4: wherever (2) holds, L2 and L3 counted exactly as L0 on all 80 images, in every layer. H5: at W = 4, L2 saved more than L1 on all nine networks with N mod 4 = 0, by 0.90–2.36 points. H6: L3 saved more than L2 on all nine, by 0.48–1.18 points, on R1 by 0.73 (95% interval [0.70, 0.75]). Beyond the hypotheses, the gain of L3, fitted on the calibration image alone, is consistent: L3 counted fewer cycles than L2 on all 711 image–network pairs and, pooled, in all 69 fitted layers, and at W = 2 the savings ranked L3 &gt; L2 &gt; L1 on the five networks with N mod 4 = 0 where (2) allows a gain. No image had a larger count under any layout than under L0, at any W.</w:t>
       </w:r>
     </w:p>
     <w:p>
@@ -1250,7 +1284,7 @@
         </w:numPr>
       </w:pPr>
       <w:r>
-        <w:t>Fig. 3. Pooled saving over the 79 images (count, conv1–convL) at W = 4 (top) and W = 2 (bottom) of L1 (relabeling), L2 (skew) and L3 (skew + relabeling); 95% intervals (at most ±0.39 points) are narrower than the markers. ×: (2) holds in every layer; all layouts count as L0 on all 80 images. On 45 (N mod 4 = 1), L0 already has bank (s + p) mod 4, so L2 = L0 and L3 = L1. Networks: Sec. IV (R1: board network).</w:t>
+        <w:t>Fig. 3. Pooled saving over the 79 images (count, conv1–convL) at W = 4 (top) and W = 2 (bottom) of L1 (relabeling), L2 (skew) and L3 (skew + relabeling); 95% intervals (at most ±0.39 points) are narrower than the markers. ×: (2) holds in every layer; all layouts count as L0 on all 80 images, as on every network at W = 1. On B-45 (N mod 4 = 1), L0 already has bank (s + p) mod 4, so L2 = L0 and L3 = L1. Networks: Sec. IV (R1: board network).</w:t>
       </w:r>
     </w:p>
     <w:p>
@@ -1266,7 +1300,7 @@
         <w:pStyle w:val="a3"/>
       </w:pPr>
       <w:r>
-        <w:t>At W = 4, L2 saved more than both relabelings, and L3 more than L2, on each of the 79 images. Perfect balance bounds every lockstep layout; the data-free L2 reaches 76.6% of its saving and L3 82.6%, removing 26% of the imbalance that L2 leaves at the same host cost (Table II). Pooled, L2 also beat L1 fitted on each test image itself (8.45%) and a Sense-like sort by each channel's nonzero count; a density deal after SparTen [4] saved least (a comparison of procedures, not of co-activation against density).</w:t>
+        <w:t>At W = 4, L2 saved more than both relabelings, and L3 more than L2, on each of the 79 images. The data-free L2 reaches 76.6% of the perfect-balance saving, the most any lockstep layout can save, and L3 82.6%, removing 26% of the imbalance that L2 leaves at the same host cost (Table II). Pooled, L2 also beat the L1 recipe fitted on each test image itself (8.45%) and a Sense-like sort by each channel's number of nonzeros; density balance after SparTen [4] saved least (a comparison of procedures, not of co-activation against density).</w:t>
       </w:r>
     </w:p>
     <w:p>
@@ -1282,7 +1316,7 @@
         <w:pStyle w:val="a3"/>
       </w:pPr>
       <w:r>
-        <w:t>Fitting a network took under 30 s (L1 or L3); L2 needs none. Single-threaded on an x86 server, the host's work for 05.png (input, im2col, requantization) took 31 ms (32 ms with L1′) against the core's 266 ms at 50 MHz: run back to back, L1′'s 7.60% core saving is 6.3–6.8% end to end, and all of it if the host overlaps the next image; the skew's reordering after im2col adds 4.2 ms. This bound omits the transfer of windows and results and the JTAG harness that ran the board; the Zynq's ARM cores would be slower than the server; energy was not measured.</w:t>
+        <w:t>Fitting a network took under 30 s (L1 or L3); L2 needs none. Single-threaded on an x86 server, the host's work for 05.png (input, im2col, requantization) took 31–32 ms (the same work, timed on the L0 and L1′ exports) against the core's 266 ms at 50 MHz: run back to back, the 7.60% core saving of L1′ is thus 6.3–6.8% end to end, and all of it if the host overlaps the next image; the skew's reordering after im2col adds 4.2 ms. This bound omits the transfer of windows and results and the JTAG harness that ran the board; the Zynq's ARM cores would be slower than the server; energy was not measured.</w:t>
       </w:r>
     </w:p>
     <w:p>
@@ -1837,7 +1871,7 @@
         <w:t>What was known in advance.</w:t>
       </w:r>
       <w:r>
-        <w:t xml:space="preserve"> L1's saving on R1 was counted before the first protocol, and the sign of L1 on B and M1 was known; before the second, L2 had been counted on R1 (all 80 images) and on one image of four other networks, and L3 on seven images of R1. L1′ was chosen for the board after its BSD68 counts had been seen, and L0, L1 and L1′ had run on the board images before.</w:t>
+        <w:t xml:space="preserve"> L1's saving on R1 was counted before the first protocol, and other relabeling searches had shown a W = 4 saving on B and M1; before the second, L2 had been counted on R1 (all 80 images), on one image of four other networks and on eight images each of B and M1, and L3 on seven images of R1. L1′ was chosen for the board after its BSD68 counts had been seen. L0, L1 and L1′ had run on the board images before: the fill-and-drain rule was read off 05.png runs that include L0's, and the prediction code had to reproduce the 05.png totals of all three, so their 27 layers on 05.png are not out of sample.</w:t>
       </w:r>
     </w:p>
     <w:p>
@@ -1970,7 +2004,7 @@
         <w:pStyle w:val="references"/>
       </w:pPr>
       <w:r>
-        <w:t>P. Dang, Y. He, and H. Li, "VARA: A voltage-aware ReRAM-based accelerator for energy-efficient computing," arXiv:2609.00421, 2026.</w:t>
+        <w:t>P. Dang, Y. He, and H. Li, "VARA: A voltage-aware ReRAM-based accelerator for energy-efficient computing," arXiv:2609.00421v2, 2026.</w:t>
       </w:r>
     </w:p>
     <w:p>

</xml_diff>

<commit_message>
IWEICT paper: the decoupled-bank bound and the CIFAR-10 count (verification running)
'Why lockstep' moves to the end of Sec. II and answers the FIFO
question with decouple_bound.json: with L0's bank rule, banks with their
own queues could save at most 6.5% of L0's count on the board network
over the 79 test images, less than the skew's 9.2% on the lockstep core.
V-B adds, outside both protocols, the four layouts on a CIFAR-10
classifier (cifar_layouts.py; the network, its export and the wrappers
that ran cifar/'s scripts unchanged are in cifar_net/). Fig. 2 and
Fig. 3 are a little shorter and Fig. 3 moved so that the paper stays at
four pages without gaps; the abstract file follows the paper.

Co-Authored-By: Claude Opus 5.5 <noreply@anthropic.com>
Claude-Session: https://claude.ai/code/session_01KmQd2ww7ZkypMsRjhWuU5X
</commit_message>
<xml_diff>
--- a/bankperm/PAPER_EN.docx
+++ b/bankperm/PAPER_EN.docx
@@ -262,21 +262,7 @@
         <w:t>Core.</w:t>
       </w:r>
       <w:r>
-        <w:t xml:space="preserve"> The host builds each layer's windows (im2col), sends them with the layer's weights and requantizes between layers; the core computes every convolution with INT8 weights, 7-bit unsigned activations, INT32 accumulation, bias and ReLU. Its 64 multipliers form P = 16 output lanes times T = 4 tap banks; its window port takes W values per cycle (W = 2 only in RTL simulation). Slot j of a window belongs to bank j mod 4. In sparse mode, used throughout, each bank stores only its nonzero taps, each with its row, in one of two window buffers, so the next window loads while the current one computes; every cycle each bank issues one stored tap to all P lanes, whose weight memories it addresses by output group and row.</w:t>
-      </w:r>
-    </w:p>
-    <w:p>
-      <w:pPr>
-        <w:pStyle w:val="a3"/>
-      </w:pPr>
-      <w:r>
-        <w:rPr>
-          <w:b/>
-        </w:rPr>
-        <w:t>Why lockstep.</w:t>
-      </w:r>
-      <w:r>
-        <w:t xml:space="preserve"> Each output lane adds the four banks' products in one adder tree every cycle, into one accumulator, and the banks share one issue position; so the banks must advance together. Decoupling them would need a buffer and an accumulator per bank and lane and a final reduction; we keep the simpler core, change only the layout, and measure each layout against the perfect-balance bound below.</w:t>
+        <w:t xml:space="preserve"> The host builds each layer's windows (im2col), sends them with the layer's weights and requantizes between layers; the core computes every convolution with INT8 weights, 7-bit unsigned activations, INT32 accumulation, bias and ReLU. Its 64 multipliers form P = 16 output lanes times T = 4 tap banks; its window port takes W values per cycle (W = 2 only in RTL simulation). Slot j of a window belongs to bank j mod 4. In sparse mode, used throughout, each bank stores only its nonzero taps, with their rows, in one of two window buffers, so the next window loads while one computes; every cycle each bank issues one stored tap to all P lanes.</w:t>
       </w:r>
     </w:p>
     <w:p>
@@ -502,7 +488,7 @@
         <w:spacing w:lineRule="exact" w:line="220"/>
       </w:pPr>
       <w:r>
-        <w:t xml:space="preserve">Failing (2) is thus necessary for a gain; without the rounding, (2) reads COUT ≤ P·T/W. So 32-output hidden layers (K = 288: 144 against 145 at W = 2 and 73 at W = 4) can gain only at W = 4, layers with 45 or 64 outputs also at W = 2, and none at W = 1 or in the last layer (COUT ≤ 4). Perfect balance, m = </w:t>
+        <w:t xml:space="preserve">Failing (2) is thus necessary for a gain; without the rounding, (2) reads COUT ≤ P·T/W. So 32-output hidden layers (K = 288: 144 against 145 at W = 2 and 73 at W = 4) can gain only at W = 4, layers with 45 or 64 outputs also at W = 2, and none of these at W = 1, nor a last layer with COUT ≤ 4. Perfect balance, m = </w:t>
       </w:r>
       <w:r>
         <w:rPr>
@@ -525,6 +511,20 @@
     </w:p>
     <w:p>
       <w:pPr>
+        <w:pStyle w:val="a3"/>
+      </w:pPr>
+      <w:r>
+        <w:rPr>
+          <w:b/>
+        </w:rPr>
+        <w:t>Why lockstep.</w:t>
+      </w:r>
+      <w:r>
+        <w:t xml:space="preserve"> The banks share one issue counter, which runs to the fullest bank's last tap, and each lane sums the four banks' products into one accumulator. Banks with their own queues would need an accumulator per bank and lane, deeper buffers and a barrier per output group; they could beat perfect balance, but much of L0's imbalance persists over a whole layer: even with unbounded buffers they could save at most 6.5% of L0's count on the board network (a bound from its windows), less than the skew's 9.2% on this core (Table II). We keep the core and change only the layout.</w:t>
+      </w:r>
+    </w:p>
+    <w:p>
+      <w:pPr>
         <w:pStyle w:val="1"/>
       </w:pPr>
       <w:r>
@@ -590,7 +590,7 @@
       <w:r>
         <w:drawing>
           <wp:inline xmlns:a="http://schemas.openxmlformats.org/drawingml/2006/main" xmlns:pic="http://schemas.openxmlformats.org/drawingml/2006/picture">
-            <wp:extent cx="2880000" cy="3026441"/>
+            <wp:extent cx="2880000" cy="2736610"/>
             <wp:docPr id="2" name="Picture 2"/>
             <wp:cNvGraphicFramePr>
               <a:graphicFrameLocks noChangeAspect="1"/>
@@ -611,7 +611,7 @@
                   <pic:spPr>
                     <a:xfrm>
                       <a:off x="0" y="0"/>
-                      <a:ext cx="2880000" cy="3026441"/>
+                      <a:ext cx="2880000" cy="2736610"/>
                     </a:xfrm>
                     <a:prstGeom prst="rect"/>
                   </pic:spPr>
@@ -1228,14 +1228,6 @@
     </w:p>
     <w:p>
       <w:pPr>
-        <w:pStyle w:val="a3"/>
-      </w:pPr>
-      <w:r>
-        <w:t>The second protocol's three also held. H4: wherever (2) holds, L2 and L3 counted exactly as L0 on all 80 images, in every layer. H5: at W = 4, L2 saved more than L1 on all nine networks with N mod 4 = 0, by 0.90–2.36 points. H6: L3 saved more than L2 on all nine, by 0.48–1.18 points, on R1 by 0.73 (95% interval [0.70, 0.75]). Beyond the hypotheses, the gain of L3, fitted on the calibration image alone, is consistent: L3 counted fewer cycles than L2 on all 711 image–network pairs and, pooled, in all 69 fitted layers, and at W = 2 the savings ranked L3 &gt; L2 &gt; L1 on the five networks with N mod 4 = 0 where (2) allows a gain. No image had a larger count under any layout than under L0, at any W.</w:t>
-      </w:r>
-    </w:p>
-    <w:p>
-      <w:pPr>
         <w:spacing w:line="240" w:lineRule="auto"/>
         <w:ind w:firstLine="0"/>
         <w:jc w:val="center"/>
@@ -1243,7 +1235,7 @@
       <w:r>
         <w:drawing>
           <wp:inline xmlns:a="http://schemas.openxmlformats.org/drawingml/2006/main" xmlns:pic="http://schemas.openxmlformats.org/drawingml/2006/picture">
-            <wp:extent cx="2880000" cy="1800000"/>
+            <wp:extent cx="2880000" cy="1656610"/>
             <wp:docPr id="3" name="Picture 3"/>
             <wp:cNvGraphicFramePr>
               <a:graphicFrameLocks noChangeAspect="1"/>
@@ -1264,7 +1256,7 @@
                   <pic:spPr>
                     <a:xfrm>
                       <a:off x="0" y="0"/>
-                      <a:ext cx="2880000" cy="1800000"/>
+                      <a:ext cx="2880000" cy="1656610"/>
                     </a:xfrm>
                     <a:prstGeom prst="rect"/>
                   </pic:spPr>
@@ -1289,6 +1281,14 @@
     </w:p>
     <w:p>
       <w:pPr>
+        <w:pStyle w:val="a3"/>
+      </w:pPr>
+      <w:r>
+        <w:t>The second protocol's three also held. H4: wherever (2) holds, L2 and L3 counted exactly as L0 on all 80 images, in every layer. H5: at W = 4, L2 saved more than L1 on all nine networks with N mod 4 = 0, by 0.90–2.36 points. H6: L3 saved more than L2 on all nine, by 0.48–1.18 points, on R1 by 0.73 (95% interval [0.70, 0.75]). Beyond the hypotheses, the gain of L3, fitted on the calibration image alone, is consistent: L3 counted fewer cycles than L2 on all 711 image–network pairs and, pooled, in all 69 fitted layers, and at W = 2 the savings ranked L3 &gt; L2 &gt; L1 on the five networks with N mod 4 = 0 where (2) allows a gain. No image had a larger count under any layout than under L0, at any W. Outside both protocols, on a CIFAR-10 classifier (3×3 convolutions of 32–128 channels; 9,999 test images), L1, L2 and L3 saved 3.47%, 8.54% and 9.10% at W = 4, L2 and L3 on every image.</w:t>
+      </w:r>
+    </w:p>
+    <w:p>
+      <w:pPr>
         <w:pStyle w:val="2"/>
       </w:pPr>
       <w:r>
@@ -1316,7 +1316,7 @@
         <w:pStyle w:val="a3"/>
       </w:pPr>
       <w:r>
-        <w:t>Fitting a network took under 30 s (L1 or L3); L2 needs none. Single-threaded on an x86 server, the host's work for 05.png (input, im2col, requantization) took 31–32 ms (the same work, timed on the L0 and L1′ exports) against the core's 266 ms at 50 MHz: run back to back, the 7.60% core saving of L1′ is thus 6.3–6.8% end to end, and all of it if the host overlaps the next image; the skew's reordering after im2col adds 4.2 ms. This bound omits the transfer of windows and results and the JTAG harness that ran the board; the Zynq's ARM cores would be slower than the server; energy was not measured.</w:t>
+        <w:t>Fitting a network took under 30 s (L1 or L3); L2 needs none. Single-threaded on an x86 server, the host's work for 05.png (input, im2col, requantization) took 31–32 ms (the same work, timed on the L0 and L1′ exports) against the core's 266 ms at 50 MHz: run back to back, the 7.60% core saving of L1′ is thus 6.3–6.8% end to end, and all of it if the host overlaps the next image; the skew's reordering after im2col adds 4.2 ms. This bound omits the transfer of windows and results; the Zynq's ARM cores would be slower than the server.</w:t>
       </w:r>
     </w:p>
     <w:p>
@@ -1857,7 +1857,7 @@
         <w:t>Scope.</w:t>
       </w:r>
       <w:r>
-        <w:t xml:space="preserve"> One network on the board, four images, one run each; ten DnCNN-family denoisers at σ = 25 in the counts, one noise draw per image and one fit per layout (the intervals resample images only); BSD68 was part of the networks' development. Banks decoupled by buffers and other P, T or kernel sizes were not evaluated.</w:t>
+        <w:t xml:space="preserve"> One network on the board, four images, one run each; ten DnCNN-family denoisers at σ = 25 and, outside the protocols, one CIFAR-10 classifier trained for 15 epochs in the counts, one noise draw per image and one fit per layout (the intervals resample images only); BSD68 was part of the networks' development. Banks decoupled by buffers were only bounded (Sec. II), not built; other P, T or kernel sizes and energy were not evaluated.</w:t>
       </w:r>
     </w:p>
     <w:p>

</xml_diff>

<commit_message>
IWEICT paper: fixes from the second verification
Both new results were reproduced independently (the decoupled-bank
bound exactly on 9 images; the CIFAR-10 count from a separate loader).
The text now says the 6.5% holds under L0's bank rule and that with the
skew decoupled banks could beat perfect balance; that L1 counted more
than L0 on 176 CIFAR images and all three layouts on some at W = 1; that
63 of the 64 L2/L3 board layers outside conv10 (which sees L0's windows)
were exact; and states the core's issue rule as the RTL does. A few
phrases are shorter so that the paper keeps four pages with no gaps.

Co-Authored-By: Claude Opus 5.5 <noreply@anthropic.com>
Claude-Session: https://claude.ai/code/session_01KmQd2ww7ZkypMsRjhWuU5X
</commit_message>
<xml_diff>
--- a/bankperm/PAPER_EN.docx
+++ b/bankperm/PAPER_EN.docx
@@ -169,7 +169,7 @@
         <w:pStyle w:val="a3"/>
       </w:pPr>
       <w:r>
-        <w:t>We contribute (i) a test, from the layer shapes alone, of where a layout can change a layer's cycle count (Section II); (ii) three layouts that keep the bitstream and the integer output unchanged: a folded channel relabeling, a data-free skew and both combined (Section III); (iii) board runs of all three on four images, the cycles of conv2–conv10 predicted before them and exact in 176 of 180 layers (V-A); and (iv) two pre-registered ten-network studies (V-B) and a comparison with baselines on the board network over 79 images (V-C).</w:t>
+        <w:t>We contribute (i) a test, from the layer shapes alone, of where a layout can change a layer's cycle count (Section II); (ii) three layouts that keep the bitstream and the integer output unchanged: a folded channel relabeling, a data-free skew and both combined (Section III); (iii) board runs of five layouts on four images, the cycles of conv2–conv10 predicted before them and exact in 176 of 180 layers (V-A); and (iv) two pre-registered ten-network studies (V-B) and a comparison with baselines on the board network over 79 images (V-C).</w:t>
       </w:r>
     </w:p>
     <w:p>
@@ -181,7 +181,7 @@
       <w:r>
         <w:drawing>
           <wp:inline xmlns:a="http://schemas.openxmlformats.org/drawingml/2006/main" xmlns:pic="http://schemas.openxmlformats.org/drawingml/2006/picture">
-            <wp:extent cx="2880000" cy="1656610"/>
+            <wp:extent cx="2880000" cy="1583390"/>
             <wp:docPr id="1" name="Picture 1"/>
             <wp:cNvGraphicFramePr>
               <a:graphicFrameLocks noChangeAspect="1"/>
@@ -202,7 +202,7 @@
                   <pic:spPr>
                     <a:xfrm>
                       <a:off x="0" y="0"/>
-                      <a:ext cx="2880000" cy="1656610"/>
+                      <a:ext cx="2880000" cy="1583390"/>
                     </a:xfrm>
                     <a:prstGeom prst="rect"/>
                   </pic:spPr>
@@ -240,7 +240,7 @@
         <w:t>⌉</w:t>
       </w:r>
       <w:r>
-        <w:t>·m cycles in (1), 2m for 32 outputs. The relabeling and the skew's weight-column order are folded into the weights offline; the host applies the skew's slot order to each window. One bitstream serves every layout; the window is an example.</w:t>
+        <w:t>·m cycles in (1), 2m for 32 outputs. The relabeling and the skew's weight-column order are folded into the weights offline; the host applies the skew's slot order to each window. One bitstream serves every layout.</w:t>
       </w:r>
     </w:p>
     <w:p>
@@ -262,7 +262,7 @@
         <w:t>Core.</w:t>
       </w:r>
       <w:r>
-        <w:t xml:space="preserve"> The host builds each layer's windows (im2col), sends them with the layer's weights and requantizes between layers; the core computes every convolution with INT8 weights, 7-bit unsigned activations, INT32 accumulation, bias and ReLU. Its 64 multipliers form P = 16 output lanes times T = 4 tap banks; its window port takes W values per cycle (W = 2 only in RTL simulation). Slot j of a window belongs to bank j mod 4. In sparse mode, used throughout, each bank stores only its nonzero taps, with their rows, in one of two window buffers, so the next window loads while one computes; every cycle each bank issues one stored tap to all P lanes.</w:t>
+        <w:t xml:space="preserve"> The host builds each layer's windows (im2col), sends them with the layer's weights and requantizes between layers; the core computes every convolution with INT8 weights, 7-bit unsigned activations, INT32 accumulation, bias and ReLU. Its 64 multipliers form P = 16 output lanes times T = 4 tap banks; its window port takes W values per cycle (W = 2 only in RTL simulation). Slot j of a window belongs to bank j mod 4. In sparse mode, used throughout, each bank stores only its nonzero taps, with their indices in the bank, in one of two window buffers, so the next window loads while one computes; each issue cycle, every bank with a tap left sends one to all P lanes.</w:t>
       </w:r>
     </w:p>
     <w:p>
@@ -488,7 +488,7 @@
         <w:spacing w:lineRule="exact" w:line="220"/>
       </w:pPr>
       <w:r>
-        <w:t xml:space="preserve">Failing (2) is thus necessary for a gain; without the rounding, (2) reads COUT ≤ P·T/W. So 32-output hidden layers (K = 288: 144 against 145 at W = 2 and 73 at W = 4) can gain only at W = 4, layers with 45 or 64 outputs also at W = 2, and none of these at W = 1, nor a last layer with COUT ≤ 4. Perfect balance, m = </w:t>
+        <w:t xml:space="preserve">Failing (2) is thus necessary for a gain; without the rounding, (2) reads COUT ≤ P·T/W. So 32-output hidden layers (K = 288: 144 against 145 at W = 2 and 73 at W = 4) can gain only at W = 4, layers with 45 or 64 outputs also at W = 2, and none of these at W = 1; a last layer with COUT ≤ 4 never can. Perfect balance, m = </w:t>
       </w:r>
       <w:r>
         <w:rPr>
@@ -520,7 +520,7 @@
         <w:t>Why lockstep.</w:t>
       </w:r>
       <w:r>
-        <w:t xml:space="preserve"> The banks share one issue counter, which runs to the fullest bank's last tap, and each lane sums the four banks' products into one accumulator. Banks with their own queues would need an accumulator per bank and lane, deeper buffers and a barrier per output group; they could beat perfect balance, but much of L0's imbalance persists over a whole layer: even with unbounded buffers they could save at most 6.5% of L0's count on the board network (a bound from its windows), less than the skew's 9.2% on this core (Table II). We keep the core and change only the layout.</w:t>
+        <w:t xml:space="preserve"> The banks share one issue counter, which runs to the fullest bank's last tap, and each lane sums the four banks' products into one accumulator. Banks with their own queues would need partial sums per bank, lane and window ahead, deeper buffers and a final reduction. Under L0's bank rule they would keep much of the imbalance, which persists over a whole layer: even with unbounded buffers they could save at most 6.5% of L0's count on the board network (a bound from its windows), less than the skew's 9.2% on this core (Table II); with the skew they could beat perfect balance.</w:t>
       </w:r>
     </w:p>
     <w:p>
@@ -631,7 +631,7 @@
         </w:numPr>
       </w:pPr>
       <w:r>
-        <w:t>Fig. 2. A conv5 input window of the board network on Set12 05.png (the first with m = 48, the median over the windows compute-bound at W = 4) under L0–L3 (a–d); filled: nonzero, colored by bank. Bars: nonzeros per bank; the fullest, m, costs 2m cycles; dashed: m = 36.5, where 2m equals the load of 73 cycles. Here L3 ties L2; over all of conv5's windows the mean m is 47.6, 42.1, 40.4 and 39.7.</w:t>
+        <w:t>Fig. 2. A conv5 input window of the board network on Set12 05.png (the first with m = 48, the median over the windows compute-bound at W = 4) under L0–L3 (a–d); filled: nonzero, colored by bank (bank 1 dotted). Bars: nonzeros per bank; the fullest, m, costs 2m cycles; dashed: m = 36.5, where 2m equals the load of 73 cycles. Over all of conv5's windows the mean m is 47.6, 42.1, 40.4 and 39.7.</w:t>
       </w:r>
     </w:p>
     <w:p>
@@ -695,7 +695,7 @@
         <w:t>Board.</w:t>
       </w:r>
       <w:r>
-        <w:t xml:space="preserve"> The W = 4 bitstream for the XC7Z020 closes timing at 100 MHz, uses 11,151 LUTs (21%), 71 of 140 BRAM36-equivalent tiles and no DSP slice, and ran at the board preset's 50 MHz (counts do not depend on the clock; whether the DMA keeps up at 100 MHz was not measured). One bitstream ran all layouts; per layer the driver checks the output against the integer model and reads the cycle counter CYCLES and the DMA-wait counter IN_STALL. The five layouts of Table I ran once each on Set12 05–08, with the cycles of conv2–conv10 predicted before the runs (conv1's are the measured constant). All other cycle numbers are counts in the host emulation, which reproduces every network's reference PSNR on all 80 images.</w:t>
+        <w:t xml:space="preserve"> The W = 4 bitstream for the XC7Z020 closes timing at 100 MHz, uses 11,151 LUTs (21%), 71 of 140 BRAM36-equivalent tiles and no DSP slice, and ran at the board preset's 50 MHz (the cycles do not depend on the clock if the DMA keeps up, which was not measured at 100 MHz). One bitstream ran all layouts; per layer the driver checks the output against the integer model and reads the cycle counter CYCLES and the DMA-wait counter IN_STALL. The five layouts of Table I ran once each on Set12 05–08, with the cycles of conv2–conv10 predicted before the runs (conv1's fill and drain is the measured 17). All other cycle numbers are counts in the host emulation, which reproduces every network's reference PSNR on all 80 images.</w:t>
       </w:r>
     </w:p>
     <w:p>
@@ -1207,7 +1207,7 @@
         <w:spacing w:before="120"/>
       </w:pPr>
       <w:r>
-        <w:t>On all four images the board gave L3 &lt; L2 &lt; L1′ &lt; L1 &lt; L0 in cycles, as predicted (Table I); pooled over the four images, L2 saved 8.13% and L3 8.80%. In 176 of the 180 predicted layers (conv2–conv10), CYCLES − IN_STALL equaled the predicted cycles. The other four, all in conv8, were one cycle over; after the runs we found them to be exactly the layers whose last window takes 30 compute cycles (all other conv2–conv9 layers: 32–56), a case absent from the runs the fill-and-drain rule was read off. L2 and L3 had never run on the board before, and 71 of their 72 layers were exact. This bitstream's IN_STALL does not count DMA starvation at window boundaries, so a stall common to all layouts could hide in the fill-and-drain rule; the match rules out only stalls that differ between layouts.</w:t>
+        <w:t>On all four images the board gave L3 &lt; L2 &lt; L1′ &lt; L1 &lt; L0 in cycles, as predicted (Table I); pooled over the four images, L2 saved 8.13% and L3 8.80%. In 176 of the 180 predicted layers (conv2–conv10), CYCLES − IN_STALL equaled the predicted cycles. The other four, all in conv8, were one cycle over; after the runs we found them to be exactly the layers whose last window takes 30 compute cycles (all other conv2–conv9 layers: 32–56), a case absent from the runs the fill-and-drain rule was read off. L2 and L3 had never run on the board before, and 71 of their 72 layers were exact (63 of 64 without conv10, which sees L0's windows). This bitstream's IN_STALL does not count DMA starvation at window boundaries, so a stall common to all layouts could hide in the fill-and-drain rule; the match rules out only stalls that differ between layouts.</w:t>
       </w:r>
     </w:p>
     <w:p>
@@ -1276,7 +1276,7 @@
         </w:numPr>
       </w:pPr>
       <w:r>
-        <w:t>Fig. 3. Pooled saving over the 79 images (count, conv1–convL) at W = 4 (top) and W = 2 (bottom) of L1 (relabeling), L2 (skew) and L3 (skew + relabeling); 95% intervals (at most ±0.39 points) are narrower than the markers. ×: (2) holds in every layer; all layouts count as L0 on all 80 images, as on every network at W = 1. On B-45 (N mod 4 = 1), L0 already has bank (s + p) mod 4, so L2 = L0 and L3 = L1. Networks: Sec. IV (R1: board network).</w:t>
+        <w:t>Fig. 3. Pooled saving over the 79 images (count, conv1–convL) at W = 4 (top) and W = 2 (bottom) of L1 (relabeling), L2 (skew) and L3 (skew + relabeling); 95% intervals (±0.39 points at most) lie within the markers. ×: (2) holds in every layer; all layouts count as L0 on all 80 images, as on every network at W = 1. On B-45 (N mod 4 = 1), L0 already has bank (s + p) mod 4, so L2 = L0 and L3 = L1. Networks: Sec. IV (R1: board network).</w:t>
       </w:r>
     </w:p>
     <w:p>
@@ -1284,7 +1284,7 @@
         <w:pStyle w:val="a3"/>
       </w:pPr>
       <w:r>
-        <w:t>The second protocol's three also held. H4: wherever (2) holds, L2 and L3 counted exactly as L0 on all 80 images, in every layer. H5: at W = 4, L2 saved more than L1 on all nine networks with N mod 4 = 0, by 0.90–2.36 points. H6: L3 saved more than L2 on all nine, by 0.48–1.18 points, on R1 by 0.73 (95% interval [0.70, 0.75]). Beyond the hypotheses, the gain of L3, fitted on the calibration image alone, is consistent: L3 counted fewer cycles than L2 on all 711 image–network pairs and, pooled, in all 69 fitted layers, and at W = 2 the savings ranked L3 &gt; L2 &gt; L1 on the five networks with N mod 4 = 0 where (2) allows a gain. No image had a larger count under any layout than under L0, at any W. Outside both protocols, on a CIFAR-10 classifier (3×3 convolutions of 32–128 channels; 9,999 test images), L1, L2 and L3 saved 3.47%, 8.54% and 9.10% at W = 4, L2 and L3 on every image.</w:t>
+        <w:t>The second protocol's three also held. H4: wherever (2) holds, L2 and L3 counted exactly as L0 on all 80 images, in every layer. H5: at W = 4, L2 saved more than L1 on all nine networks with N mod 4 = 0, by 0.90–2.36 points. H6: L3 saved more than L2 on all nine, by 0.48–1.18 points, on R1 by 0.73 (95% interval [0.70, 0.75]). Beyond the hypotheses, the gain of L3, fitted on the calibration image alone, is consistent: L3 counted fewer cycles than L2 on all 711 image–network pairs and, pooled, in all 69 fitted layers, and at W = 2 the savings ranked L3 &gt; L2 &gt; L1 on the five networks with N mod 4 = 0 where (2) allows a gain. On these ten networks no image had a larger count under any layout than under L0, at any W. Outside both protocols, on a CIFAR-10 classifier (3×3 convolutions of 32–128 channels, all hidden inputs relaid; fitted on one 32×32 test image), L1, L2 and L3 saved 3.47%, 8.54% and 9.10% at W = 4 over the other 9,999, L2 and L3 on every image; L1 lost on 176, and at W = 1 all three on some.</w:t>
       </w:r>
     </w:p>
     <w:p>
@@ -1300,7 +1300,7 @@
         <w:pStyle w:val="a3"/>
       </w:pPr>
       <w:r>
-        <w:t>At W = 4, L2 saved more than both relabelings, and L3 more than L2, on each of the 79 images. The data-free L2 reaches 76.6% of the perfect-balance saving, the most any lockstep layout can save, and L3 82.6%, removing 26% of the imbalance that L2 leaves at the same host cost (Table II). Pooled, L2 also beat the L1 recipe fitted on each test image itself (8.45%) and a Sense-like sort by each channel's number of nonzeros; density balance after SparTen [4] saved least (a comparison of procedures, not of co-activation against density).</w:t>
+        <w:t>At W = 4, L2 saved more than both relabelings, and L3 more than L2, on each of the 79 images. The data-free L2 reaches 76.6% of the perfect-balance saving, the most any lockstep layout can save, and L3 82.6%, removing 26% of the imbalance that L2 leaves at the same host cost (Table II). Pooled, L2 also beat the L1 recipe fitted on each test image itself (8.45%) and a Sense-like sort by each channel's number of nonzeros; density balance after SparTen [4] saved least.</w:t>
       </w:r>
     </w:p>
     <w:p>
@@ -1316,7 +1316,7 @@
         <w:pStyle w:val="a3"/>
       </w:pPr>
       <w:r>
-        <w:t>Fitting a network took under 30 s (L1 or L3); L2 needs none. Single-threaded on an x86 server, the host's work for 05.png (input, im2col, requantization) took 31–32 ms (the same work, timed on the L0 and L1′ exports) against the core's 266 ms at 50 MHz: run back to back, the 7.60% core saving of L1′ is thus 6.3–6.8% end to end, and all of it if the host overlaps the next image; the skew's reordering after im2col adds 4.2 ms. This bound omits the transfer of windows and results; the Zynq's ARM cores would be slower than the server.</w:t>
+        <w:t>Fitting a network took under 30 s (L1 or L3); L2 needs none. Single-threaded on an x86 server, the host's work for 05.png (input, im2col, requantization) took 31–32 ms (timed on the L0 and L1′ exports) against the core's 266 ms at 50 MHz: run back to back, the 7.60% core saving of L1′ is thus 6.3–6.8% end to end, and all of it if the host overlaps the next image; the skew's reordering after im2col adds 4.2 ms. This bound omits the transfer of windows and results; the Zynq's ARM cores would be slower than the server.</w:t>
       </w:r>
     </w:p>
     <w:p>
@@ -1857,7 +1857,7 @@
         <w:t>Scope.</w:t>
       </w:r>
       <w:r>
-        <w:t xml:space="preserve"> One network on the board, four images, one run each; ten DnCNN-family denoisers at σ = 25 and, outside the protocols, one CIFAR-10 classifier trained for 15 epochs in the counts, one noise draw per image and one fit per layout (the intervals resample images only); BSD68 was part of the networks' development. Banks decoupled by buffers were only bounded (Sec. II), not built; other P, T or kernel sizes and energy were not evaluated.</w:t>
+        <w:t xml:space="preserve"> One network on the board, four images, one run each; in the counts, ten DnCNN-family denoisers at σ = 25, one noise draw per image, and, outside the protocols, one CIFAR-10 classifier trained for 15 epochs; one fit per layout (the intervals resample images only); BSD68 was part of the networks' development. Banks decoupled by buffers were only bounded (Sec. II), not built; other P, T or kernel sizes and energy were not evaluated.</w:t>
       </w:r>
     </w:p>
     <w:p>
@@ -1887,7 +1887,7 @@
         <w:pStyle w:val="a3"/>
       </w:pPr>
       <w:r>
-        <w:t>The layer shapes tell where the tap-to-bank layout of a lockstep zero-skipping core can matter. Where it can, a data-free skew of the taps removed more bank imbalance than a relabeling fitted to activation statistics, on all nine networks with N mod 4 = 0, and a relabeling fitted under the skew removed more still, on every image of every such network. The two only partly add: the skew spreads each channel over the banks, while the relabeling still chooses which channels share one. On the board the same order held on all four images, and a cycle model fixed before the runs predicted the never-run L2 and L3 to the cycle in 71 of their 72 layers. Code and data: https://github.com/qewr1234/FPGA.</w:t>
+        <w:t>The layer shapes tell where the tap-to-bank layout of a lockstep zero-skipping core can matter. Where it can, a data-free skew of the taps removed more bank imbalance than a relabeling fitted to activation statistics, on all nine networks with N mod 4 = 0, and a relabeling fitted under the skew removed more still, on every image of every such denoiser. The two only partly add, as the skew already spreads each channel over the banks. On the board the same order held on all four images, and a cycle model fixed before the runs predicted the never-run L2 and L3 to the cycle in 71 of their 72 layers. Code and data: https://github.com/qewr1234/FPGA.</w:t>
       </w:r>
     </w:p>
     <w:p>

</xml_diff>